<commit_message>
start working on paper
</commit_message>
<xml_diff>
--- a/1dcnn_ieee.docx
+++ b/1dcnn_ieee.docx
@@ -1,6 +1,6 @@
 
 <file path=word/document.xml><?xml version="1.0" encoding="utf-8"?>
-<w:document xmlns:cx="http://schemas.microsoft.com/office/drawing/2014/chartex" xmlns:cx1="http://schemas.microsoft.com/office/drawing/2015/9/8/chartex" xmlns:cx2="http://schemas.microsoft.com/office/drawing/2015/10/21/chartex" xmlns:cx3="http://schemas.microsoft.com/office/drawing/2016/5/9/chartex" xmlns:cx4="http://schemas.microsoft.com/office/drawing/2016/5/10/chartex" xmlns:cx5="http://schemas.microsoft.com/office/drawing/2016/5/11/chartex" xmlns:cx6="http://schemas.microsoft.com/office/drawing/2016/5/12/chartex" xmlns:cx7="http://schemas.microsoft.com/office/drawing/2016/5/13/chartex" xmlns:cx8="http://schemas.microsoft.com/office/drawing/2016/5/14/chartex" xmlns:mc="http://schemas.openxmlformats.org/markup-compatibility/2006" xmlns:aink="http://schemas.microsoft.com/office/drawing/2016/ink" xmlns:am3d="http://schemas.microsoft.com/office/drawing/2017/model3d" xmlns:o="urn:schemas-microsoft-com:office:office" xmlns:oel="http://schemas.microsoft.com/office/2019/extlst" xmlns:r="http://purl.oclc.org/ooxml/officeDocument/relationships" xmlns:m="http://purl.oclc.org/ooxml/officeDocument/math" xmlns:v="urn:schemas-microsoft-com:vml" xmlns:wp14="http://schemas.microsoft.com/office/word/2010/wordprocessingDrawing" xmlns:wp="http://purl.oclc.org/ooxml/drawingml/wordprocessingDrawing" xmlns:w10="urn:schemas-microsoft-com:office:word" xmlns:w="http://purl.oclc.org/ooxml/wordprocessingml/main" xmlns:w14="http://schemas.microsoft.com/office/word/2010/wordml" xmlns:w15="http://schemas.microsoft.com/office/word/2012/wordml" xmlns:w16cex="http://schemas.microsoft.com/office/word/2018/wordml/cex" xmlns:w16cid="http://schemas.microsoft.com/office/word/2016/wordml/cid" xmlns:w16="http://schemas.microsoft.com/office/word/2018/wordml" xmlns:w16sdtdh="http://schemas.microsoft.com/office/word/2020/wordml/sdtdatahash" xmlns:w16se="http://schemas.microsoft.com/office/word/2015/wordml/symex" xmlns:wpi="http://schemas.microsoft.com/office/word/2010/wordprocessingInk" xmlns:wne="http://schemas.microsoft.com/office/word/2006/wordml" mc:Ignorable="w14 w15 w16se w16cid w16 w16cex w16sdtdh wne wp14" w:conformance="strict">
+<w:document xmlns:cx="http://schemas.microsoft.com/office/drawing/2014/chartex" xmlns:cx1="http://schemas.microsoft.com/office/drawing/2015/9/8/chartex" xmlns:cx2="http://schemas.microsoft.com/office/drawing/2015/10/21/chartex" xmlns:cx3="http://schemas.microsoft.com/office/drawing/2016/5/9/chartex" xmlns:cx4="http://schemas.microsoft.com/office/drawing/2016/5/10/chartex" xmlns:cx5="http://schemas.microsoft.com/office/drawing/2016/5/11/chartex" xmlns:cx6="http://schemas.microsoft.com/office/drawing/2016/5/12/chartex" xmlns:cx7="http://schemas.microsoft.com/office/drawing/2016/5/13/chartex" xmlns:cx8="http://schemas.microsoft.com/office/drawing/2016/5/14/chartex" xmlns:mc="http://schemas.openxmlformats.org/markup-compatibility/2006" xmlns:aink="http://schemas.microsoft.com/office/drawing/2016/ink" xmlns:am3d="http://schemas.microsoft.com/office/drawing/2017/model3d" xmlns:o="urn:schemas-microsoft-com:office:office" xmlns:oel="http://schemas.microsoft.com/office/2019/extlst" xmlns:r="http://purl.oclc.org/ooxml/officeDocument/relationships" xmlns:m="http://purl.oclc.org/ooxml/officeDocument/math" xmlns:v="urn:schemas-microsoft-com:vml" xmlns:wp14="http://schemas.microsoft.com/office/word/2010/wordprocessingDrawing" xmlns:wp="http://purl.oclc.org/ooxml/drawingml/wordprocessingDrawing" xmlns:w10="urn:schemas-microsoft-com:office:word" xmlns:w="http://purl.oclc.org/ooxml/wordprocessingml/main" xmlns:w14="http://schemas.microsoft.com/office/word/2010/wordml" xmlns:w15="http://schemas.microsoft.com/office/word/2012/wordml" xmlns:w16cex="http://schemas.microsoft.com/office/word/2018/wordml/cex" xmlns:w16cid="http://schemas.microsoft.com/office/word/2016/wordml/cid" xmlns:w16="http://schemas.microsoft.com/office/word/2018/wordml" xmlns:w16du="http://schemas.microsoft.com/office/word/2023/wordml/word16du" xmlns:w16sdtdh="http://schemas.microsoft.com/office/word/2020/wordml/sdtdatahash" xmlns:w16se="http://schemas.microsoft.com/office/word/2015/wordml/symex" xmlns:wpi="http://schemas.microsoft.com/office/word/2010/wordprocessingInk" xmlns:wne="http://schemas.microsoft.com/office/word/2006/wordml" mc:Ignorable="w14 w15 w16se w16cid w16 w16cex w16sdtdh w16du wne wp14" w:conformance="strict">
   <w:body>
     <w:p>
       <w:pPr>
@@ -15,6 +15,12 @@
           <w:kern w:val="48"/>
         </w:rPr>
         <w:t>Fall Detection by 1D-CNN based on public dataset</w:t>
+      </w:r>
+      <w:r>
+        <w:rPr>
+          <w:kern w:val="48"/>
+        </w:rPr>
+        <w:t xml:space="preserve"> using a smartwatch on the wrist</w:t>
       </w:r>
     </w:p>
     <w:p>
@@ -160,10 +166,7 @@
         <w:t>—</w:t>
       </w:r>
       <w:r>
-        <w:t xml:space="preserve"> </w:t>
-      </w:r>
-      <w:r>
-        <w:t>Falls among the elderly population pose a significant threat, often leading to severe injuries, loss of independence, and even fatality. To address this critical issue, researchers have been exploring various approaches to develop effective fall detection systems. In this study, we present a novel fall detection algorithm that leverages the WEDA-FALL dataset, a comprehensive dataset that includes data from wrist-worn sensors capturing both simulated and real-world fall incidents involving elderly individuals. The key insight behind our approach is the observation that falls often exhibit distinct patterns in sensor data. To capture these patterns, we employ a one-dimensional convolutional neural network (1D-CNN) architecture, which has been shown to be well-suited for time-series data analysis. By training our model on the WEDA-FALL dataset, we were able to achieve an impressive accuracy of 94% in fall detection, surpassing the commonly reported accuracy levels of around 90% in the existing literature. The high performance of our algorithm can be attributed to the use of the WEDA-FALL dataset and the effectiveness of the 1D-CNN architecture in extracting and learning the characteristic patterns in the sensor data. Notably, our algorithm offers the key features of being quick, highly accurate, and cost-effective, making it a promising solution for practical deployment in real-world settings to improve the safety and well-being of the aging population.</w:t>
+        <w:t xml:space="preserve"> Falls among the elderly population pose a significant threat, often leading to severe injuries, loss of independence, and even fatality. To address this critical issue, researchers have been exploring various approaches to develop effective fall detection systems. In this study, we present a novel fall detection algorithm that leverages the WEDA-FALL dataset, a comprehensive dataset that includes data from wrist-worn sensors capturing both simulated and real-world fall incidents involving elderly individuals. The key insight behind our approach is the observation that falls often exhibit distinct patterns in sensor data. To capture these patterns, we employ a one-dimensional convolutional neural network (1D-CNN) architecture, which has been shown to be well-suited for time-series data analysis. By training our model on the WEDA-FALL dataset, we were able to achieve an impressive accuracy of 94% in fall detection, surpassing the commonly reported accuracy levels of around 90% in the existing literature. The high performance of our algorithm can be attributed to the use of the WEDA-FALL dataset and the effectiveness of the 1D-CNN architecture in extracting and learning the characteristic patterns in the sensor data. Notably, our algorithm offers the key features of being quick, highly accurate, and cost-effective, making it a promising solution for practical deployment in real-world settings to improve the safety and well-being of the aging population.</w:t>
       </w:r>
     </w:p>
     <w:p>
@@ -174,10 +177,7 @@
         <w:t>Keywords—</w:t>
       </w:r>
       <w:r>
-        <w:t xml:space="preserve"> </w:t>
-      </w:r>
-      <w:r>
-        <w:t>Fall Detection, gyroscope, 1D-CNN, WEDA-FALL</w:t>
+        <w:t xml:space="preserve"> Fall Detection, gyroscope, 1D-CNN, WEDA-FALL</w:t>
       </w:r>
     </w:p>
     <w:p>
@@ -203,54 +203,117 @@
         <w:pStyle w:val="BodyText"/>
       </w:pPr>
       <w:r>
-        <w:t xml:space="preserve">This template, </w:t>
-      </w:r>
-      <w:r>
-        <w:t>modified</w:t>
-      </w:r>
-      <w:r>
-        <w:t xml:space="preserve"> in MS Word 200</w:t>
-      </w:r>
-      <w:r>
-        <w:rPr>
-          <w:lang w:val="en-US"/>
-        </w:rPr>
-        <w:t>7</w:t>
-      </w:r>
-      <w:r>
-        <w:t xml:space="preserve"> and saved as </w:t>
-      </w:r>
-      <w:r>
-        <w:rPr>
-          <w:lang w:val="en-US"/>
-        </w:rPr>
-        <w:t xml:space="preserve">a </w:t>
-      </w:r>
-      <w:r>
-        <w:t>“Word 97-200</w:t>
-      </w:r>
-      <w:r>
-        <w:t>3</w:t>
+        <w:t>Falls are a serious concern for individuals of all ages, but they pose a particular risk to older adults.</w:t>
       </w:r>
       <w:r>
         <w:t xml:space="preserve"> </w:t>
       </w:r>
       <w:r>
-        <w:rPr>
-          <w:lang w:val="en-US"/>
-        </w:rPr>
-        <w:t>Document</w:t>
-      </w:r>
-      <w:r>
-        <w:t>” for the PC, provides authors with most of the formatting specifications needed for preparing electronic versions of their papers. All standard paper components have been specified for three reasons: (1) ease of use when formatting individual papers, (2) automatic compliance to electronic requirements that facilitate the concurrent or later production of electronic products, and (3) conformity of style throughout a conference proceedings. Margins, column widths, line spacing, and type styles are built-in; examples of the type styles are provided throughout this document and are identified in italic type, within parentheses, following the example. Some components, such as multi-leveled equations, graphics, and tables are not prescribed, although the various table text styles are provided. The formatter will need to create these components, incorporating the applicable criteria that follow.</w:t>
-      </w:r>
-    </w:p>
-    <w:p>
-      <w:pPr>
-        <w:pStyle w:val="Heading1"/>
-      </w:pPr>
-      <w:r>
-        <w:t>Experimental methods</w:t>
+        <w:t>The consequences of a fall can range from minor injuries to life-threatening complications.</w:t>
+      </w:r>
+      <w:r>
+        <w:t xml:space="preserve"> </w:t>
+      </w:r>
+      <w:r>
+        <w:t xml:space="preserve">The </w:t>
+      </w:r>
+      <w:r>
+        <w:t xml:space="preserve">benefits of </w:t>
+      </w:r>
+      <w:r>
+        <w:t xml:space="preserve">successful </w:t>
+      </w:r>
+      <w:r>
+        <w:t>fall detection</w:t>
+      </w:r>
+      <w:r>
+        <w:t xml:space="preserve">: (1) </w:t>
+      </w:r>
+      <w:r>
+        <w:t>Reduced risk of serious injury</w:t>
+      </w:r>
+      <w:r>
+        <w:t xml:space="preserve"> as f</w:t>
+      </w:r>
+      <w:r>
+        <w:t>all detection systems can alert caregivers or emergency services immediately</w:t>
+      </w:r>
+      <w:r>
+        <w:t xml:space="preserve">, (2) </w:t>
+      </w:r>
+      <w:r>
+        <w:t>Maintaining independence</w:t>
+      </w:r>
+      <w:r>
+        <w:t xml:space="preserve"> because f</w:t>
+      </w:r>
+      <w:r>
+        <w:t>all detection empowers individuals to remain active and engaged in their daily lives without fear of falling.</w:t>
+      </w:r>
+      <w:r>
+        <w:t xml:space="preserve"> </w:t>
+      </w:r>
+      <w:r>
+        <w:t xml:space="preserve">(3) </w:t>
+      </w:r>
+      <w:r>
+        <w:t>Peace of mind for caregivers</w:t>
+      </w:r>
+      <w:r>
+        <w:t xml:space="preserve"> by k</w:t>
+      </w:r>
+      <w:r>
+        <w:t>nowing that a loved one is protected by fall detection technology</w:t>
+      </w:r>
+      <w:r>
+        <w:t>,</w:t>
+      </w:r>
+      <w:r>
+        <w:t xml:space="preserve"> and (</w:t>
+      </w:r>
+      <w:r>
+        <w:t>4</w:t>
+      </w:r>
+      <w:r>
+        <w:t xml:space="preserve">) </w:t>
+      </w:r>
+      <w:r>
+        <w:t>Early intervention and prevention</w:t>
+      </w:r>
+      <w:r>
+        <w:t xml:space="preserve">. </w:t>
+      </w:r>
+      <w:r>
+        <w:t>In conclusion, fall detection is an essential tool for promoting safety, independence, and overall well-being, especially for older adults.</w:t>
+      </w:r>
+      <w:r>
+        <w:t xml:space="preserve"> </w:t>
+      </w:r>
+    </w:p>
+    <w:p>
+      <w:pPr>
+        <w:pStyle w:val="BodyText"/>
+        <w:rPr>
+          <w:lang w:val="en-AU"/>
+        </w:rPr>
+      </w:pPr>
+      <w:r>
+        <w:rPr>
+          <w:lang w:val="en-AU"/>
+        </w:rPr>
+        <w:t>Fall detection algorithms are the computational brains behind the technology that safeguards individuals from the consequences of falls. These algorithms process data collected from various sensors to accurately identify when a fall has occurred.</w:t>
+      </w:r>
+      <w:r>
+        <w:rPr>
+          <w:lang w:val="en-AU"/>
+        </w:rPr>
+        <w:t xml:space="preserve"> </w:t>
+      </w:r>
+      <w:r>
+        <w:rPr>
+          <w:lang w:val="en-AU"/>
+        </w:rPr>
+        <w:t>Broadly, fall detection algorithms can be categorized into three primary approaches:</w:t>
       </w:r>
     </w:p>
     <w:p>
@@ -262,67 +325,65 @@
         </w:tabs>
       </w:pPr>
       <w:r>
-        <w:t>Fall pattern</w:t>
+        <w:t>Wearable Sensor-Based Algorithms</w:t>
       </w:r>
     </w:p>
     <w:p>
       <w:pPr>
         <w:pStyle w:val="BodyText"/>
-      </w:pPr>
-      <w:r>
-        <w:t xml:space="preserve">First, confirm that you have the correct template for your paper size. This template has been tailored for output on the </w:t>
-      </w:r>
-      <w:r>
-        <w:rPr>
-          <w:lang w:val="en-US"/>
-        </w:rPr>
-        <w:t>A4</w:t>
-      </w:r>
-      <w:r>
-        <w:t xml:space="preserve"> paper size. If you are using </w:t>
-      </w:r>
-      <w:r>
-        <w:rPr>
-          <w:lang w:val="en-US"/>
-        </w:rPr>
-        <w:t>US letter</w:t>
-      </w:r>
-      <w:r>
-        <w:t>-sized paper, please close this</w:t>
-      </w:r>
-      <w:r>
-        <w:t xml:space="preserve"> file and download the </w:t>
-      </w:r>
-      <w:r>
-        <w:rPr>
-          <w:lang w:val="en-US"/>
-        </w:rPr>
-        <w:t xml:space="preserve">Microsoft Word, Letter </w:t>
-      </w:r>
-      <w:r>
-        <w:t>file</w:t>
-      </w:r>
-      <w:r>
-        <w:t>.</w:t>
-      </w:r>
-    </w:p>
-    <w:p>
-      <w:pPr>
-        <w:pStyle w:val="Heading2"/>
-      </w:pPr>
-      <w:r>
-        <w:t>CNN</w:t>
+        <w:rPr>
+          <w:lang w:val="en-AU"/>
+        </w:rPr>
+      </w:pPr>
+      <w:r>
+        <w:rPr>
+          <w:lang w:val="en-AU"/>
+        </w:rPr>
+        <w:t>These algorithms utilize data from sensors embedded in wearable devices such as smartwatches, accelerometers, gyroscopes, and heart rate monitors.</w:t>
       </w:r>
     </w:p>
     <w:p>
       <w:pPr>
         <w:pStyle w:val="BodyText"/>
-      </w:pPr>
-      <w:r>
-        <w:t xml:space="preserve">Convolutional neural networks (CNNs) are a type of deep learning architecture particularly well-suited for processing </w:t>
-      </w:r>
-      <w:r>
-        <w:t>and analyzing spatial data, such as images. CNNs consist of multiple layers that perform convolution, pooling, and fully connected operations to extract relevant features from the input data. The convolutional layers apply filters to local regions of the input, allowing the network to learn spatial patterns. The pooling layers then reduce the spatial dimensions of the feature maps, while the fully connected layers perform classification or regression tasks based on the extracted features. For time-series data like sensor readings, a 1D-CNN architecture is more appropriate, as it operates on 1-dimensional sequences rather than 2D images. 1D-CNNs are able to effectively capture the temporal patterns in sensor data, making them a suitable choice for the fall detection task at hand, where the sensor readings exhibit characteristic patterns associated with fall events.</w:t>
+        <w:rPr>
+          <w:lang w:val="en-AU"/>
+        </w:rPr>
+      </w:pPr>
+    </w:p>
+    <w:p>
+      <w:pPr>
+        <w:pStyle w:val="bulletlist"/>
+        <w:tabs>
+          <w:tab w:val="clear" w:pos="32.40pt"/>
+        </w:tabs>
+        <w:ind w:start="28.80pt" w:hanging="14.40pt"/>
+      </w:pPr>
+      <w:r>
+        <w:t>Threshold-based methods: These algorithms establish predefined thresholds for sensor values. If these thresholds are exceeded during a specific time frame, a fall is detected.</w:t>
+      </w:r>
+    </w:p>
+    <w:p>
+      <w:pPr>
+        <w:pStyle w:val="bulletlist"/>
+        <w:tabs>
+          <w:tab w:val="clear" w:pos="32.40pt"/>
+        </w:tabs>
+        <w:ind w:start="28.80pt" w:hanging="14.40pt"/>
+      </w:pPr>
+      <w:r>
+        <w:t>Machine learning-based methods: Employing algorithms like Support Vector Machines (SVM), Random Forests, or Naive Bayes, these methods learn patterns from training data and classify new data as either a fall or non-fall event.</w:t>
+      </w:r>
+    </w:p>
+    <w:p>
+      <w:pPr>
+        <w:pStyle w:val="bulletlist"/>
+        <w:tabs>
+          <w:tab w:val="clear" w:pos="32.40pt"/>
+        </w:tabs>
+        <w:ind w:start="28.80pt" w:hanging="14.40pt"/>
+      </w:pPr>
+      <w:r>
+        <w:t>Deep learning-based methods: Leveraging neural networks, these algorithms excel at extracting complex features from sensor data, leading to high accuracy in fall detection.</w:t>
       </w:r>
     </w:p>
     <w:p>
@@ -334,7 +395,87 @@
         </w:tabs>
       </w:pPr>
       <w:r>
-        <w:t>Dataset selection</w:t>
+        <w:t>Camera-Based Algorithms</w:t>
+      </w:r>
+    </w:p>
+    <w:p>
+      <w:pPr>
+        <w:pStyle w:val="BodyText"/>
+        <w:rPr>
+          <w:lang w:val="en-AU"/>
+        </w:rPr>
+      </w:pPr>
+      <w:r>
+        <w:rPr>
+          <w:lang w:val="en-AU"/>
+        </w:rPr>
+        <w:t xml:space="preserve">These algorithms </w:t>
+      </w:r>
+      <w:proofErr w:type="spellStart"/>
+      <w:r>
+        <w:rPr>
+          <w:lang w:val="en-AU"/>
+        </w:rPr>
+        <w:t>analyze</w:t>
+      </w:r>
+      <w:proofErr w:type="spellEnd"/>
+      <w:r>
+        <w:rPr>
+          <w:lang w:val="en-AU"/>
+        </w:rPr>
+        <w:t xml:space="preserve"> video footage to detect falls.</w:t>
+      </w:r>
+    </w:p>
+    <w:p>
+      <w:pPr>
+        <w:pStyle w:val="bulletlist"/>
+        <w:tabs>
+          <w:tab w:val="clear" w:pos="32.40pt"/>
+        </w:tabs>
+        <w:ind w:start="28.80pt" w:hanging="14.40pt"/>
+      </w:pPr>
+      <w:r>
+        <w:t>Inactivity detection: These algorithms monitor for prolonged periods of stillness or unusual body postures, indicating a potential fall.</w:t>
+      </w:r>
+    </w:p>
+    <w:p>
+      <w:pPr>
+        <w:pStyle w:val="bulletlist"/>
+        <w:tabs>
+          <w:tab w:val="clear" w:pos="32.40pt"/>
+        </w:tabs>
+        <w:ind w:start="28.80pt" w:hanging="14.40pt"/>
+      </w:pPr>
+      <w:r>
+        <w:t xml:space="preserve">Body shape change analysis: By </w:t>
+      </w:r>
+      <w:proofErr w:type="spellStart"/>
+      <w:r>
+        <w:t>analyzing</w:t>
+      </w:r>
+      <w:proofErr w:type="spellEnd"/>
+      <w:r>
+        <w:t xml:space="preserve"> changes in a person's body shape over time, these algorithms can identify the </w:t>
+      </w:r>
+      <w:proofErr w:type="gramStart"/>
+      <w:r>
+        <w:t>sudden collapse</w:t>
+      </w:r>
+      <w:proofErr w:type="gramEnd"/>
+      <w:r>
+        <w:t xml:space="preserve"> associated with a fall.</w:t>
+      </w:r>
+    </w:p>
+    <w:p>
+      <w:pPr>
+        <w:pStyle w:val="bulletlist"/>
+        <w:tabs>
+          <w:tab w:val="clear" w:pos="32.40pt"/>
+        </w:tabs>
+        <w:ind w:start="28.80pt" w:hanging="14.40pt"/>
+      </w:pPr>
+      <w:r>
+        <w:t>3D head motion analysis: Focusing on the rapid and uncontrolled movement of the head during a fall, these algorithms can accurately detect fall events.</w:t>
       </w:r>
     </w:p>
     <w:p>
@@ -346,6 +487,428 @@
         </w:tabs>
       </w:pPr>
       <w:r>
+        <w:t>Ambient Sensor-Based Algorithms</w:t>
+      </w:r>
+    </w:p>
+    <w:p>
+      <w:pPr>
+        <w:pStyle w:val="BodyText"/>
+        <w:rPr>
+          <w:lang w:val="en-AU"/>
+        </w:rPr>
+      </w:pPr>
+      <w:r>
+        <w:rPr>
+          <w:lang w:val="en-AU"/>
+        </w:rPr>
+        <w:t>These algorithms utilize sensors placed in the environment, such as pressure sensors, microphones, or radar-based systems.</w:t>
+      </w:r>
+    </w:p>
+    <w:p>
+      <w:pPr>
+        <w:pStyle w:val="bulletlist"/>
+        <w:tabs>
+          <w:tab w:val="clear" w:pos="32.40pt"/>
+        </w:tabs>
+        <w:ind w:start="28.80pt" w:hanging="14.40pt"/>
+      </w:pPr>
+      <w:r>
+        <w:t>Pressure sensor-based methods: Detect changes in pressure distribution when a person falls.</w:t>
+      </w:r>
+    </w:p>
+    <w:p>
+      <w:pPr>
+        <w:pStyle w:val="bulletlist"/>
+        <w:tabs>
+          <w:tab w:val="clear" w:pos="32.40pt"/>
+        </w:tabs>
+        <w:ind w:start="28.80pt" w:hanging="14.40pt"/>
+      </w:pPr>
+      <w:r>
+        <w:t xml:space="preserve">Acoustic-based methods: </w:t>
+      </w:r>
+      <w:proofErr w:type="spellStart"/>
+      <w:r>
+        <w:t>Analyze</w:t>
+      </w:r>
+      <w:proofErr w:type="spellEnd"/>
+      <w:r>
+        <w:t xml:space="preserve"> sound patterns for unusual noises associated with a fall.</w:t>
+      </w:r>
+    </w:p>
+    <w:p>
+      <w:pPr>
+        <w:pStyle w:val="bulletlist"/>
+        <w:tabs>
+          <w:tab w:val="clear" w:pos="32.40pt"/>
+        </w:tabs>
+        <w:ind w:start="28.80pt" w:hanging="14.40pt"/>
+      </w:pPr>
+      <w:r>
+        <w:t>Radar-based methods: Use radar signals to track human movement and detect abnormal motion patterns.</w:t>
+      </w:r>
+    </w:p>
+    <w:p>
+      <w:pPr>
+        <w:pStyle w:val="BodyText"/>
+        <w:rPr>
+          <w:lang w:val="en-AU"/>
+        </w:rPr>
+      </w:pPr>
+      <w:r>
+        <w:rPr>
+          <w:lang w:val="en-AU"/>
+        </w:rPr>
+        <w:t>It's important to note that the choice of algorithm depends on factors such as desired accuracy, computational resources, user preferences, and the specific environment where the system will be deployed. Additionally, many systems combine multiple algorithm types to improve overall performance and robustness.</w:t>
+      </w:r>
+    </w:p>
+    <w:p>
+      <w:pPr>
+        <w:pStyle w:val="BodyText"/>
+        <w:rPr>
+          <w:lang w:val="en-AU"/>
+        </w:rPr>
+      </w:pPr>
+      <w:r>
+        <w:rPr>
+          <w:lang w:val="en-AU"/>
+        </w:rPr>
+        <w:t>Developing robust fall detection algorithms requires access to high-quality datasets that accurately represent real-world scenarios. Several public datasets have been made available to facilitate research in this area.</w:t>
+      </w:r>
+    </w:p>
+    <w:p>
+      <w:pPr>
+        <w:pStyle w:val="BodyText"/>
+        <w:rPr>
+          <w:lang w:val="en-AU"/>
+        </w:rPr>
+      </w:pPr>
+    </w:p>
+    <w:p>
+      <w:pPr>
+        <w:pStyle w:val="BodyText"/>
+        <w:rPr>
+          <w:lang w:val="en-AU"/>
+        </w:rPr>
+      </w:pPr>
+      <w:r>
+        <w:rPr>
+          <w:lang w:val="en-AU"/>
+        </w:rPr>
+        <w:lastRenderedPageBreak/>
+        <w:t>Key Considerations for Fall Detection Datasets</w:t>
+      </w:r>
+    </w:p>
+    <w:p>
+      <w:pPr>
+        <w:pStyle w:val="BodyText"/>
+        <w:rPr>
+          <w:lang w:val="en-AU"/>
+        </w:rPr>
+      </w:pPr>
+      <w:r>
+        <w:rPr>
+          <w:lang w:val="en-AU"/>
+        </w:rPr>
+        <w:t>Sensor data: Accelerometer, gyroscope, and magnetometer data are commonly used.</w:t>
+      </w:r>
+    </w:p>
+    <w:p>
+      <w:pPr>
+        <w:pStyle w:val="BodyText"/>
+        <w:rPr>
+          <w:lang w:val="en-AU"/>
+        </w:rPr>
+      </w:pPr>
+      <w:r>
+        <w:rPr>
+          <w:lang w:val="en-AU"/>
+        </w:rPr>
+        <w:t>Fall types: Datasets should include various fall scenarios, such as forward falls, backward falls, and side falls.</w:t>
+      </w:r>
+    </w:p>
+    <w:p>
+      <w:pPr>
+        <w:pStyle w:val="BodyText"/>
+        <w:rPr>
+          <w:lang w:val="en-AU"/>
+        </w:rPr>
+      </w:pPr>
+      <w:r>
+        <w:rPr>
+          <w:lang w:val="en-AU"/>
+        </w:rPr>
+        <w:t>Activities of Daily Living (ADLs): A comprehensive dataset should include a wide range of ADLs to ensure accurate fall discrimination.</w:t>
+      </w:r>
+    </w:p>
+    <w:p>
+      <w:pPr>
+        <w:pStyle w:val="BodyText"/>
+        <w:rPr>
+          <w:lang w:val="en-AU"/>
+        </w:rPr>
+      </w:pPr>
+      <w:r>
+        <w:rPr>
+          <w:lang w:val="en-AU"/>
+        </w:rPr>
+        <w:t>Subject diversity: The dataset should represent a diverse population in terms of age, gender, and physical condition.</w:t>
+      </w:r>
+    </w:p>
+    <w:p>
+      <w:pPr>
+        <w:pStyle w:val="BodyText"/>
+        <w:rPr>
+          <w:lang w:val="en-AU"/>
+        </w:rPr>
+      </w:pPr>
+      <w:r>
+        <w:rPr>
+          <w:lang w:val="en-AU"/>
+        </w:rPr>
+        <w:t>Popular Public Datasets</w:t>
+      </w:r>
+    </w:p>
+    <w:p>
+      <w:pPr>
+        <w:pStyle w:val="BodyText"/>
+        <w:rPr>
+          <w:lang w:val="en-AU"/>
+        </w:rPr>
+      </w:pPr>
+      <w:r>
+        <w:rPr>
+          <w:lang w:val="en-AU"/>
+        </w:rPr>
+        <w:t>While the field is continuously evolving, here are some notable datasets:</w:t>
+      </w:r>
+    </w:p>
+    <w:p>
+      <w:pPr>
+        <w:pStyle w:val="BodyText"/>
+        <w:rPr>
+          <w:lang w:val="en-AU"/>
+        </w:rPr>
+      </w:pPr>
+      <w:proofErr w:type="spellStart"/>
+      <w:r>
+        <w:rPr>
+          <w:lang w:val="en-AU"/>
+        </w:rPr>
+        <w:t>SisFall</w:t>
+      </w:r>
+      <w:proofErr w:type="spellEnd"/>
+      <w:r>
+        <w:rPr>
+          <w:lang w:val="en-AU"/>
+        </w:rPr>
+        <w:t xml:space="preserve">, </w:t>
+      </w:r>
+      <w:proofErr w:type="spellStart"/>
+      <w:r>
+        <w:rPr>
+          <w:lang w:val="en-AU"/>
+        </w:rPr>
+        <w:t>tFall</w:t>
+      </w:r>
+      <w:proofErr w:type="spellEnd"/>
+      <w:r>
+        <w:rPr>
+          <w:lang w:val="en-AU"/>
+        </w:rPr>
+        <w:t xml:space="preserve">, </w:t>
+      </w:r>
+      <w:proofErr w:type="spellStart"/>
+      <w:r>
+        <w:rPr>
+          <w:lang w:val="en-AU"/>
+        </w:rPr>
+        <w:t>MobiFall</w:t>
+      </w:r>
+      <w:proofErr w:type="spellEnd"/>
+      <w:r>
+        <w:rPr>
+          <w:lang w:val="en-AU"/>
+        </w:rPr>
+        <w:t xml:space="preserve">, and </w:t>
+      </w:r>
+      <w:proofErr w:type="spellStart"/>
+      <w:r>
+        <w:rPr>
+          <w:lang w:val="en-AU"/>
+        </w:rPr>
+        <w:t>FallAllD</w:t>
+      </w:r>
+      <w:proofErr w:type="spellEnd"/>
+      <w:r>
+        <w:rPr>
+          <w:lang w:val="en-AU"/>
+        </w:rPr>
+        <w:t>: These datasets primarily focus on post-fall detection and include data from wearable sensors.</w:t>
+      </w:r>
+    </w:p>
+    <w:p>
+      <w:pPr>
+        <w:pStyle w:val="BodyText"/>
+        <w:rPr>
+          <w:lang w:val="en-AU"/>
+        </w:rPr>
+      </w:pPr>
+      <w:proofErr w:type="spellStart"/>
+      <w:r>
+        <w:rPr>
+          <w:lang w:val="en-AU"/>
+        </w:rPr>
+        <w:t>KFall</w:t>
+      </w:r>
+      <w:proofErr w:type="spellEnd"/>
+      <w:r>
+        <w:rPr>
+          <w:lang w:val="en-AU"/>
+        </w:rPr>
+        <w:t>: A larger dataset that includes pre-impact fall detection, making it more suitable for real-world applications. It also incorporates synchronized video data for analysis.</w:t>
+      </w:r>
+    </w:p>
+    <w:p>
+      <w:pPr>
+        <w:pStyle w:val="BodyText"/>
+        <w:rPr>
+          <w:lang w:val="en-AU"/>
+        </w:rPr>
+      </w:pPr>
+      <w:r>
+        <w:rPr>
+          <w:lang w:val="en-AU"/>
+        </w:rPr>
+        <w:t>UP-Fall Detection: This dataset offers a multimodal approach, including data from wearable sensors, ambient sensors, and vision equipment.</w:t>
+      </w:r>
+    </w:p>
+    <w:p>
+      <w:pPr>
+        <w:pStyle w:val="BodyText"/>
+        <w:rPr>
+          <w:lang w:val="en-AU"/>
+        </w:rPr>
+      </w:pPr>
+      <w:r>
+        <w:rPr>
+          <w:lang w:val="en-AU"/>
+        </w:rPr>
+        <w:t>Other datasets: Depending on specific research needs, additional datasets may be available from academic institutions or research projects.</w:t>
+      </w:r>
+    </w:p>
+    <w:p>
+      <w:pPr>
+        <w:pStyle w:val="BodyText"/>
+        <w:rPr>
+          <w:lang w:val="en-AU"/>
+        </w:rPr>
+      </w:pPr>
+      <w:r>
+        <w:rPr>
+          <w:lang w:val="en-AU"/>
+        </w:rPr>
+        <w:t>It's important to note that the suitability of a dataset depends on the specific research objectives and the type of fall detection system being developed.</w:t>
+      </w:r>
+    </w:p>
+    <w:p>
+      <w:pPr>
+        <w:pStyle w:val="Heading1"/>
+      </w:pPr>
+      <w:r>
+        <w:t>Experimental methods</w:t>
+      </w:r>
+    </w:p>
+    <w:p>
+      <w:pPr>
+        <w:pStyle w:val="Heading2"/>
+        <w:tabs>
+          <w:tab w:val="clear" w:pos="18pt"/>
+          <w:tab w:val="num" w:pos="14.40pt"/>
+        </w:tabs>
+      </w:pPr>
+      <w:r>
+        <w:t>Fall pattern</w:t>
+      </w:r>
+    </w:p>
+    <w:p>
+      <w:pPr>
+        <w:pStyle w:val="BodyText"/>
+      </w:pPr>
+      <w:r>
+        <w:t xml:space="preserve">First, confirm that you have the correct template for your paper size. This template has been tailored for output on the </w:t>
+      </w:r>
+      <w:r>
+        <w:rPr>
+          <w:lang w:val="en-US"/>
+        </w:rPr>
+        <w:t>A4</w:t>
+      </w:r>
+      <w:r>
+        <w:t xml:space="preserve"> paper size. If you are using </w:t>
+      </w:r>
+      <w:r>
+        <w:rPr>
+          <w:lang w:val="en-US"/>
+        </w:rPr>
+        <w:t>US letter</w:t>
+      </w:r>
+      <w:r>
+        <w:t>-sized paper, please close this</w:t>
+      </w:r>
+      <w:r>
+        <w:t xml:space="preserve"> file and download the </w:t>
+      </w:r>
+      <w:r>
+        <w:rPr>
+          <w:lang w:val="en-US"/>
+        </w:rPr>
+        <w:t xml:space="preserve">Microsoft Word, Letter </w:t>
+      </w:r>
+      <w:r>
+        <w:t>file</w:t>
+      </w:r>
+      <w:r>
+        <w:t>.</w:t>
+      </w:r>
+    </w:p>
+    <w:p>
+      <w:pPr>
+        <w:pStyle w:val="Heading2"/>
+      </w:pPr>
+      <w:r>
+        <w:t>CNN</w:t>
+      </w:r>
+    </w:p>
+    <w:p>
+      <w:pPr>
+        <w:pStyle w:val="BodyText"/>
+      </w:pPr>
+      <w:r>
+        <w:t>Convolutional neural networks (CNNs) are a type of deep learning architecture particularly well-suited for processing and analyzing spatial data, such as images. CNNs consist of multiple layers that perform convolution, pooling, and fully connected operations to extract relevant features from the input data. The convolutional layers apply filters to local regions of the input, allowing the network to learn spatial patterns. The pooling layers then reduce the spatial dimensions of the feature maps, while the fully connected layers perform classification or regression tasks based on the extracted features. For time-series data like sensor readings, a 1D-CNN architecture is more appropriate, as it operates on 1-dimensional sequences rather than 2D images. 1D-CNNs are able to effectively capture the temporal patterns in sensor data, making them a suitable choice for the fall detection task at hand, where the sensor readings exhibit characteristic patterns associated with fall events.</w:t>
+      </w:r>
+    </w:p>
+    <w:p>
+      <w:pPr>
+        <w:pStyle w:val="Heading2"/>
+        <w:tabs>
+          <w:tab w:val="clear" w:pos="18pt"/>
+          <w:tab w:val="num" w:pos="14.40pt"/>
+        </w:tabs>
+      </w:pPr>
+      <w:r>
+        <w:t>Dataset selection</w:t>
+      </w:r>
+    </w:p>
+    <w:p>
+      <w:pPr>
+        <w:pStyle w:val="Heading2"/>
+        <w:tabs>
+          <w:tab w:val="clear" w:pos="18pt"/>
+          <w:tab w:val="num" w:pos="14.40pt"/>
+        </w:tabs>
+      </w:pPr>
+      <w:r>
         <w:t>Data Preparation</w:t>
       </w:r>
     </w:p>
@@ -380,21 +943,7 @@
         <w:rPr>
           <w:lang w:val="en-US"/>
         </w:rPr>
-        <w:t xml:space="preserve">Complete all content and organizational editing before formatting. Please note sections A-D below for more information on proofreading, </w:t>
-      </w:r>
-      <w:proofErr w:type="gramStart"/>
-      <w:r>
-        <w:rPr>
-          <w:lang w:val="en-US"/>
-        </w:rPr>
-        <w:t>spelling</w:t>
-      </w:r>
-      <w:proofErr w:type="gramEnd"/>
-      <w:r>
-        <w:rPr>
-          <w:lang w:val="en-US"/>
-        </w:rPr>
-        <w:t xml:space="preserve"> and grammar.</w:t>
+        <w:t>Complete all content and organizational editing before formatting. Please note sections A-D below for more information on proofreading, spelling and grammar.</w:t>
       </w:r>
     </w:p>
     <w:p>
@@ -509,7 +1058,6 @@
         <w:ind w:firstLine="14.45pt"/>
       </w:pPr>
       <w:r>
-        <w:lastRenderedPageBreak/>
         <w:t>Identif</w:t>
       </w:r>
       <w:r>
@@ -591,9 +1139,6 @@
     <w:p>
       <w:pPr>
         <w:pStyle w:val="equation"/>
-        <w:rPr>
-          <w:rFonts w:hint="eastAsia"/>
-        </w:rPr>
       </w:pPr>
       <w:r>
         <w:tab/>
@@ -654,6 +1199,7 @@
         <w:pStyle w:val="BodyText"/>
       </w:pPr>
       <w:r>
+        <w:lastRenderedPageBreak/>
         <w:t>Note that the equation is centered using a center tab stop. Be sure that the symbols in your equation have been defined before or immediately following the equation. Use “(1)”, not “Eq. (1)” or “equation (1)”, except at the beginning of a sentence: “Equation (1) is . . .”</w:t>
       </w:r>
     </w:p>
@@ -885,7 +1431,10 @@
         <w:t xml:space="preserve">A minimum of one author is required for all conference articles. </w:t>
       </w:r>
       <w:r>
-        <w:t>Author names should be listed starting from left to right and then moving down to the next line. This is the author sequence that will be used in future citations and by indexing services.</w:t>
+        <w:t xml:space="preserve">Author names should be listed starting </w:t>
+      </w:r>
+      <w:r>
+        <w:t>from left to right and then moving down to the next line. This is the author sequence that will be used in future citations and by indexing services.</w:t>
       </w:r>
       <w:r>
         <w:t xml:space="preserve"> </w:t>
@@ -1054,11 +1603,7 @@
         <w:pStyle w:val="BodyText"/>
       </w:pPr>
       <w:r>
-        <w:t xml:space="preserve">Text heads organize the topics on a relational, hierarchical basis. For example, the paper title is the primary text head because all subsequent material relates and elaborates on this one topic. If there are two or more sub-topics, the next level head (uppercase Roman numerals) should be used and, conversely, if there are not at least two sub-topics, then no </w:t>
-      </w:r>
-      <w:r>
-        <w:lastRenderedPageBreak/>
-        <w:t>subheads should be introduced. Styles named “Heading 1”, “Heading 2”, “Heading 3”, and “Heading 4” are prescribed.</w:t>
+        <w:t>Text heads organize the topics on a relational, hierarchical basis. For example, the paper title is the primary text head because all subsequent material relates and elaborates on this one topic. If there are two or more sub-topics, the next level head (uppercase Roman numerals) should be used and, conversely, if there are not at least two sub-topics, then no subheads should be introduced. Styles named “Heading 1”, “Heading 2”, “Heading 3”, and “Heading 4” are prescribed.</w:t>
       </w:r>
     </w:p>
     <w:p>
@@ -1366,7 +1911,11 @@
         <w:pStyle w:val="BodyText"/>
       </w:pPr>
       <w:r>
-        <w:t>Figure Labels: Use 8 point Times New Roman for Figure labels. Use words rather than symbols or abbreviations when writing Figure axis labels to avoid confusing the reader. As an example, write the quantity “Magnetization”, or “Magnetization, M”, not just “M”. If including units in the label, present them within parentheses. Do not label axes only with units. In the example, write “Magnetization (A/m)” or “Magnetization {A[m(1)]}”, not just “A/m”. Do not label axes</w:t>
+        <w:t xml:space="preserve">Figure Labels: Use 8 point Times New Roman for Figure labels. Use words rather than symbols or abbreviations when writing Figure axis labels to avoid confusing the reader. As an </w:t>
+      </w:r>
+      <w:r>
+        <w:lastRenderedPageBreak/>
+        <w:t>example, write the quantity “Magnetization”, or “Magnetization, M”, not just “M”. If including units in the label, present them within parentheses. Do not label axes only with units. In the example, write “Magnetization (A/m)” or “Magnetization {A[m(1)]}”, not just “A/m”. Do not label axes</w:t>
       </w:r>
       <w:r>
         <w:t xml:space="preserve"> </w:t>
@@ -1528,7 +2077,10 @@
         <w:t xml:space="preserve">’ </w:t>
       </w:r>
       <w:r>
-        <w:t>names; do not use “et al.”. Papers that have not been published, even if they have been submitted for publication, should be cited as “unpublished” [4]. Papers that have been accepted for publication should be cited as “in press” [5]. Capitalize only the first word in a paper title, except for proper nouns and element symbols.</w:t>
+        <w:t xml:space="preserve">names; do not use “et al.”. Papers that have not been </w:t>
+      </w:r>
+      <w:r>
+        <w:t>published, even if they have been submitted for publication, should be cited as “unpublished” [4]. Papers that have been accepted for publication should be cited as “in press” [5]. Capitalize only the first word in a paper title, except for proper nouns and element symbols.</w:t>
       </w:r>
     </w:p>
     <w:p>
@@ -1764,7 +2316,7 @@
 </file>
 
 <file path=word/endnotes.xml><?xml version="1.0" encoding="utf-8"?>
-<w:endnotes xmlns:cx="http://schemas.microsoft.com/office/drawing/2014/chartex" xmlns:cx1="http://schemas.microsoft.com/office/drawing/2015/9/8/chartex" xmlns:cx2="http://schemas.microsoft.com/office/drawing/2015/10/21/chartex" xmlns:cx3="http://schemas.microsoft.com/office/drawing/2016/5/9/chartex" xmlns:cx4="http://schemas.microsoft.com/office/drawing/2016/5/10/chartex" xmlns:cx5="http://schemas.microsoft.com/office/drawing/2016/5/11/chartex" xmlns:cx6="http://schemas.microsoft.com/office/drawing/2016/5/12/chartex" xmlns:cx7="http://schemas.microsoft.com/office/drawing/2016/5/13/chartex" xmlns:cx8="http://schemas.microsoft.com/office/drawing/2016/5/14/chartex" xmlns:mc="http://schemas.openxmlformats.org/markup-compatibility/2006" xmlns:aink="http://schemas.microsoft.com/office/drawing/2016/ink" xmlns:am3d="http://schemas.microsoft.com/office/drawing/2017/model3d" xmlns:o="urn:schemas-microsoft-com:office:office" xmlns:oel="http://schemas.microsoft.com/office/2019/extlst" xmlns:r="http://purl.oclc.org/ooxml/officeDocument/relationships" xmlns:m="http://purl.oclc.org/ooxml/officeDocument/math" xmlns:v="urn:schemas-microsoft-com:vml" xmlns:wp14="http://schemas.microsoft.com/office/word/2010/wordprocessingDrawing" xmlns:wp="http://purl.oclc.org/ooxml/drawingml/wordprocessingDrawing" xmlns:w10="urn:schemas-microsoft-com:office:word" xmlns:w="http://purl.oclc.org/ooxml/wordprocessingml/main" xmlns:w14="http://schemas.microsoft.com/office/word/2010/wordml" xmlns:w15="http://schemas.microsoft.com/office/word/2012/wordml" xmlns:w16cex="http://schemas.microsoft.com/office/word/2018/wordml/cex" xmlns:w16cid="http://schemas.microsoft.com/office/word/2016/wordml/cid" xmlns:w16="http://schemas.microsoft.com/office/word/2018/wordml" xmlns:w16sdtdh="http://schemas.microsoft.com/office/word/2020/wordml/sdtdatahash" xmlns:w16se="http://schemas.microsoft.com/office/word/2015/wordml/symex" xmlns:wpi="http://schemas.microsoft.com/office/word/2010/wordprocessingInk" xmlns:wne="http://schemas.microsoft.com/office/word/2006/wordml" mc:Ignorable="w14 w15 w16se w16cid w16 w16cex w16sdtdh wne wp14">
+<w:endnotes xmlns:cx="http://schemas.microsoft.com/office/drawing/2014/chartex" xmlns:cx1="http://schemas.microsoft.com/office/drawing/2015/9/8/chartex" xmlns:cx2="http://schemas.microsoft.com/office/drawing/2015/10/21/chartex" xmlns:cx3="http://schemas.microsoft.com/office/drawing/2016/5/9/chartex" xmlns:cx4="http://schemas.microsoft.com/office/drawing/2016/5/10/chartex" xmlns:cx5="http://schemas.microsoft.com/office/drawing/2016/5/11/chartex" xmlns:cx6="http://schemas.microsoft.com/office/drawing/2016/5/12/chartex" xmlns:cx7="http://schemas.microsoft.com/office/drawing/2016/5/13/chartex" xmlns:cx8="http://schemas.microsoft.com/office/drawing/2016/5/14/chartex" xmlns:mc="http://schemas.openxmlformats.org/markup-compatibility/2006" xmlns:aink="http://schemas.microsoft.com/office/drawing/2016/ink" xmlns:am3d="http://schemas.microsoft.com/office/drawing/2017/model3d" xmlns:o="urn:schemas-microsoft-com:office:office" xmlns:oel="http://schemas.microsoft.com/office/2019/extlst" xmlns:r="http://purl.oclc.org/ooxml/officeDocument/relationships" xmlns:m="http://purl.oclc.org/ooxml/officeDocument/math" xmlns:v="urn:schemas-microsoft-com:vml" xmlns:wp14="http://schemas.microsoft.com/office/word/2010/wordprocessingDrawing" xmlns:wp="http://purl.oclc.org/ooxml/drawingml/wordprocessingDrawing" xmlns:w10="urn:schemas-microsoft-com:office:word" xmlns:w="http://purl.oclc.org/ooxml/wordprocessingml/main" xmlns:w14="http://schemas.microsoft.com/office/word/2010/wordml" xmlns:w15="http://schemas.microsoft.com/office/word/2012/wordml" xmlns:w16cex="http://schemas.microsoft.com/office/word/2018/wordml/cex" xmlns:w16cid="http://schemas.microsoft.com/office/word/2016/wordml/cid" xmlns:w16="http://schemas.microsoft.com/office/word/2018/wordml" xmlns:w16du="http://schemas.microsoft.com/office/word/2023/wordml/word16du" xmlns:w16sdtdh="http://schemas.microsoft.com/office/word/2020/wordml/sdtdatahash" xmlns:w16se="http://schemas.microsoft.com/office/word/2015/wordml/symex" xmlns:wpi="http://schemas.microsoft.com/office/word/2010/wordprocessingInk" xmlns:wne="http://schemas.microsoft.com/office/word/2006/wordml" mc:Ignorable="w14 w15 w16se w16cid w16 w16cex w16sdtdh w16du wne wp14">
   <w:endnote w:type="separator" w:id="-1">
     <w:p>
       <w:r>
@@ -1783,7 +2335,7 @@
 </file>
 
 <file path=word/footer1.xml><?xml version="1.0" encoding="utf-8"?>
-<w:ftr xmlns:cx="http://schemas.microsoft.com/office/drawing/2014/chartex" xmlns:cx1="http://schemas.microsoft.com/office/drawing/2015/9/8/chartex" xmlns:cx2="http://schemas.microsoft.com/office/drawing/2015/10/21/chartex" xmlns:cx3="http://schemas.microsoft.com/office/drawing/2016/5/9/chartex" xmlns:cx4="http://schemas.microsoft.com/office/drawing/2016/5/10/chartex" xmlns:cx5="http://schemas.microsoft.com/office/drawing/2016/5/11/chartex" xmlns:cx6="http://schemas.microsoft.com/office/drawing/2016/5/12/chartex" xmlns:cx7="http://schemas.microsoft.com/office/drawing/2016/5/13/chartex" xmlns:cx8="http://schemas.microsoft.com/office/drawing/2016/5/14/chartex" xmlns:mc="http://schemas.openxmlformats.org/markup-compatibility/2006" xmlns:aink="http://schemas.microsoft.com/office/drawing/2016/ink" xmlns:am3d="http://schemas.microsoft.com/office/drawing/2017/model3d" xmlns:o="urn:schemas-microsoft-com:office:office" xmlns:oel="http://schemas.microsoft.com/office/2019/extlst" xmlns:r="http://purl.oclc.org/ooxml/officeDocument/relationships" xmlns:m="http://purl.oclc.org/ooxml/officeDocument/math" xmlns:v="urn:schemas-microsoft-com:vml" xmlns:wp14="http://schemas.microsoft.com/office/word/2010/wordprocessingDrawing" xmlns:wp="http://purl.oclc.org/ooxml/drawingml/wordprocessingDrawing" xmlns:w10="urn:schemas-microsoft-com:office:word" xmlns:w="http://purl.oclc.org/ooxml/wordprocessingml/main" xmlns:w14="http://schemas.microsoft.com/office/word/2010/wordml" xmlns:w15="http://schemas.microsoft.com/office/word/2012/wordml" xmlns:w16cex="http://schemas.microsoft.com/office/word/2018/wordml/cex" xmlns:w16cid="http://schemas.microsoft.com/office/word/2016/wordml/cid" xmlns:w16="http://schemas.microsoft.com/office/word/2018/wordml" xmlns:w16sdtdh="http://schemas.microsoft.com/office/word/2020/wordml/sdtdatahash" xmlns:w16se="http://schemas.microsoft.com/office/word/2015/wordml/symex" xmlns:wpi="http://schemas.microsoft.com/office/word/2010/wordprocessingInk" xmlns:wne="http://schemas.microsoft.com/office/word/2006/wordml" mc:Ignorable="w14 w15 w16se w16cid w16 w16cex w16sdtdh wne wp14">
+<w:ftr xmlns:cx="http://schemas.microsoft.com/office/drawing/2014/chartex" xmlns:cx1="http://schemas.microsoft.com/office/drawing/2015/9/8/chartex" xmlns:cx2="http://schemas.microsoft.com/office/drawing/2015/10/21/chartex" xmlns:cx3="http://schemas.microsoft.com/office/drawing/2016/5/9/chartex" xmlns:cx4="http://schemas.microsoft.com/office/drawing/2016/5/10/chartex" xmlns:cx5="http://schemas.microsoft.com/office/drawing/2016/5/11/chartex" xmlns:cx6="http://schemas.microsoft.com/office/drawing/2016/5/12/chartex" xmlns:cx7="http://schemas.microsoft.com/office/drawing/2016/5/13/chartex" xmlns:cx8="http://schemas.microsoft.com/office/drawing/2016/5/14/chartex" xmlns:mc="http://schemas.openxmlformats.org/markup-compatibility/2006" xmlns:aink="http://schemas.microsoft.com/office/drawing/2016/ink" xmlns:am3d="http://schemas.microsoft.com/office/drawing/2017/model3d" xmlns:o="urn:schemas-microsoft-com:office:office" xmlns:oel="http://schemas.microsoft.com/office/2019/extlst" xmlns:r="http://purl.oclc.org/ooxml/officeDocument/relationships" xmlns:m="http://purl.oclc.org/ooxml/officeDocument/math" xmlns:v="urn:schemas-microsoft-com:vml" xmlns:wp14="http://schemas.microsoft.com/office/word/2010/wordprocessingDrawing" xmlns:wp="http://purl.oclc.org/ooxml/drawingml/wordprocessingDrawing" xmlns:w10="urn:schemas-microsoft-com:office:word" xmlns:w="http://purl.oclc.org/ooxml/wordprocessingml/main" xmlns:w14="http://schemas.microsoft.com/office/word/2010/wordml" xmlns:w15="http://schemas.microsoft.com/office/word/2012/wordml" xmlns:w16cex="http://schemas.microsoft.com/office/word/2018/wordml/cex" xmlns:w16cid="http://schemas.microsoft.com/office/word/2016/wordml/cid" xmlns:w16="http://schemas.microsoft.com/office/word/2018/wordml" xmlns:w16du="http://schemas.microsoft.com/office/word/2023/wordml/word16du" xmlns:w16sdtdh="http://schemas.microsoft.com/office/word/2020/wordml/sdtdatahash" xmlns:w16se="http://schemas.microsoft.com/office/word/2015/wordml/symex" xmlns:wpi="http://schemas.microsoft.com/office/word/2010/wordprocessingInk" xmlns:wne="http://schemas.microsoft.com/office/word/2006/wordml" mc:Ignorable="w14 w15 w16se w16cid w16 w16cex w16sdtdh w16du wne wp14">
   <w:p>
     <w:pPr>
       <w:pStyle w:val="Footer"/>
@@ -1805,7 +2357,7 @@
 </file>
 
 <file path=word/footnotes.xml><?xml version="1.0" encoding="utf-8"?>
-<w:footnotes xmlns:cx="http://schemas.microsoft.com/office/drawing/2014/chartex" xmlns:cx1="http://schemas.microsoft.com/office/drawing/2015/9/8/chartex" xmlns:cx2="http://schemas.microsoft.com/office/drawing/2015/10/21/chartex" xmlns:cx3="http://schemas.microsoft.com/office/drawing/2016/5/9/chartex" xmlns:cx4="http://schemas.microsoft.com/office/drawing/2016/5/10/chartex" xmlns:cx5="http://schemas.microsoft.com/office/drawing/2016/5/11/chartex" xmlns:cx6="http://schemas.microsoft.com/office/drawing/2016/5/12/chartex" xmlns:cx7="http://schemas.microsoft.com/office/drawing/2016/5/13/chartex" xmlns:cx8="http://schemas.microsoft.com/office/drawing/2016/5/14/chartex" xmlns:mc="http://schemas.openxmlformats.org/markup-compatibility/2006" xmlns:aink="http://schemas.microsoft.com/office/drawing/2016/ink" xmlns:am3d="http://schemas.microsoft.com/office/drawing/2017/model3d" xmlns:o="urn:schemas-microsoft-com:office:office" xmlns:oel="http://schemas.microsoft.com/office/2019/extlst" xmlns:r="http://purl.oclc.org/ooxml/officeDocument/relationships" xmlns:m="http://purl.oclc.org/ooxml/officeDocument/math" xmlns:v="urn:schemas-microsoft-com:vml" xmlns:wp14="http://schemas.microsoft.com/office/word/2010/wordprocessingDrawing" xmlns:wp="http://purl.oclc.org/ooxml/drawingml/wordprocessingDrawing" xmlns:w10="urn:schemas-microsoft-com:office:word" xmlns:w="http://purl.oclc.org/ooxml/wordprocessingml/main" xmlns:w14="http://schemas.microsoft.com/office/word/2010/wordml" xmlns:w15="http://schemas.microsoft.com/office/word/2012/wordml" xmlns:w16cex="http://schemas.microsoft.com/office/word/2018/wordml/cex" xmlns:w16cid="http://schemas.microsoft.com/office/word/2016/wordml/cid" xmlns:w16="http://schemas.microsoft.com/office/word/2018/wordml" xmlns:w16sdtdh="http://schemas.microsoft.com/office/word/2020/wordml/sdtdatahash" xmlns:w16se="http://schemas.microsoft.com/office/word/2015/wordml/symex" xmlns:wpi="http://schemas.microsoft.com/office/word/2010/wordprocessingInk" xmlns:wne="http://schemas.microsoft.com/office/word/2006/wordml" mc:Ignorable="w14 w15 w16se w16cid w16 w16cex w16sdtdh wne wp14">
+<w:footnotes xmlns:cx="http://schemas.microsoft.com/office/drawing/2014/chartex" xmlns:cx1="http://schemas.microsoft.com/office/drawing/2015/9/8/chartex" xmlns:cx2="http://schemas.microsoft.com/office/drawing/2015/10/21/chartex" xmlns:cx3="http://schemas.microsoft.com/office/drawing/2016/5/9/chartex" xmlns:cx4="http://schemas.microsoft.com/office/drawing/2016/5/10/chartex" xmlns:cx5="http://schemas.microsoft.com/office/drawing/2016/5/11/chartex" xmlns:cx6="http://schemas.microsoft.com/office/drawing/2016/5/12/chartex" xmlns:cx7="http://schemas.microsoft.com/office/drawing/2016/5/13/chartex" xmlns:cx8="http://schemas.microsoft.com/office/drawing/2016/5/14/chartex" xmlns:mc="http://schemas.openxmlformats.org/markup-compatibility/2006" xmlns:aink="http://schemas.microsoft.com/office/drawing/2016/ink" xmlns:am3d="http://schemas.microsoft.com/office/drawing/2017/model3d" xmlns:o="urn:schemas-microsoft-com:office:office" xmlns:oel="http://schemas.microsoft.com/office/2019/extlst" xmlns:r="http://purl.oclc.org/ooxml/officeDocument/relationships" xmlns:m="http://purl.oclc.org/ooxml/officeDocument/math" xmlns:v="urn:schemas-microsoft-com:vml" xmlns:wp14="http://schemas.microsoft.com/office/word/2010/wordprocessingDrawing" xmlns:wp="http://purl.oclc.org/ooxml/drawingml/wordprocessingDrawing" xmlns:w10="urn:schemas-microsoft-com:office:word" xmlns:w="http://purl.oclc.org/ooxml/wordprocessingml/main" xmlns:w14="http://schemas.microsoft.com/office/word/2010/wordml" xmlns:w15="http://schemas.microsoft.com/office/word/2012/wordml" xmlns:w16cex="http://schemas.microsoft.com/office/word/2018/wordml/cex" xmlns:w16cid="http://schemas.microsoft.com/office/word/2016/wordml/cid" xmlns:w16="http://schemas.microsoft.com/office/word/2018/wordml" xmlns:w16du="http://schemas.microsoft.com/office/word/2023/wordml/word16du" xmlns:w16sdtdh="http://schemas.microsoft.com/office/word/2020/wordml/sdtdatahash" xmlns:w16se="http://schemas.microsoft.com/office/word/2015/wordml/symex" xmlns:wpi="http://schemas.microsoft.com/office/word/2010/wordprocessingInk" xmlns:wne="http://schemas.microsoft.com/office/word/2006/wordml" mc:Ignorable="w14 w15 w16se w16cid w16 w16cex w16sdtdh w16du wne wp14">
   <w:footnote w:type="separator" w:id="-1">
     <w:p>
       <w:r>
@@ -1824,7 +2376,7 @@
 </file>
 
 <file path=word/numbering.xml><?xml version="1.0" encoding="utf-8"?>
-<w:numbering xmlns:cx="http://schemas.microsoft.com/office/drawing/2014/chartex" xmlns:cx1="http://schemas.microsoft.com/office/drawing/2015/9/8/chartex" xmlns:cx2="http://schemas.microsoft.com/office/drawing/2015/10/21/chartex" xmlns:cx3="http://schemas.microsoft.com/office/drawing/2016/5/9/chartex" xmlns:cx4="http://schemas.microsoft.com/office/drawing/2016/5/10/chartex" xmlns:cx5="http://schemas.microsoft.com/office/drawing/2016/5/11/chartex" xmlns:cx6="http://schemas.microsoft.com/office/drawing/2016/5/12/chartex" xmlns:cx7="http://schemas.microsoft.com/office/drawing/2016/5/13/chartex" xmlns:cx8="http://schemas.microsoft.com/office/drawing/2016/5/14/chartex" xmlns:mc="http://schemas.openxmlformats.org/markup-compatibility/2006" xmlns:aink="http://schemas.microsoft.com/office/drawing/2016/ink" xmlns:am3d="http://schemas.microsoft.com/office/drawing/2017/model3d" xmlns:o="urn:schemas-microsoft-com:office:office" xmlns:oel="http://schemas.microsoft.com/office/2019/extlst" xmlns:r="http://purl.oclc.org/ooxml/officeDocument/relationships" xmlns:m="http://purl.oclc.org/ooxml/officeDocument/math" xmlns:v="urn:schemas-microsoft-com:vml" xmlns:wp14="http://schemas.microsoft.com/office/word/2010/wordprocessingDrawing" xmlns:wp="http://purl.oclc.org/ooxml/drawingml/wordprocessingDrawing" xmlns:w10="urn:schemas-microsoft-com:office:word" xmlns:w="http://purl.oclc.org/ooxml/wordprocessingml/main" xmlns:w14="http://schemas.microsoft.com/office/word/2010/wordml" xmlns:w15="http://schemas.microsoft.com/office/word/2012/wordml" xmlns:w16cex="http://schemas.microsoft.com/office/word/2018/wordml/cex" xmlns:w16cid="http://schemas.microsoft.com/office/word/2016/wordml/cid" xmlns:w16="http://schemas.microsoft.com/office/word/2018/wordml" xmlns:w16sdtdh="http://schemas.microsoft.com/office/word/2020/wordml/sdtdatahash" xmlns:w16se="http://schemas.microsoft.com/office/word/2015/wordml/symex" xmlns:wpi="http://schemas.microsoft.com/office/word/2010/wordprocessingInk" xmlns:wne="http://schemas.microsoft.com/office/word/2006/wordml" mc:Ignorable="w14 w15 w16se w16cid w16 w16cex w16sdtdh wne wp14">
+<w:numbering xmlns:cx="http://schemas.microsoft.com/office/drawing/2014/chartex" xmlns:cx1="http://schemas.microsoft.com/office/drawing/2015/9/8/chartex" xmlns:cx2="http://schemas.microsoft.com/office/drawing/2015/10/21/chartex" xmlns:cx3="http://schemas.microsoft.com/office/drawing/2016/5/9/chartex" xmlns:cx4="http://schemas.microsoft.com/office/drawing/2016/5/10/chartex" xmlns:cx5="http://schemas.microsoft.com/office/drawing/2016/5/11/chartex" xmlns:cx6="http://schemas.microsoft.com/office/drawing/2016/5/12/chartex" xmlns:cx7="http://schemas.microsoft.com/office/drawing/2016/5/13/chartex" xmlns:cx8="http://schemas.microsoft.com/office/drawing/2016/5/14/chartex" xmlns:mc="http://schemas.openxmlformats.org/markup-compatibility/2006" xmlns:aink="http://schemas.microsoft.com/office/drawing/2016/ink" xmlns:am3d="http://schemas.microsoft.com/office/drawing/2017/model3d" xmlns:o="urn:schemas-microsoft-com:office:office" xmlns:oel="http://schemas.microsoft.com/office/2019/extlst" xmlns:r="http://purl.oclc.org/ooxml/officeDocument/relationships" xmlns:m="http://purl.oclc.org/ooxml/officeDocument/math" xmlns:v="urn:schemas-microsoft-com:vml" xmlns:wp14="http://schemas.microsoft.com/office/word/2010/wordprocessingDrawing" xmlns:wp="http://purl.oclc.org/ooxml/drawingml/wordprocessingDrawing" xmlns:w10="urn:schemas-microsoft-com:office:word" xmlns:w="http://purl.oclc.org/ooxml/wordprocessingml/main" xmlns:w14="http://schemas.microsoft.com/office/word/2010/wordml" xmlns:w15="http://schemas.microsoft.com/office/word/2012/wordml" xmlns:w16cex="http://schemas.microsoft.com/office/word/2018/wordml/cex" xmlns:w16cid="http://schemas.microsoft.com/office/word/2016/wordml/cid" xmlns:w16="http://schemas.microsoft.com/office/word/2018/wordml" xmlns:w16du="http://schemas.microsoft.com/office/word/2023/wordml/word16du" xmlns:w16sdtdh="http://schemas.microsoft.com/office/word/2020/wordml/sdtdatahash" xmlns:w16se="http://schemas.microsoft.com/office/word/2015/wordml/symex" xmlns:wpi="http://schemas.microsoft.com/office/word/2010/wordprocessingInk" xmlns:wne="http://schemas.microsoft.com/office/word/2006/wordml" mc:Ignorable="w14 w15 w16se w16cid w16 w16cex w16sdtdh w16du wne wp14">
   <w:abstractNum w:abstractNumId="0" w15:restartNumberingAfterBreak="0">
     <w:nsid w:val="FFFFFF1D"/>
     <w:multiLevelType w:val="multilevel"/>
@@ -2151,6 +2703,119 @@
     </w:lvl>
   </w:abstractNum>
   <w:abstractNum w:abstractNumId="11" w15:restartNumberingAfterBreak="0">
+    <w:nsid w:val="06DF466E"/>
+    <w:multiLevelType w:val="hybridMultilevel"/>
+    <w:tmpl w:val="7550F304"/>
+    <w:lvl w:ilvl="0" w:tplc="08090001">
+      <w:start w:val="1"/>
+      <w:numFmt w:val="bullet"/>
+      <w:lvlText w:val=""/>
+      <w:lvlJc w:val="start"/>
+      <w:pPr>
+        <w:ind w:start="36pt" w:hanging="18pt"/>
+      </w:pPr>
+      <w:rPr>
+        <w:rFonts w:ascii="Symbol" w:hAnsi="Symbol" w:hint="default"/>
+      </w:rPr>
+    </w:lvl>
+    <w:lvl w:ilvl="1" w:tplc="08090003" w:tentative="1">
+      <w:start w:val="1"/>
+      <w:numFmt w:val="bullet"/>
+      <w:lvlText w:val="o"/>
+      <w:lvlJc w:val="start"/>
+      <w:pPr>
+        <w:ind w:start="72pt" w:hanging="18pt"/>
+      </w:pPr>
+      <w:rPr>
+        <w:rFonts w:ascii="Courier New" w:hAnsi="Courier New" w:cs="Courier New" w:hint="default"/>
+      </w:rPr>
+    </w:lvl>
+    <w:lvl w:ilvl="2" w:tplc="08090005" w:tentative="1">
+      <w:start w:val="1"/>
+      <w:numFmt w:val="bullet"/>
+      <w:lvlText w:val=""/>
+      <w:lvlJc w:val="start"/>
+      <w:pPr>
+        <w:ind w:start="108pt" w:hanging="18pt"/>
+      </w:pPr>
+      <w:rPr>
+        <w:rFonts w:ascii="Wingdings" w:hAnsi="Wingdings" w:hint="default"/>
+      </w:rPr>
+    </w:lvl>
+    <w:lvl w:ilvl="3" w:tplc="08090001" w:tentative="1">
+      <w:start w:val="1"/>
+      <w:numFmt w:val="bullet"/>
+      <w:lvlText w:val=""/>
+      <w:lvlJc w:val="start"/>
+      <w:pPr>
+        <w:ind w:start="144pt" w:hanging="18pt"/>
+      </w:pPr>
+      <w:rPr>
+        <w:rFonts w:ascii="Symbol" w:hAnsi="Symbol" w:hint="default"/>
+      </w:rPr>
+    </w:lvl>
+    <w:lvl w:ilvl="4" w:tplc="08090003" w:tentative="1">
+      <w:start w:val="1"/>
+      <w:numFmt w:val="bullet"/>
+      <w:lvlText w:val="o"/>
+      <w:lvlJc w:val="start"/>
+      <w:pPr>
+        <w:ind w:start="180pt" w:hanging="18pt"/>
+      </w:pPr>
+      <w:rPr>
+        <w:rFonts w:ascii="Courier New" w:hAnsi="Courier New" w:cs="Courier New" w:hint="default"/>
+      </w:rPr>
+    </w:lvl>
+    <w:lvl w:ilvl="5" w:tplc="08090005" w:tentative="1">
+      <w:start w:val="1"/>
+      <w:numFmt w:val="bullet"/>
+      <w:lvlText w:val=""/>
+      <w:lvlJc w:val="start"/>
+      <w:pPr>
+        <w:ind w:start="216pt" w:hanging="18pt"/>
+      </w:pPr>
+      <w:rPr>
+        <w:rFonts w:ascii="Wingdings" w:hAnsi="Wingdings" w:hint="default"/>
+      </w:rPr>
+    </w:lvl>
+    <w:lvl w:ilvl="6" w:tplc="08090001" w:tentative="1">
+      <w:start w:val="1"/>
+      <w:numFmt w:val="bullet"/>
+      <w:lvlText w:val=""/>
+      <w:lvlJc w:val="start"/>
+      <w:pPr>
+        <w:ind w:start="252pt" w:hanging="18pt"/>
+      </w:pPr>
+      <w:rPr>
+        <w:rFonts w:ascii="Symbol" w:hAnsi="Symbol" w:hint="default"/>
+      </w:rPr>
+    </w:lvl>
+    <w:lvl w:ilvl="7" w:tplc="08090003" w:tentative="1">
+      <w:start w:val="1"/>
+      <w:numFmt w:val="bullet"/>
+      <w:lvlText w:val="o"/>
+      <w:lvlJc w:val="start"/>
+      <w:pPr>
+        <w:ind w:start="288pt" w:hanging="18pt"/>
+      </w:pPr>
+      <w:rPr>
+        <w:rFonts w:ascii="Courier New" w:hAnsi="Courier New" w:cs="Courier New" w:hint="default"/>
+      </w:rPr>
+    </w:lvl>
+    <w:lvl w:ilvl="8" w:tplc="08090005" w:tentative="1">
+      <w:start w:val="1"/>
+      <w:numFmt w:val="bullet"/>
+      <w:lvlText w:val=""/>
+      <w:lvlJc w:val="start"/>
+      <w:pPr>
+        <w:ind w:start="324pt" w:hanging="18pt"/>
+      </w:pPr>
+      <w:rPr>
+        <w:rFonts w:ascii="Wingdings" w:hAnsi="Wingdings" w:hint="default"/>
+      </w:rPr>
+    </w:lvl>
+  </w:abstractNum>
+  <w:abstractNum w:abstractNumId="12" w15:restartNumberingAfterBreak="0">
     <w:nsid w:val="1E177E97"/>
     <w:multiLevelType w:val="hybridMultilevel"/>
     <w:tmpl w:val="A6463BCE"/>
@@ -2236,7 +2901,7 @@
       </w:pPr>
     </w:lvl>
   </w:abstractNum>
-  <w:abstractNum w:abstractNumId="12" w15:restartNumberingAfterBreak="0">
+  <w:abstractNum w:abstractNumId="13" w15:restartNumberingAfterBreak="0">
     <w:nsid w:val="20AF0333"/>
     <w:multiLevelType w:val="hybridMultilevel"/>
     <w:tmpl w:val="CB0E7F4E"/>
@@ -2378,7 +3043,7 @@
       </w:rPr>
     </w:lvl>
   </w:abstractNum>
-  <w:abstractNum w:abstractNumId="13" w15:restartNumberingAfterBreak="0">
+  <w:abstractNum w:abstractNumId="14" w15:restartNumberingAfterBreak="0">
     <w:nsid w:val="26FE1FCF"/>
     <w:multiLevelType w:val="hybridMultilevel"/>
     <w:tmpl w:val="33826962"/>
@@ -2539,7 +3204,233 @@
       </w:rPr>
     </w:lvl>
   </w:abstractNum>
-  <w:abstractNum w:abstractNumId="14" w15:restartNumberingAfterBreak="0">
+  <w:abstractNum w:abstractNumId="15" w15:restartNumberingAfterBreak="0">
+    <w:nsid w:val="275B7951"/>
+    <w:multiLevelType w:val="hybridMultilevel"/>
+    <w:tmpl w:val="F7A07784"/>
+    <w:lvl w:ilvl="0" w:tplc="08090001">
+      <w:start w:val="1"/>
+      <w:numFmt w:val="bullet"/>
+      <w:lvlText w:val=""/>
+      <w:lvlJc w:val="start"/>
+      <w:pPr>
+        <w:ind w:start="50.40pt" w:hanging="18pt"/>
+      </w:pPr>
+      <w:rPr>
+        <w:rFonts w:ascii="Symbol" w:hAnsi="Symbol" w:hint="default"/>
+      </w:rPr>
+    </w:lvl>
+    <w:lvl w:ilvl="1" w:tplc="08090003" w:tentative="1">
+      <w:start w:val="1"/>
+      <w:numFmt w:val="bullet"/>
+      <w:lvlText w:val="o"/>
+      <w:lvlJc w:val="start"/>
+      <w:pPr>
+        <w:ind w:start="86.40pt" w:hanging="18pt"/>
+      </w:pPr>
+      <w:rPr>
+        <w:rFonts w:ascii="Courier New" w:hAnsi="Courier New" w:cs="Courier New" w:hint="default"/>
+      </w:rPr>
+    </w:lvl>
+    <w:lvl w:ilvl="2" w:tplc="08090005" w:tentative="1">
+      <w:start w:val="1"/>
+      <w:numFmt w:val="bullet"/>
+      <w:lvlText w:val=""/>
+      <w:lvlJc w:val="start"/>
+      <w:pPr>
+        <w:ind w:start="122.40pt" w:hanging="18pt"/>
+      </w:pPr>
+      <w:rPr>
+        <w:rFonts w:ascii="Wingdings" w:hAnsi="Wingdings" w:hint="default"/>
+      </w:rPr>
+    </w:lvl>
+    <w:lvl w:ilvl="3" w:tplc="08090001" w:tentative="1">
+      <w:start w:val="1"/>
+      <w:numFmt w:val="bullet"/>
+      <w:lvlText w:val=""/>
+      <w:lvlJc w:val="start"/>
+      <w:pPr>
+        <w:ind w:start="158.40pt" w:hanging="18pt"/>
+      </w:pPr>
+      <w:rPr>
+        <w:rFonts w:ascii="Symbol" w:hAnsi="Symbol" w:hint="default"/>
+      </w:rPr>
+    </w:lvl>
+    <w:lvl w:ilvl="4" w:tplc="08090003" w:tentative="1">
+      <w:start w:val="1"/>
+      <w:numFmt w:val="bullet"/>
+      <w:lvlText w:val="o"/>
+      <w:lvlJc w:val="start"/>
+      <w:pPr>
+        <w:ind w:start="194.40pt" w:hanging="18pt"/>
+      </w:pPr>
+      <w:rPr>
+        <w:rFonts w:ascii="Courier New" w:hAnsi="Courier New" w:cs="Courier New" w:hint="default"/>
+      </w:rPr>
+    </w:lvl>
+    <w:lvl w:ilvl="5" w:tplc="08090005" w:tentative="1">
+      <w:start w:val="1"/>
+      <w:numFmt w:val="bullet"/>
+      <w:lvlText w:val=""/>
+      <w:lvlJc w:val="start"/>
+      <w:pPr>
+        <w:ind w:start="230.40pt" w:hanging="18pt"/>
+      </w:pPr>
+      <w:rPr>
+        <w:rFonts w:ascii="Wingdings" w:hAnsi="Wingdings" w:hint="default"/>
+      </w:rPr>
+    </w:lvl>
+    <w:lvl w:ilvl="6" w:tplc="08090001" w:tentative="1">
+      <w:start w:val="1"/>
+      <w:numFmt w:val="bullet"/>
+      <w:lvlText w:val=""/>
+      <w:lvlJc w:val="start"/>
+      <w:pPr>
+        <w:ind w:start="266.40pt" w:hanging="18pt"/>
+      </w:pPr>
+      <w:rPr>
+        <w:rFonts w:ascii="Symbol" w:hAnsi="Symbol" w:hint="default"/>
+      </w:rPr>
+    </w:lvl>
+    <w:lvl w:ilvl="7" w:tplc="08090003" w:tentative="1">
+      <w:start w:val="1"/>
+      <w:numFmt w:val="bullet"/>
+      <w:lvlText w:val="o"/>
+      <w:lvlJc w:val="start"/>
+      <w:pPr>
+        <w:ind w:start="302.40pt" w:hanging="18pt"/>
+      </w:pPr>
+      <w:rPr>
+        <w:rFonts w:ascii="Courier New" w:hAnsi="Courier New" w:cs="Courier New" w:hint="default"/>
+      </w:rPr>
+    </w:lvl>
+    <w:lvl w:ilvl="8" w:tplc="08090005" w:tentative="1">
+      <w:start w:val="1"/>
+      <w:numFmt w:val="bullet"/>
+      <w:lvlText w:val=""/>
+      <w:lvlJc w:val="start"/>
+      <w:pPr>
+        <w:ind w:start="338.40pt" w:hanging="18pt"/>
+      </w:pPr>
+      <w:rPr>
+        <w:rFonts w:ascii="Wingdings" w:hAnsi="Wingdings" w:hint="default"/>
+      </w:rPr>
+    </w:lvl>
+  </w:abstractNum>
+  <w:abstractNum w:abstractNumId="16" w15:restartNumberingAfterBreak="0">
+    <w:nsid w:val="334F156E"/>
+    <w:multiLevelType w:val="hybridMultilevel"/>
+    <w:tmpl w:val="8ECEDDC6"/>
+    <w:lvl w:ilvl="0" w:tplc="08090001">
+      <w:start w:val="1"/>
+      <w:numFmt w:val="bullet"/>
+      <w:lvlText w:val=""/>
+      <w:lvlJc w:val="start"/>
+      <w:pPr>
+        <w:ind w:start="50.40pt" w:hanging="18pt"/>
+      </w:pPr>
+      <w:rPr>
+        <w:rFonts w:ascii="Symbol" w:hAnsi="Symbol" w:hint="default"/>
+      </w:rPr>
+    </w:lvl>
+    <w:lvl w:ilvl="1" w:tplc="08090003" w:tentative="1">
+      <w:start w:val="1"/>
+      <w:numFmt w:val="bullet"/>
+      <w:lvlText w:val="o"/>
+      <w:lvlJc w:val="start"/>
+      <w:pPr>
+        <w:ind w:start="86.40pt" w:hanging="18pt"/>
+      </w:pPr>
+      <w:rPr>
+        <w:rFonts w:ascii="Courier New" w:hAnsi="Courier New" w:cs="Courier New" w:hint="default"/>
+      </w:rPr>
+    </w:lvl>
+    <w:lvl w:ilvl="2" w:tplc="08090005" w:tentative="1">
+      <w:start w:val="1"/>
+      <w:numFmt w:val="bullet"/>
+      <w:lvlText w:val=""/>
+      <w:lvlJc w:val="start"/>
+      <w:pPr>
+        <w:ind w:start="122.40pt" w:hanging="18pt"/>
+      </w:pPr>
+      <w:rPr>
+        <w:rFonts w:ascii="Wingdings" w:hAnsi="Wingdings" w:hint="default"/>
+      </w:rPr>
+    </w:lvl>
+    <w:lvl w:ilvl="3" w:tplc="08090001" w:tentative="1">
+      <w:start w:val="1"/>
+      <w:numFmt w:val="bullet"/>
+      <w:lvlText w:val=""/>
+      <w:lvlJc w:val="start"/>
+      <w:pPr>
+        <w:ind w:start="158.40pt" w:hanging="18pt"/>
+      </w:pPr>
+      <w:rPr>
+        <w:rFonts w:ascii="Symbol" w:hAnsi="Symbol" w:hint="default"/>
+      </w:rPr>
+    </w:lvl>
+    <w:lvl w:ilvl="4" w:tplc="08090003" w:tentative="1">
+      <w:start w:val="1"/>
+      <w:numFmt w:val="bullet"/>
+      <w:lvlText w:val="o"/>
+      <w:lvlJc w:val="start"/>
+      <w:pPr>
+        <w:ind w:start="194.40pt" w:hanging="18pt"/>
+      </w:pPr>
+      <w:rPr>
+        <w:rFonts w:ascii="Courier New" w:hAnsi="Courier New" w:cs="Courier New" w:hint="default"/>
+      </w:rPr>
+    </w:lvl>
+    <w:lvl w:ilvl="5" w:tplc="08090005" w:tentative="1">
+      <w:start w:val="1"/>
+      <w:numFmt w:val="bullet"/>
+      <w:lvlText w:val=""/>
+      <w:lvlJc w:val="start"/>
+      <w:pPr>
+        <w:ind w:start="230.40pt" w:hanging="18pt"/>
+      </w:pPr>
+      <w:rPr>
+        <w:rFonts w:ascii="Wingdings" w:hAnsi="Wingdings" w:hint="default"/>
+      </w:rPr>
+    </w:lvl>
+    <w:lvl w:ilvl="6" w:tplc="08090001" w:tentative="1">
+      <w:start w:val="1"/>
+      <w:numFmt w:val="bullet"/>
+      <w:lvlText w:val=""/>
+      <w:lvlJc w:val="start"/>
+      <w:pPr>
+        <w:ind w:start="266.40pt" w:hanging="18pt"/>
+      </w:pPr>
+      <w:rPr>
+        <w:rFonts w:ascii="Symbol" w:hAnsi="Symbol" w:hint="default"/>
+      </w:rPr>
+    </w:lvl>
+    <w:lvl w:ilvl="7" w:tplc="08090003" w:tentative="1">
+      <w:start w:val="1"/>
+      <w:numFmt w:val="bullet"/>
+      <w:lvlText w:val="o"/>
+      <w:lvlJc w:val="start"/>
+      <w:pPr>
+        <w:ind w:start="302.40pt" w:hanging="18pt"/>
+      </w:pPr>
+      <w:rPr>
+        <w:rFonts w:ascii="Courier New" w:hAnsi="Courier New" w:cs="Courier New" w:hint="default"/>
+      </w:rPr>
+    </w:lvl>
+    <w:lvl w:ilvl="8" w:tplc="08090005" w:tentative="1">
+      <w:start w:val="1"/>
+      <w:numFmt w:val="bullet"/>
+      <w:lvlText w:val=""/>
+      <w:lvlJc w:val="start"/>
+      <w:pPr>
+        <w:ind w:start="338.40pt" w:hanging="18pt"/>
+      </w:pPr>
+      <w:rPr>
+        <w:rFonts w:ascii="Wingdings" w:hAnsi="Wingdings" w:hint="default"/>
+      </w:rPr>
+    </w:lvl>
+  </w:abstractNum>
+  <w:abstractNum w:abstractNumId="17" w15:restartNumberingAfterBreak="0">
     <w:nsid w:val="37660336"/>
     <w:multiLevelType w:val="hybridMultilevel"/>
     <w:tmpl w:val="754EAC84"/>
@@ -2680,7 +3571,7 @@
       </w:rPr>
     </w:lvl>
   </w:abstractNum>
-  <w:abstractNum w:abstractNumId="15" w15:restartNumberingAfterBreak="0">
+  <w:abstractNum w:abstractNumId="18" w15:restartNumberingAfterBreak="0">
     <w:nsid w:val="39E54FC6"/>
     <w:multiLevelType w:val="singleLevel"/>
     <w:tmpl w:val="5B7288D4"/>
@@ -2700,7 +3591,7 @@
       </w:rPr>
     </w:lvl>
   </w:abstractNum>
-  <w:abstractNum w:abstractNumId="16" w15:restartNumberingAfterBreak="0">
+  <w:abstractNum w:abstractNumId="19" w15:restartNumberingAfterBreak="0">
     <w:nsid w:val="4189603E"/>
     <w:multiLevelType w:val="multilevel"/>
     <w:tmpl w:val="0AB06E12"/>
@@ -2907,7 +3798,7 @@
       </w:rPr>
     </w:lvl>
   </w:abstractNum>
-  <w:abstractNum w:abstractNumId="17" w15:restartNumberingAfterBreak="0">
+  <w:abstractNum w:abstractNumId="20" w15:restartNumberingAfterBreak="0">
     <w:nsid w:val="493C3F76"/>
     <w:multiLevelType w:val="hybridMultilevel"/>
     <w:tmpl w:val="9A9E418C"/>
@@ -3018,7 +3909,7 @@
       </w:pPr>
     </w:lvl>
   </w:abstractNum>
-  <w:abstractNum w:abstractNumId="18" w15:restartNumberingAfterBreak="0">
+  <w:abstractNum w:abstractNumId="21" w15:restartNumberingAfterBreak="0">
     <w:nsid w:val="52CA544A"/>
     <w:multiLevelType w:val="singleLevel"/>
     <w:tmpl w:val="AED6D67E"/>
@@ -3045,7 +3936,7 @@
       </w:rPr>
     </w:lvl>
   </w:abstractNum>
-  <w:abstractNum w:abstractNumId="19" w15:restartNumberingAfterBreak="0">
+  <w:abstractNum w:abstractNumId="22" w15:restartNumberingAfterBreak="0">
     <w:nsid w:val="6C402C58"/>
     <w:multiLevelType w:val="hybridMultilevel"/>
     <w:tmpl w:val="9A1CA078"/>
@@ -3190,7 +4081,7 @@
       </w:rPr>
     </w:lvl>
   </w:abstractNum>
-  <w:abstractNum w:abstractNumId="20" w15:restartNumberingAfterBreak="0">
+  <w:abstractNum w:abstractNumId="23" w15:restartNumberingAfterBreak="0">
     <w:nsid w:val="6CD32DA8"/>
     <w:multiLevelType w:val="singleLevel"/>
     <w:tmpl w:val="166470C2"/>
@@ -3217,40 +4108,40 @@
     </w:lvl>
   </w:abstractNum>
   <w:num w:numId="1" w16cid:durableId="1048453547">
+    <w:abstractNumId w:val="17"/>
+  </w:num>
+  <w:num w:numId="2" w16cid:durableId="457645654">
+    <w:abstractNumId w:val="22"/>
+  </w:num>
+  <w:num w:numId="3" w16cid:durableId="530150571">
     <w:abstractNumId w:val="14"/>
   </w:num>
-  <w:num w:numId="2" w16cid:durableId="457645654">
+  <w:num w:numId="4" w16cid:durableId="1241520077">
     <w:abstractNumId w:val="19"/>
   </w:num>
-  <w:num w:numId="3" w16cid:durableId="530150571">
+  <w:num w:numId="5" w16cid:durableId="1553809860">
+    <w:abstractNumId w:val="19"/>
+  </w:num>
+  <w:num w:numId="6" w16cid:durableId="1583756149">
+    <w:abstractNumId w:val="19"/>
+  </w:num>
+  <w:num w:numId="7" w16cid:durableId="1656032012">
+    <w:abstractNumId w:val="19"/>
+  </w:num>
+  <w:num w:numId="8" w16cid:durableId="427971278">
+    <w:abstractNumId w:val="21"/>
+  </w:num>
+  <w:num w:numId="9" w16cid:durableId="669331647">
+    <w:abstractNumId w:val="23"/>
+  </w:num>
+  <w:num w:numId="10" w16cid:durableId="688992226">
+    <w:abstractNumId w:val="18"/>
+  </w:num>
+  <w:num w:numId="11" w16cid:durableId="1834954372">
     <w:abstractNumId w:val="13"/>
   </w:num>
-  <w:num w:numId="4" w16cid:durableId="1241520077">
-    <w:abstractNumId w:val="16"/>
-  </w:num>
-  <w:num w:numId="5" w16cid:durableId="1553809860">
-    <w:abstractNumId w:val="16"/>
-  </w:num>
-  <w:num w:numId="6" w16cid:durableId="1583756149">
-    <w:abstractNumId w:val="16"/>
-  </w:num>
-  <w:num w:numId="7" w16cid:durableId="1656032012">
-    <w:abstractNumId w:val="16"/>
-  </w:num>
-  <w:num w:numId="8" w16cid:durableId="427971278">
-    <w:abstractNumId w:val="18"/>
-  </w:num>
-  <w:num w:numId="9" w16cid:durableId="669331647">
-    <w:abstractNumId w:val="20"/>
-  </w:num>
-  <w:num w:numId="10" w16cid:durableId="688992226">
-    <w:abstractNumId w:val="15"/>
-  </w:num>
-  <w:num w:numId="11" w16cid:durableId="1834954372">
+  <w:num w:numId="12" w16cid:durableId="1596357375">
     <w:abstractNumId w:val="12"/>
-  </w:num>
-  <w:num w:numId="12" w16cid:durableId="1596357375">
-    <w:abstractNumId w:val="11"/>
   </w:num>
   <w:num w:numId="13" w16cid:durableId="1496802304">
     <w:abstractNumId w:val="0"/>
@@ -3286,16 +4177,43 @@
     <w:abstractNumId w:val="1"/>
   </w:num>
   <w:num w:numId="24" w16cid:durableId="1785270363">
+    <w:abstractNumId w:val="20"/>
+  </w:num>
+  <w:num w:numId="25" w16cid:durableId="984314129">
+    <w:abstractNumId w:val="19"/>
+  </w:num>
+  <w:num w:numId="26" w16cid:durableId="910390365">
+    <w:abstractNumId w:val="19"/>
+  </w:num>
+  <w:num w:numId="27" w16cid:durableId="255286541">
+    <w:abstractNumId w:val="19"/>
+  </w:num>
+  <w:num w:numId="28" w16cid:durableId="2246742">
+    <w:abstractNumId w:val="19"/>
+  </w:num>
+  <w:num w:numId="29" w16cid:durableId="1456410664">
+    <w:abstractNumId w:val="11"/>
+  </w:num>
+  <w:num w:numId="30" w16cid:durableId="804197521">
+    <w:abstractNumId w:val="15"/>
+  </w:num>
+  <w:num w:numId="31" w16cid:durableId="803892372">
+    <w:abstractNumId w:val="16"/>
+  </w:num>
+  <w:num w:numId="32" w16cid:durableId="1639068814">
     <w:abstractNumId w:val="17"/>
   </w:num>
-  <w:num w:numId="25" w16cid:durableId="984314129">
-    <w:abstractNumId w:val="16"/>
+  <w:num w:numId="33" w16cid:durableId="184905089">
+    <w:abstractNumId w:val="17"/>
+  </w:num>
+  <w:num w:numId="34" w16cid:durableId="1002392610">
+    <w:abstractNumId w:val="17"/>
   </w:num>
 </w:numbering>
 </file>
 
 <file path=word/styles.xml><?xml version="1.0" encoding="utf-8"?>
-<w:styles xmlns:mc="http://schemas.openxmlformats.org/markup-compatibility/2006" xmlns:r="http://purl.oclc.org/ooxml/officeDocument/relationships" xmlns:w="http://purl.oclc.org/ooxml/wordprocessingml/main" xmlns:w14="http://schemas.microsoft.com/office/word/2010/wordml" xmlns:w15="http://schemas.microsoft.com/office/word/2012/wordml" xmlns:w16cex="http://schemas.microsoft.com/office/word/2018/wordml/cex" xmlns:w16cid="http://schemas.microsoft.com/office/word/2016/wordml/cid" xmlns:w16="http://schemas.microsoft.com/office/word/2018/wordml" xmlns:w16sdtdh="http://schemas.microsoft.com/office/word/2020/wordml/sdtdatahash" xmlns:w16se="http://schemas.microsoft.com/office/word/2015/wordml/symex" mc:Ignorable="w14 w15 w16se w16cid w16 w16cex w16sdtdh">
+<w:styles xmlns:mc="http://schemas.openxmlformats.org/markup-compatibility/2006" xmlns:r="http://purl.oclc.org/ooxml/officeDocument/relationships" xmlns:w="http://purl.oclc.org/ooxml/wordprocessingml/main" xmlns:w14="http://schemas.microsoft.com/office/word/2010/wordml" xmlns:w15="http://schemas.microsoft.com/office/word/2012/wordml" xmlns:w16cex="http://schemas.microsoft.com/office/word/2018/wordml/cex" xmlns:w16cid="http://schemas.microsoft.com/office/word/2016/wordml/cid" xmlns:w16="http://schemas.microsoft.com/office/word/2018/wordml" xmlns:w16du="http://schemas.microsoft.com/office/word/2023/wordml/word16du" xmlns:w16sdtdh="http://schemas.microsoft.com/office/word/2020/wordml/sdtdatahash" xmlns:w16se="http://schemas.microsoft.com/office/word/2015/wordml/symex" mc:Ignorable="w14 w15 w16se w16cid w16 w16cex w16sdtdh w16du">
   <w:docDefaults>
     <w:rPrDefault>
       <w:rPr>
@@ -3800,10 +4718,6 @@
       <w:numPr>
         <w:numId w:val="1"/>
       </w:numPr>
-      <w:tabs>
-        <w:tab w:val="clear" w:pos="32.40pt"/>
-      </w:tabs>
-      <w:ind w:start="28.80pt" w:hanging="14.40pt"/>
     </w:pPr>
   </w:style>
   <w:style w:type="paragraph" w:customStyle="1" w:styleId="equation">

</xml_diff>

<commit_message>
more reference for the ieee
</commit_message>
<xml_diff>
--- a/1dcnn_ieee.docx
+++ b/1dcnn_ieee.docx
@@ -370,163 +370,172 @@
     <w:p>
       <w:pPr>
         <w:pStyle w:val="BodyText"/>
+      </w:pPr>
+      <w:r>
         <w:rPr>
           <w:lang w:val="en-AU"/>
         </w:rPr>
-      </w:pPr>
+        <w:t>These algorithms utilize data from sensors embedded in wearable devices such as smartwatches, accelerometers, gyroscopes, and heart rate monitors.</w:t>
+      </w:r>
       <w:r>
         <w:rPr>
           <w:lang w:val="en-AU"/>
         </w:rPr>
-        <w:t>These algorithms utilize data from sensors embedded in wearable devices such as smartwatches, accelerometers, gyroscopes, and heart rate monitors.</w:t>
+        <w:t xml:space="preserve"> </w:t>
       </w:r>
       <w:r>
         <w:rPr>
           <w:lang w:val="en-AU"/>
         </w:rPr>
+        <w:t xml:space="preserve">There are 3 popular </w:t>
+      </w:r>
+      <w:r>
+        <w:rPr>
+          <w:lang w:val="en-AU"/>
+        </w:rPr>
+        <w:t>methods</w:t>
+      </w:r>
+      <w:r>
+        <w:rPr>
+          <w:lang w:val="en-AU"/>
+        </w:rPr>
+        <w:t>: (1) T</w:t>
+      </w:r>
+      <w:proofErr w:type="spellStart"/>
+      <w:r>
+        <w:t>hreshold</w:t>
+      </w:r>
+      <w:proofErr w:type="spellEnd"/>
+      <w:r>
+        <w:t>-based methods</w:t>
+      </w:r>
+      <w:r>
+        <w:t>, p</w:t>
+      </w:r>
+      <w:r>
+        <w:t>aper</w:t>
+      </w:r>
+      <w:r>
+        <w:t xml:space="preserve"> [</w:t>
+      </w:r>
+      <w:r>
+        <w:t>1</w:t>
+      </w:r>
+      <w:r>
+        <w:t>]</w:t>
+      </w:r>
+      <w:r>
+        <w:t xml:space="preserve"> and [2</w:t>
+      </w:r>
+      <w:r>
+        <w:t>]</w:t>
+      </w:r>
+      <w:r>
         <w:t xml:space="preserve"> </w:t>
       </w:r>
-    </w:p>
-    <w:p>
-      <w:pPr>
-        <w:pStyle w:val="BodyText"/>
+      <w:r>
+        <w:t>establish</w:t>
+      </w:r>
+      <w:r>
+        <w:t xml:space="preserve"> predefined </w:t>
+      </w:r>
+      <w:r>
+        <w:t xml:space="preserve">experimental </w:t>
+      </w:r>
+      <w:r>
+        <w:t xml:space="preserve">thresholds for </w:t>
+      </w:r>
+      <w:r>
         <w:rPr>
           <w:lang w:val="en-AU"/>
         </w:rPr>
-      </w:pPr>
-    </w:p>
-    <w:p>
-      <w:pPr>
-        <w:pStyle w:val="bulletlist"/>
-        <w:tabs>
-          <w:tab w:val="clear" w:pos="32.40pt"/>
-        </w:tabs>
-        <w:ind w:start="28.80pt" w:hanging="14.40pt"/>
-      </w:pPr>
-      <w:r>
-        <w:t xml:space="preserve">Threshold-based methods: </w:t>
-      </w:r>
-      <w:r>
-        <w:t>Paper</w:t>
-      </w:r>
-      <w:r>
-        <w:t xml:space="preserve"> [</w:t>
-      </w:r>
-      <w:r>
-        <w:t>1</w:t>
-      </w:r>
-      <w:r>
-        <w:t>]</w:t>
-      </w:r>
-      <w:r>
-        <w:t xml:space="preserve"> and [2]</w:t>
+        <w:t>accelerometers</w:t>
       </w:r>
       <w:r>
         <w:t xml:space="preserve"> </w:t>
       </w:r>
       <w:r>
-        <w:t xml:space="preserve"> establish predefined </w:t>
-      </w:r>
-      <w:r>
-        <w:t xml:space="preserve">experimental </w:t>
-      </w:r>
-      <w:r>
-        <w:t xml:space="preserve">thresholds for </w:t>
-      </w:r>
-      <w:r>
-        <w:rPr>
-          <w:lang w:val="en-AU"/>
-        </w:rPr>
-        <w:t>accelerometers</w:t>
+        <w:t>values</w:t>
+      </w:r>
+      <w:r>
+        <w:t xml:space="preserve"> from wrist-worn watch</w:t>
+      </w:r>
+      <w:r>
+        <w:t xml:space="preserve">. </w:t>
+      </w:r>
+      <w:r>
+        <w:t>When</w:t>
+      </w:r>
+      <w:r>
+        <w:t xml:space="preserve"> these thresholds are </w:t>
+      </w:r>
+      <w:r>
+        <w:t>met</w:t>
+      </w:r>
+      <w:r>
+        <w:t xml:space="preserve"> during a specific time frame, a fall is detected.</w:t>
+      </w:r>
+      <w:r>
+        <w:t xml:space="preserve"> (2) </w:t>
+      </w:r>
+      <w:r>
+        <w:t>Machine learning-based methods</w:t>
+      </w:r>
+      <w:r>
+        <w:t xml:space="preserve">. </w:t>
+      </w:r>
+      <w:r>
+        <w:t>Saleh</w:t>
+      </w:r>
+      <w:r>
+        <w:t xml:space="preserve"> et al. </w:t>
+      </w:r>
+      <w:r>
+        <w:t>[3] e</w:t>
+      </w:r>
+      <w:r>
+        <w:t xml:space="preserve">mploy algorithms like Support Vector Machines (SVM), Random Forests, or Naive Bayes, </w:t>
+      </w:r>
+      <w:r>
+        <w:t xml:space="preserve"> and deep learning </w:t>
+      </w:r>
+      <w:r>
+        <w:t xml:space="preserve"> methods </w:t>
+      </w:r>
+      <w:r>
+        <w:t xml:space="preserve">to </w:t>
+      </w:r>
+      <w:r>
+        <w:t xml:space="preserve">learn patterns from </w:t>
+      </w:r>
+      <w:r>
+        <w:t xml:space="preserve">their proposed dataset, </w:t>
+      </w:r>
+      <w:proofErr w:type="spellStart"/>
+      <w:r>
+        <w:t>FallAllD</w:t>
+      </w:r>
+      <w:proofErr w:type="spellEnd"/>
+      <w:r>
+        <w:t xml:space="preserve"> to</w:t>
+      </w:r>
+      <w:r>
+        <w:t xml:space="preserve"> classify a fall.</w:t>
+      </w:r>
+      <w:r>
+        <w:t xml:space="preserve"> They applied deep learning for higher accuracy.</w:t>
+      </w:r>
+      <w:r>
+        <w:t xml:space="preserve"> (3) D</w:t>
+      </w:r>
+      <w:r>
+        <w:t>eep learning-based methods</w:t>
+      </w:r>
+      <w:r>
+        <w:t>.</w:t>
       </w:r>
       <w:r>
         <w:t xml:space="preserve"> </w:t>
-      </w:r>
-      <w:r>
-        <w:t>values</w:t>
-      </w:r>
-      <w:r>
-        <w:t xml:space="preserve"> from wrist-worn watch</w:t>
-      </w:r>
-      <w:r>
-        <w:t xml:space="preserve">. </w:t>
-      </w:r>
-      <w:r>
-        <w:t>When</w:t>
-      </w:r>
-      <w:r>
-        <w:t xml:space="preserve"> these thresholds are </w:t>
-      </w:r>
-      <w:r>
-        <w:t>met</w:t>
-      </w:r>
-      <w:r>
-        <w:t xml:space="preserve"> during a specific time frame, a fall is detected.</w:t>
-      </w:r>
-    </w:p>
-    <w:p>
-      <w:pPr>
-        <w:pStyle w:val="bulletlist"/>
-        <w:tabs>
-          <w:tab w:val="clear" w:pos="32.40pt"/>
-        </w:tabs>
-        <w:ind w:start="28.80pt" w:hanging="14.40pt"/>
-      </w:pPr>
-      <w:r>
-        <w:t xml:space="preserve">Machine learning-based methods: </w:t>
-      </w:r>
-      <w:r>
-        <w:t>Saleh</w:t>
-      </w:r>
-      <w:r>
-        <w:t xml:space="preserve"> et al. </w:t>
-      </w:r>
-      <w:r>
-        <w:t>[3] e</w:t>
-      </w:r>
-      <w:r>
-        <w:t xml:space="preserve">mploy algorithms like Support Vector Machines (SVM), Random Forests, or Naive Bayes, </w:t>
-      </w:r>
-      <w:r>
-        <w:t xml:space="preserve"> and deep learning </w:t>
-      </w:r>
-      <w:r>
-        <w:t xml:space="preserve"> methods </w:t>
-      </w:r>
-      <w:r>
-        <w:t xml:space="preserve">to </w:t>
-      </w:r>
-      <w:r>
-        <w:t xml:space="preserve">learn patterns from </w:t>
-      </w:r>
-      <w:r>
-        <w:t xml:space="preserve">their proposed dataset, </w:t>
-      </w:r>
-      <w:proofErr w:type="spellStart"/>
-      <w:r>
-        <w:t>FallAllD</w:t>
-      </w:r>
-      <w:proofErr w:type="spellEnd"/>
-      <w:r>
-        <w:t xml:space="preserve"> to</w:t>
-      </w:r>
-      <w:r>
-        <w:t xml:space="preserve"> classify a fall.</w:t>
-      </w:r>
-      <w:r>
-        <w:t xml:space="preserve"> They applied deep learning for higher accuracy.</w:t>
-      </w:r>
-    </w:p>
-    <w:p>
-      <w:pPr>
-        <w:pStyle w:val="bulletlist"/>
-        <w:tabs>
-          <w:tab w:val="clear" w:pos="32.40pt"/>
-        </w:tabs>
-        <w:ind w:start="28.80pt" w:hanging="14.40pt"/>
-      </w:pPr>
-      <w:r>
-        <w:t xml:space="preserve">Deep learning-based methods: </w:t>
       </w:r>
       <w:r>
         <w:t>Authors [4] l</w:t>
@@ -577,63 +586,132 @@
     <w:p>
       <w:pPr>
         <w:pStyle w:val="BodyText"/>
+      </w:pPr>
+      <w:r>
         <w:rPr>
           <w:lang w:val="en-AU"/>
         </w:rPr>
-      </w:pPr>
+        <w:t xml:space="preserve">These algorithms </w:t>
+      </w:r>
       <w:r>
         <w:rPr>
           <w:lang w:val="en-AU"/>
         </w:rPr>
-        <w:t xml:space="preserve">These algorithms </w:t>
+        <w:t>analyse</w:t>
       </w:r>
       <w:r>
         <w:rPr>
           <w:lang w:val="en-AU"/>
         </w:rPr>
-        <w:t>analyse</w:t>
+        <w:t xml:space="preserve"> video footage to detect falls.</w:t>
       </w:r>
       <w:r>
         <w:rPr>
           <w:lang w:val="en-AU"/>
         </w:rPr>
-        <w:t xml:space="preserve"> video footage to detect falls.</w:t>
-      </w:r>
-    </w:p>
-    <w:p>
-      <w:pPr>
-        <w:pStyle w:val="bulletlist"/>
-        <w:tabs>
-          <w:tab w:val="clear" w:pos="32.40pt"/>
-        </w:tabs>
-        <w:ind w:start="28.80pt" w:hanging="14.40pt"/>
-      </w:pPr>
-      <w:r>
-        <w:t>Inactivity detection: These algorithms monitor for prolonged periods of stillness or unusual body postures, indicating a potential fall.</w:t>
-      </w:r>
-    </w:p>
-    <w:p>
-      <w:pPr>
-        <w:pStyle w:val="bulletlist"/>
-        <w:tabs>
-          <w:tab w:val="clear" w:pos="32.40pt"/>
-        </w:tabs>
-        <w:ind w:start="28.80pt" w:hanging="14.40pt"/>
-      </w:pPr>
-      <w:r>
-        <w:t>Body shape change analysis: By analyzing changes in a person's body shape over time, these algorithms can identify the sudden collapse associated with a fall.</w:t>
-      </w:r>
-    </w:p>
-    <w:p>
-      <w:pPr>
-        <w:pStyle w:val="bulletlist"/>
-        <w:tabs>
-          <w:tab w:val="clear" w:pos="32.40pt"/>
-        </w:tabs>
-        <w:ind w:start="28.80pt" w:hanging="14.40pt"/>
-      </w:pPr>
-      <w:r>
-        <w:t>3D head motion analysis: Focusing on the rapid and uncontrolled movement of the head during a fall, these algorithms can accurately detect fall events.</w:t>
+        <w:t xml:space="preserve"> One way is body</w:t>
+      </w:r>
+      <w:r>
+        <w:t xml:space="preserve"> shape change analysis</w:t>
+      </w:r>
+      <w:r>
+        <w:t xml:space="preserve">, </w:t>
+      </w:r>
+      <w:r>
+        <w:t>Espinosa</w:t>
+      </w:r>
+      <w:r>
+        <w:t xml:space="preserve"> et al. [5] </w:t>
+      </w:r>
+      <w:r>
+        <w:t xml:space="preserve">analyzes images in </w:t>
+      </w:r>
+      <w:r>
+        <w:t>a section of</w:t>
+      </w:r>
+      <w:r>
+        <w:t xml:space="preserve"> time</w:t>
+      </w:r>
+      <w:r>
+        <w:t xml:space="preserve">, </w:t>
+      </w:r>
+      <w:r>
+        <w:t xml:space="preserve">extracts features using an optical flow method </w:t>
+      </w:r>
+      <w:r>
+        <w:t>which</w:t>
+      </w:r>
+      <w:r>
+        <w:t xml:space="preserve"> </w:t>
+      </w:r>
+      <w:r>
+        <w:t xml:space="preserve">can </w:t>
+      </w:r>
+      <w:r>
+        <w:t>obtain information on the relative motion between two consecutive images</w:t>
+      </w:r>
+      <w:r>
+        <w:t xml:space="preserve"> to judge the change then conclude fall or not. The other popular way is </w:t>
+      </w:r>
+      <w:r>
+        <w:t xml:space="preserve">3D </w:t>
+      </w:r>
+      <w:r>
+        <w:t xml:space="preserve">skeleton </w:t>
+      </w:r>
+      <w:r>
+        <w:t>model, f</w:t>
+      </w:r>
+      <w:r>
+        <w:t xml:space="preserve">ocusing on the rapid and uncontrolled movement of the </w:t>
+      </w:r>
+      <w:r>
+        <w:t>body</w:t>
+      </w:r>
+      <w:r>
+        <w:t xml:space="preserve"> during a fall, </w:t>
+      </w:r>
+      <w:r>
+        <w:t xml:space="preserve">employing </w:t>
+      </w:r>
+      <w:r>
+        <w:t>3D skeleton points</w:t>
+      </w:r>
+      <w:r>
+        <w:t xml:space="preserve"> </w:t>
+      </w:r>
+      <w:r>
+        <w:t>given by a tracking camera</w:t>
+      </w:r>
+      <w:r>
+        <w:t xml:space="preserve">, </w:t>
+      </w:r>
+      <w:r>
+        <w:t xml:space="preserve">the dataset </w:t>
+      </w:r>
+      <w:r>
+        <w:t>[</w:t>
+      </w:r>
+      <w:r>
+        <w:t>6</w:t>
+      </w:r>
+      <w:r>
+        <w:t>]</w:t>
+      </w:r>
+      <w:r>
+        <w:t xml:space="preserve"> can </w:t>
+      </w:r>
+      <w:r>
+        <w:t xml:space="preserve">help </w:t>
+      </w:r>
+      <w:r>
+        <w:t>accurately detect fall events.</w:t>
+      </w:r>
+      <w:r>
+        <w:t xml:space="preserve"> </w:t>
+      </w:r>
+      <w:r>
+        <w:t>The visual ways trigger the concern of privacy.</w:t>
       </w:r>
     </w:p>
     <w:p>
@@ -671,7 +749,37 @@
         <w:ind w:start="28.80pt" w:hanging="14.40pt"/>
       </w:pPr>
       <w:r>
-        <w:t>Pressure sensor-based methods: Detect changes in pressure distribution when a person falls.</w:t>
+        <w:t xml:space="preserve">Pressure sensor-based methods: </w:t>
+      </w:r>
+      <w:r>
+        <w:t>U</w:t>
+      </w:r>
+      <w:r>
+        <w:t>sing floor vibration as the recognition source, the system</w:t>
+      </w:r>
+      <w:r>
+        <w:t xml:space="preserve"> [</w:t>
+      </w:r>
+      <w:r>
+        <w:t>7</w:t>
+      </w:r>
+      <w:r>
+        <w:t>]</w:t>
+      </w:r>
+      <w:r>
+        <w:t xml:space="preserve"> incorporates a person identification through vibration produced by footsteps to </w:t>
+      </w:r>
+      <w:r>
+        <w:t>identify</w:t>
+      </w:r>
+      <w:r>
+        <w:t xml:space="preserve"> who is the fallen person</w:t>
+      </w:r>
+      <w:r>
+        <w:t xml:space="preserve">, and the system can distinguish fall from other </w:t>
+      </w:r>
+      <w:r>
+        <w:t>ADL, and reach an accuracy of 95%.</w:t>
       </w:r>
     </w:p>
     <w:p>
@@ -685,6 +793,36 @@
       <w:r>
         <w:t>Acoustic-based methods: Analyze sound patterns for unusual noises associated with a fall.</w:t>
       </w:r>
+      <w:r>
+        <w:t xml:space="preserve"> The system [</w:t>
+      </w:r>
+      <w:r>
+        <w:t>8</w:t>
+      </w:r>
+      <w:r>
+        <w:t xml:space="preserve">] collect normal </w:t>
+      </w:r>
+      <w:r>
+        <w:t>acoustic signals (footstep sound signals)</w:t>
+      </w:r>
+      <w:r>
+        <w:t xml:space="preserve">, then </w:t>
+      </w:r>
+      <w:r>
+        <w:t xml:space="preserve">Mel-frequency cepstral coefficient (MFCC) features are extracted from the processed signals and used to construct a data </w:t>
+      </w:r>
+      <w:r>
+        <w:t>which will be trained by</w:t>
+      </w:r>
+      <w:r>
+        <w:t xml:space="preserve"> support vector machine</w:t>
+      </w:r>
+      <w:r>
+        <w:t xml:space="preserve"> (SVM) </w:t>
+      </w:r>
+      <w:r>
+        <w:t>, a binary result of fall or not will be obtained by the algorithm.</w:t>
+      </w:r>
     </w:p>
     <w:p>
       <w:pPr>
@@ -697,6 +835,42 @@
       <w:r>
         <w:t>Radar-based methods: Use radar signals to track human movement and detect abnormal motion patterns.</w:t>
       </w:r>
+      <w:r>
+        <w:t xml:space="preserve"> Han et al. [</w:t>
+      </w:r>
+      <w:r>
+        <w:t>9</w:t>
+      </w:r>
+      <w:r>
+        <w:t xml:space="preserve">]  </w:t>
+      </w:r>
+      <w:r>
+        <w:t>collected</w:t>
+      </w:r>
+      <w:r>
+        <w:t xml:space="preserve"> </w:t>
+      </w:r>
+      <w:r>
+        <w:t xml:space="preserve">signal data containing the motion information of objects was using a impulse-radio </w:t>
+      </w:r>
+      <w:r>
+        <w:t>ultra-wideband</w:t>
+      </w:r>
+      <w:r>
+        <w:t xml:space="preserve"> (IR-UWB) radar</w:t>
+      </w:r>
+      <w:r>
+        <w:t>, then feed the</w:t>
+      </w:r>
+      <w:r>
+        <w:t xml:space="preserve"> data to a CNN algorithm to classify “Fall” </w:t>
+      </w:r>
+      <w:r>
+        <w:t>or</w:t>
+      </w:r>
+      <w:r>
+        <w:t xml:space="preserve"> “ADL.”</w:t>
+      </w:r>
     </w:p>
     <w:p>
       <w:pPr>
@@ -709,7 +883,14 @@
         <w:rPr>
           <w:lang w:val="en-AU"/>
         </w:rPr>
-        <w:t>It's important to note that the choice of algorithm depends on factors such as desired accuracy, computational resources, user preferences, and the specific environment where the system will be deployed. Additionally, many systems combine multiple algorithm types to improve overall performance and robustness.</w:t>
+        <w:t xml:space="preserve">It's important to note that the choice of algorithm depends on factors such as desired accuracy, computational resources, </w:t>
+      </w:r>
+      <w:r>
+        <w:rPr>
+          <w:lang w:val="en-AU"/>
+        </w:rPr>
+        <w:lastRenderedPageBreak/>
+        <w:t>user preferences, and the specific environment where the system will be deployed. Additionally, many systems combine multiple algorithm types to improve overall performance and robustness.</w:t>
       </w:r>
     </w:p>
     <w:p>
@@ -1037,7 +1218,10 @@
         <w:pStyle w:val="BodyText"/>
       </w:pPr>
       <w:r>
-        <w:t>Convolutional neural networks (CNNs) are a type of deep learning architecture particularly well-suited for processing and analyzing spatial data, such as images. CNNs consist of multiple layers that perform convolution, pooling, and fully connected operations to extract relevant features from the input data. The convolutional layers apply filters to local regions of the input, allowing the network to learn spatial patterns. The pooling layers then reduce the spatial dimensions of the feature maps, while the fully connected layers perform classification or regression tasks based on the extracted features. For time-series data like sensor readings, a 1D-CNN architecture is more appropriate, as it operates on 1-dimensional sequences rather than 2D images. 1D-CNNs are able to effectively capture the temporal patterns in sensor data, making them a suitable choice for the fall detection task at hand, where the sensor readings exhibit characteristic patterns associated with fall events.</w:t>
+        <w:t xml:space="preserve">Convolutional neural networks (CNNs) are a type of deep learning architecture particularly well-suited for processing and analyzing spatial data, such as images. CNNs consist of multiple layers that perform convolution, pooling, and fully connected operations to extract relevant features from the input data. The convolutional layers apply filters to local regions of the input, allowing the network to learn spatial patterns. The pooling layers then reduce the spatial dimensions of the feature maps, while the fully connected layers perform classification or regression tasks based on the extracted features. For time-series data like sensor readings, a </w:t>
+      </w:r>
+      <w:r>
+        <w:t>1D-CNN architecture is more appropriate, as it operates on 1-dimensional sequences rather than 2D images. 1D-CNNs are able to effectively capture the temporal patterns in sensor data, making them a suitable choice for the fall detection task at hand, where the sensor readings exhibit characteristic patterns associated with fall events.</w:t>
       </w:r>
     </w:p>
     <w:p>
@@ -1326,7 +1510,11 @@
         <w:pStyle w:val="BodyText"/>
       </w:pPr>
       <w:r>
-        <w:t>The equations are an exception to the prescribed specifications of this template. You will need to determine whether or not your equation should be typed using either the Times New Roman or the Symbol font (please no other font). To create multileveled equations, it may be necessary to treat the equation as a graphic and insert it into the text after your paper is styled.</w:t>
+        <w:t xml:space="preserve">The equations are an exception to the prescribed specifications of this template. You will need to determine </w:t>
+      </w:r>
+      <w:r>
+        <w:lastRenderedPageBreak/>
+        <w:t>whether or not your equation should be typed using either the Times New Roman or the Symbol font (please no other font). To create multileveled equations, it may be necessary to treat the equation as a graphic and insert it into the text after your paper is styled.</w:t>
       </w:r>
     </w:p>
     <w:p>
@@ -1337,7 +1525,6 @@
         </w:rPr>
       </w:pPr>
       <w:r>
-        <w:lastRenderedPageBreak/>
         <w:t>Number equations consecutively. Equation numbers, within parentheses, are to position flush right, as in (1), using a right tab stop. To make your equations more compact, you may use the solidus ( / ), the exp function, or appropriate exponents. Italicize Roman symbols for quantities and variables, but not Greek symbols. Use a long dash rather than a hyphen for a minus sign. Punctuate equations with commas or periods when they are part of a sentence, as in</w:t>
       </w:r>
       <w:r>
@@ -1557,10 +1744,7 @@
         <w:pStyle w:val="BodyText"/>
       </w:pPr>
       <w:r>
-        <w:t xml:space="preserve">After the text edit has been completed, the paper is ready for the template. Duplicate the template file by using the Save </w:t>
-      </w:r>
-      <w:r>
-        <w:t>As command, and use the naming convention prescribed by your conference for the name of your paper. In this newly created file, highlight all of the contents and import your prepared text file. You are now ready to style your paper; use the scroll down window on the left of the MS Word Formatting toolbar.</w:t>
+        <w:t>After the text edit has been completed, the paper is ready for the template. Duplicate the template file by using the Save As command, and use the naming convention prescribed by your conference for the name of your paper. In this newly created file, highlight all of the contents and import your prepared text file. You are now ready to style your paper; use the scroll down window on the left of the MS Word Formatting toolbar.</w:t>
       </w:r>
     </w:p>
     <w:p>
@@ -1838,7 +2022,14 @@
         <w:rPr>
           <w:i w:val="0"/>
         </w:rPr>
-        <w:t>Place figures and tables at the top and bottom of columns. Avoid placing them in the middle of columns. Large figures and tables may span across both columns. Figure captions should be below the figures; table heads should appear above the tables. Insert figures and tables after they are cited in the text. Use the abbreviation “Fig. 1”, even at the beginning of a sentence.</w:t>
+        <w:t xml:space="preserve">Place figures and tables at the top and bottom of columns. Avoid placing them in the middle of columns. Large figures and tables may span across both columns. Figure captions should be below the </w:t>
+      </w:r>
+      <w:r>
+        <w:rPr>
+          <w:i w:val="0"/>
+        </w:rPr>
+        <w:lastRenderedPageBreak/>
+        <w:t>figures; table heads should appear above the tables. Insert figures and tables after they are cited in the text. Use the abbreviation “Fig. 1”, even at the beginning of a sentence.</w:t>
       </w:r>
     </w:p>
     <w:p>
@@ -1888,7 +2079,6 @@
               <w:pStyle w:val="tablecolhead"/>
             </w:pPr>
             <w:r>
-              <w:lastRenderedPageBreak/>
               <w:t>Table Head</w:t>
             </w:r>
           </w:p>
@@ -2313,6 +2503,30 @@
         </w:rPr>
       </w:pPr>
       <w:r>
+        <w:t xml:space="preserve">R. Espinosa, H. Ponce, S. Gutiérrez, L. Martínez-Villaseñor, J. Brieva, and E. Moya-Albor, “A vision-based approach for fall detection using multiple cameras and convolutional neural networks: A case study using the UP-Fall detection dataset,” </w:t>
+      </w:r>
+      <w:r>
+        <w:rPr>
+          <w:i/>
+          <w:iCs/>
+        </w:rPr>
+        <w:t>Computers in Biology and Medicine</w:t>
+      </w:r>
+      <w:r>
+        <w:t>, vol. 115, p. 103520, Dec. 2019</w:t>
+      </w:r>
+      <w:r>
+        <w:t>.</w:t>
+      </w:r>
+    </w:p>
+    <w:p>
+      <w:pPr>
+        <w:pStyle w:val="references"/>
+        <w:rPr>
+          <w:lang w:eastAsia="zh-CN"/>
+        </w:rPr>
+      </w:pPr>
+      <w:r>
         <w:rPr>
           <w:lang w:eastAsia="zh-CN"/>
         </w:rPr>
@@ -2342,6 +2556,99 @@
     <w:p>
       <w:pPr>
         <w:pStyle w:val="references"/>
+      </w:pPr>
+      <w:r>
+        <w:t xml:space="preserve">J. Clemente, F. Li, M. Valero, and W. Song, “Smart Seismic Sensing for Indoor Fall Detection, Location, and Notification,” </w:t>
+      </w:r>
+      <w:r>
+        <w:rPr>
+          <w:i/>
+          <w:iCs/>
+        </w:rPr>
+        <w:t>IEEE Journal of Biomedical and Health Informatics</w:t>
+      </w:r>
+      <w:r>
+        <w:t xml:space="preserve">, vol. 24, no. 2, pp. 524–532, Feb. 2020, doi: </w:t>
+      </w:r>
+      <w:hyperlink r:id="rId11" w:history="1">
+        <w:r>
+          <w:rPr>
+            <w:rStyle w:val="Hyperlink"/>
+          </w:rPr>
+          <w:t>10.1109/JBHI.2019.2907498</w:t>
+        </w:r>
+      </w:hyperlink>
+      <w:r>
+        <w:t>.</w:t>
+      </w:r>
+    </w:p>
+    <w:p>
+      <w:pPr>
+        <w:pStyle w:val="references"/>
+        <w:rPr>
+          <w:lang w:eastAsia="zh-CN"/>
+        </w:rPr>
+      </w:pPr>
+      <w:r>
+        <w:t xml:space="preserve">M. Salman Khan, M. Yu, P. Feng, L. Wang, and J. Chambers, “An unsupervised acoustic fall detection system using source separation for sound interference suppression,” </w:t>
+      </w:r>
+      <w:r>
+        <w:rPr>
+          <w:i/>
+          <w:iCs/>
+        </w:rPr>
+        <w:t>Signal Processing</w:t>
+      </w:r>
+      <w:r>
+        <w:t xml:space="preserve">, vol. 110, pp. 199–210, May 2015, doi: </w:t>
+      </w:r>
+      <w:hyperlink r:id="rId12" w:history="1">
+        <w:r>
+          <w:rPr>
+            <w:rStyle w:val="Hyperlink"/>
+          </w:rPr>
+          <w:t>10.1016/j.sigpro.2014.08.021</w:t>
+        </w:r>
+      </w:hyperlink>
+      <w:r>
+        <w:t>.</w:t>
+      </w:r>
+    </w:p>
+    <w:p>
+      <w:pPr>
+        <w:pStyle w:val="references"/>
+        <w:rPr>
+          <w:lang w:eastAsia="zh-CN"/>
+        </w:rPr>
+      </w:pPr>
+      <w:r>
+        <w:t xml:space="preserve">T. Han, W. Kang, and G. Choi, “IR-UWB Sensor Based Fall Detection Method Using CNN Algorithm,” </w:t>
+      </w:r>
+      <w:r>
+        <w:rPr>
+          <w:i/>
+          <w:iCs/>
+        </w:rPr>
+        <w:t>Sensors</w:t>
+      </w:r>
+      <w:r>
+        <w:t xml:space="preserve">, vol. 20, no. 20, Art. no. 20, Jan. 2020, doi: </w:t>
+      </w:r>
+      <w:hyperlink r:id="rId13" w:history="1">
+        <w:r>
+          <w:rPr>
+            <w:rStyle w:val="Hyperlink"/>
+          </w:rPr>
+          <w:t>10.3390/s20205948</w:t>
+        </w:r>
+      </w:hyperlink>
+      <w:r>
+        <w:t>.</w:t>
+      </w:r>
+    </w:p>
+    <w:p>
+      <w:pPr>
+        <w:pStyle w:val="references"/>
         <w:rPr>
           <w:lang w:eastAsia="zh-CN"/>
         </w:rPr>
@@ -2372,91 +2679,6 @@
         </w:rPr>
         <w:t>.</w:t>
       </w:r>
-    </w:p>
-    <w:p>
-      <w:pPr>
-        <w:pStyle w:val="references"/>
-        <w:ind w:start="17.70pt" w:hanging="17.70pt"/>
-      </w:pPr>
-      <w:r>
-        <w:t xml:space="preserve">G. Eason, B. Noble, and I. N. Sneddon, “On certain integrals of Lipschitz-Hankel type involving products of Bessel functions,” Phil. Trans. Roy. Soc. London, vol. A247, pp. 529–551, April 1955. </w:t>
-      </w:r>
-      <w:r>
-        <w:rPr>
-          <w:i/>
-          <w:iCs/>
-        </w:rPr>
-        <w:t>(references)</w:t>
-      </w:r>
-    </w:p>
-    <w:p>
-      <w:pPr>
-        <w:pStyle w:val="references"/>
-        <w:ind w:start="17.70pt" w:hanging="17.70pt"/>
-      </w:pPr>
-      <w:r>
-        <w:t>J. Clerk Maxwell, A Treatise on Electricity and Magnetism, 3rd ed., vol. 2. Oxford: Clarendon, 1892, pp.68–73.</w:t>
-      </w:r>
-    </w:p>
-    <w:p>
-      <w:pPr>
-        <w:pStyle w:val="references"/>
-        <w:ind w:start="17.70pt" w:hanging="17.70pt"/>
-      </w:pPr>
-      <w:r>
-        <w:t>I. S. Jacobs and C. P. Bean, “Fine particles, thin films and exchange anisotropy,” in Magnetism, vol. III, G. T. Rado and H. Suhl, Eds. New York: Academic, 1963, pp. 271–350.</w:t>
-      </w:r>
-    </w:p>
-    <w:p>
-      <w:pPr>
-        <w:pStyle w:val="references"/>
-        <w:ind w:start="17.70pt" w:hanging="17.70pt"/>
-      </w:pPr>
-      <w:r>
-        <w:t>K. Elissa, “Title of paper if known,” unpublished.</w:t>
-      </w:r>
-    </w:p>
-    <w:p>
-      <w:pPr>
-        <w:pStyle w:val="references"/>
-        <w:ind w:start="17.70pt" w:hanging="17.70pt"/>
-      </w:pPr>
-      <w:r>
-        <w:t>R. Nicole, “Title of paper with only first word capitalized,” J. Name Stand. Abbrev., in press.</w:t>
-      </w:r>
-    </w:p>
-    <w:p>
-      <w:pPr>
-        <w:pStyle w:val="references"/>
-        <w:ind w:start="17.70pt" w:hanging="17.70pt"/>
-      </w:pPr>
-      <w:r>
-        <w:t>Y. Yorozu, M. Hirano, K. Oka, and Y. Tagawa, “Electron spectroscopy studies on magneto-optical media and plastic substrate interface,” IEEE Transl. J. Magn. Japan, vol. 2, pp. 740–741, August 1987 [Digests 9th Annual Conf. Magnetics Japan, p. 301, 1982].</w:t>
-      </w:r>
-    </w:p>
-    <w:p>
-      <w:pPr>
-        <w:pStyle w:val="references"/>
-        <w:ind w:start="17.70pt" w:hanging="17.70pt"/>
-      </w:pPr>
-      <w:r>
-        <w:t>M. Young, The Technical Writer</w:t>
-      </w:r>
-      <w:r>
-        <w:t>’</w:t>
-      </w:r>
-      <w:r>
-        <w:t>s Handbook. Mill Valley, CA: University Science, 1989.</w:t>
-      </w:r>
-    </w:p>
-    <w:p>
-      <w:pPr>
-        <w:pStyle w:val="references"/>
-        <w:numPr>
-          <w:ilvl w:val="0"/>
-          <w:numId w:val="0"/>
-        </w:numPr>
-      </w:pPr>
     </w:p>
     <w:p>
       <w:pPr>
@@ -2467,7 +2689,6 @@
         </w:numPr>
         <w:spacing w:line="12pt" w:lineRule="auto"/>
         <w:ind w:start="18pt" w:hanging="18pt"/>
-        <w:jc w:val="center"/>
         <w:rPr>
           <w:rFonts w:eastAsia="SimSun"/>
           <w:b/>
@@ -2476,7 +2697,7 @@
           <w:spacing w:val="-1"/>
           <w:sz w:val="20"/>
           <w:szCs w:val="20"/>
-          <w:lang w:val="x-none" w:eastAsia="x-none"/>
+          <w:lang w:eastAsia="x-none"/>
         </w:rPr>
       </w:pPr>
     </w:p>
@@ -4923,6 +5144,7 @@
   <w:style w:type="character" w:default="1" w:styleId="DefaultParagraphFont">
     <w:name w:val="Default Paragraph Font"/>
     <w:uiPriority w:val="1"/>
+    <w:semiHidden/>
     <w:unhideWhenUsed/>
   </w:style>
   <w:style w:type="table" w:default="1" w:styleId="TableNormal">

</xml_diff>

<commit_message>
add ppt and the first drawing
</commit_message>
<xml_diff>
--- a/1dcnn_ieee.docx
+++ b/1dcnn_ieee.docx
@@ -1,6 +1,6 @@
 
 <file path=word/document.xml><?xml version="1.0" encoding="utf-8"?>
-<w:document xmlns:cx="http://schemas.microsoft.com/office/drawing/2014/chartex" xmlns:cx1="http://schemas.microsoft.com/office/drawing/2015/9/8/chartex" xmlns:cx2="http://schemas.microsoft.com/office/drawing/2015/10/21/chartex" xmlns:cx3="http://schemas.microsoft.com/office/drawing/2016/5/9/chartex" xmlns:cx4="http://schemas.microsoft.com/office/drawing/2016/5/10/chartex" xmlns:cx5="http://schemas.microsoft.com/office/drawing/2016/5/11/chartex" xmlns:cx6="http://schemas.microsoft.com/office/drawing/2016/5/12/chartex" xmlns:cx7="http://schemas.microsoft.com/office/drawing/2016/5/13/chartex" xmlns:cx8="http://schemas.microsoft.com/office/drawing/2016/5/14/chartex" xmlns:mc="http://schemas.openxmlformats.org/markup-compatibility/2006" xmlns:aink="http://schemas.microsoft.com/office/drawing/2016/ink" xmlns:am3d="http://schemas.microsoft.com/office/drawing/2017/model3d" xmlns:o="urn:schemas-microsoft-com:office:office" xmlns:r="http://purl.oclc.org/ooxml/officeDocument/relationships" xmlns:m="http://purl.oclc.org/ooxml/officeDocument/math" xmlns:v="urn:schemas-microsoft-com:vml" xmlns:wp14="http://schemas.microsoft.com/office/word/2010/wordprocessingDrawing" xmlns:wp="http://purl.oclc.org/ooxml/drawingml/wordprocessingDrawing" xmlns:w10="urn:schemas-microsoft-com:office:word" xmlns:w="http://purl.oclc.org/ooxml/wordprocessingml/main" xmlns:w14="http://schemas.microsoft.com/office/word/2010/wordml" xmlns:w15="http://schemas.microsoft.com/office/word/2012/wordml" xmlns:w16cid="http://schemas.microsoft.com/office/word/2016/wordml/cid" xmlns:w16se="http://schemas.microsoft.com/office/word/2015/wordml/symex" xmlns:wpi="http://schemas.microsoft.com/office/word/2010/wordprocessingInk" xmlns:wne="http://schemas.microsoft.com/office/word/2006/wordml" mc:Ignorable="w14 w15 w16se w16cid wne wp14" w:conformance="strict">
+<w:document xmlns:cx="http://schemas.microsoft.com/office/drawing/2014/chartex" xmlns:cx1="http://schemas.microsoft.com/office/drawing/2015/9/8/chartex" xmlns:cx2="http://schemas.microsoft.com/office/drawing/2015/10/21/chartex" xmlns:cx3="http://schemas.microsoft.com/office/drawing/2016/5/9/chartex" xmlns:cx4="http://schemas.microsoft.com/office/drawing/2016/5/10/chartex" xmlns:cx5="http://schemas.microsoft.com/office/drawing/2016/5/11/chartex" xmlns:cx6="http://schemas.microsoft.com/office/drawing/2016/5/12/chartex" xmlns:cx7="http://schemas.microsoft.com/office/drawing/2016/5/13/chartex" xmlns:cx8="http://schemas.microsoft.com/office/drawing/2016/5/14/chartex" xmlns:mc="http://schemas.openxmlformats.org/markup-compatibility/2006" xmlns:aink="http://schemas.microsoft.com/office/drawing/2016/ink" xmlns:am3d="http://schemas.microsoft.com/office/drawing/2017/model3d" xmlns:o="urn:schemas-microsoft-com:office:office" xmlns:oel="http://schemas.microsoft.com/office/2019/extlst" xmlns:r="http://purl.oclc.org/ooxml/officeDocument/relationships" xmlns:m="http://purl.oclc.org/ooxml/officeDocument/math" xmlns:v="urn:schemas-microsoft-com:vml" xmlns:wp14="http://schemas.microsoft.com/office/word/2010/wordprocessingDrawing" xmlns:wp="http://purl.oclc.org/ooxml/drawingml/wordprocessingDrawing" xmlns:w10="urn:schemas-microsoft-com:office:word" xmlns:w="http://purl.oclc.org/ooxml/wordprocessingml/main" xmlns:w14="http://schemas.microsoft.com/office/word/2010/wordml" xmlns:w15="http://schemas.microsoft.com/office/word/2012/wordml" xmlns:w16cex="http://schemas.microsoft.com/office/word/2018/wordml/cex" xmlns:w16cid="http://schemas.microsoft.com/office/word/2016/wordml/cid" xmlns:w16="http://schemas.microsoft.com/office/word/2018/wordml" xmlns:w16du="http://schemas.microsoft.com/office/word/2023/wordml/word16du" xmlns:w16sdtdh="http://schemas.microsoft.com/office/word/2020/wordml/sdtdatahash" xmlns:w16se="http://schemas.microsoft.com/office/word/2015/wordml/symex" xmlns:wpi="http://schemas.microsoft.com/office/word/2010/wordprocessingInk" xmlns:wne="http://schemas.microsoft.com/office/word/2006/wordml" mc:Ignorable="w14 w15 w16se w16cid w16 w16cex w16sdtdh w16du wne wp14" w:conformance="strict">
   <w:body>
     <w:p>
       <w:pPr>
@@ -301,7 +301,7 @@
     </w:p>
     <w:p>
       <w:pPr>
-        <w:pStyle w:val="1"/>
+        <w:pStyle w:val="Heading1"/>
       </w:pPr>
       <w:r>
         <w:t>Introduction</w:t>
@@ -309,7 +309,7 @@
     </w:p>
     <w:p>
       <w:pPr>
-        <w:pStyle w:val="a3"/>
+        <w:pStyle w:val="BodyText"/>
       </w:pPr>
       <w:r>
         <w:t>Falls are a serious concern for individuals of all ages, but they pose a particular risk to older adults. The consequences of a fall can range from minor injuries to life-threatening complications.</w:t>
@@ -389,7 +389,7 @@
     </w:p>
     <w:p>
       <w:pPr>
-        <w:pStyle w:val="a3"/>
+        <w:pStyle w:val="BodyText"/>
         <w:rPr>
           <w:lang w:val="en-AU"/>
         </w:rPr>
@@ -421,7 +421,7 @@
     </w:p>
     <w:p>
       <w:pPr>
-        <w:pStyle w:val="2"/>
+        <w:pStyle w:val="Heading2"/>
         <w:tabs>
           <w:tab w:val="clear" w:pos="18pt"/>
           <w:tab w:val="num" w:pos="14.40pt"/>
@@ -433,7 +433,7 @@
     </w:p>
     <w:p>
       <w:pPr>
-        <w:pStyle w:val="a3"/>
+        <w:pStyle w:val="BodyText"/>
       </w:pPr>
       <w:r>
         <w:rPr>
@@ -637,7 +637,7 @@
     </w:p>
     <w:p>
       <w:pPr>
-        <w:pStyle w:val="2"/>
+        <w:pStyle w:val="Heading2"/>
         <w:tabs>
           <w:tab w:val="clear" w:pos="18pt"/>
           <w:tab w:val="num" w:pos="14.40pt"/>
@@ -649,7 +649,7 @@
     </w:p>
     <w:p>
       <w:pPr>
-        <w:pStyle w:val="a3"/>
+        <w:pStyle w:val="BodyText"/>
       </w:pPr>
       <w:r>
         <w:rPr>
@@ -780,7 +780,7 @@
     </w:p>
     <w:p>
       <w:pPr>
-        <w:pStyle w:val="2"/>
+        <w:pStyle w:val="Heading2"/>
         <w:tabs>
           <w:tab w:val="clear" w:pos="18pt"/>
           <w:tab w:val="num" w:pos="14.40pt"/>
@@ -792,7 +792,7 @@
     </w:p>
     <w:p>
       <w:pPr>
-        <w:pStyle w:val="a3"/>
+        <w:pStyle w:val="BodyText"/>
         <w:rPr>
           <w:lang w:val="en-AU"/>
         </w:rPr>
@@ -926,28 +926,28 @@
     </w:p>
     <w:p>
       <w:pPr>
-        <w:pStyle w:val="a3"/>
-        <w:rPr>
-          <w:lang w:val="en-AU"/>
-        </w:rPr>
-      </w:pPr>
-      <w:r>
-        <w:rPr>
-          <w:lang w:val="en-AU"/>
-        </w:rPr>
-        <w:t xml:space="preserve">It's important to note that the choice of algorithm depends on factors such as desired accuracy, computational resources, user preferences, and the specific environment where the </w:t>
+        <w:pStyle w:val="BodyText"/>
+        <w:rPr>
+          <w:lang w:val="en-AU"/>
+        </w:rPr>
+      </w:pPr>
+      <w:r>
+        <w:rPr>
+          <w:lang w:val="en-AU"/>
+        </w:rPr>
+        <w:t xml:space="preserve">It's important to note that the choice of algorithm depends on factors such as desired accuracy, computational resources, </w:t>
       </w:r>
       <w:r>
         <w:rPr>
           <w:lang w:val="en-AU"/>
         </w:rPr>
         <w:lastRenderedPageBreak/>
-        <w:t>system will be deployed. Additionally, many systems combine multiple algorithm types to improve overall performance and robustness.</w:t>
-      </w:r>
-    </w:p>
-    <w:p>
-      <w:pPr>
-        <w:pStyle w:val="a3"/>
+        <w:t>user preferences, and the specific environment where the system will be deployed. Additionally, many systems combine multiple algorithm types to improve overall performance and robustness.</w:t>
+      </w:r>
+    </w:p>
+    <w:p>
+      <w:pPr>
+        <w:pStyle w:val="BodyText"/>
         <w:rPr>
           <w:lang w:val="en-AU"/>
         </w:rPr>
@@ -1323,7 +1323,7 @@
     </w:p>
     <w:p>
       <w:pPr>
-        <w:pStyle w:val="a3"/>
+        <w:pStyle w:val="BodyText"/>
         <w:rPr>
           <w:lang w:val="en-AU"/>
         </w:rPr>
@@ -1363,7 +1363,7 @@
     </w:p>
     <w:p>
       <w:pPr>
-        <w:pStyle w:val="1"/>
+        <w:pStyle w:val="Heading1"/>
       </w:pPr>
       <w:r>
         <w:t>M</w:t>
@@ -1374,7 +1374,42 @@
     </w:p>
     <w:p>
       <w:pPr>
-        <w:pStyle w:val="2"/>
+        <w:pStyle w:val="BodyText"/>
+        <w:rPr>
+          <w:lang w:val="en-US"/>
+        </w:rPr>
+      </w:pPr>
+      <w:r>
+        <w:t xml:space="preserve">In this section we will start with the dataset, although </w:t>
+      </w:r>
+      <w:r>
+        <w:rPr>
+          <w:lang w:val="en-AU" w:eastAsia="zh-CN"/>
+        </w:rPr>
+        <w:t xml:space="preserve">WEDA-FALL </w:t>
+      </w:r>
+      <w:r>
+        <w:rPr>
+          <w:lang w:val="en-AU" w:eastAsia="zh-CN"/>
+        </w:rPr>
+        <w:t>is ideal comparing to other datasets, the diversity of movements make some data very similar to fall, such as D05, ‘attempt to get up and collapse into a chair’</w:t>
+      </w:r>
+      <w:r>
+        <w:rPr>
+          <w:lang w:val="en-US"/>
+        </w:rPr>
+        <w:t>, so training data for 1D-CNN should be chosen carefully</w:t>
+      </w:r>
+      <w:r>
+        <w:rPr>
+          <w:lang w:val="en-US"/>
+        </w:rPr>
+        <w:t xml:space="preserve">, then how the data are fed to the algorithm is elaborated.  </w:t>
+      </w:r>
+    </w:p>
+    <w:p>
+      <w:pPr>
+        <w:pStyle w:val="Heading2"/>
         <w:tabs>
           <w:tab w:val="clear" w:pos="18pt"/>
           <w:tab w:val="num" w:pos="14.40pt"/>
@@ -1386,40 +1421,358 @@
     </w:p>
     <w:p>
       <w:pPr>
-        <w:pStyle w:val="a3"/>
-      </w:pPr>
-      <w:r>
-        <w:t xml:space="preserve">First, confirm that you have the correct template for your paper size. This template has been tailored for output on the </w:t>
+        <w:pStyle w:val="BodyText"/>
+        <w:rPr>
+          <w:rFonts w:hint="eastAsia"/>
+          <w:lang w:val="en-US" w:eastAsia="zh-CN"/>
+        </w:rPr>
+      </w:pPr>
+      <w:r>
+        <w:t xml:space="preserve">First, </w:t>
+      </w:r>
+      <w:r>
+        <w:t>the typical fall pattern is presented in Figure 1</w:t>
+      </w:r>
+      <w:r>
+        <w:t>.</w:t>
+      </w:r>
+      <w:r>
+        <w:t xml:space="preserve"> Roughly the process of fall can be divided into 4 stages, which</w:t>
       </w:r>
       <w:r>
         <w:rPr>
           <w:lang w:val="en-US"/>
         </w:rPr>
-        <w:t>A4</w:t>
-      </w:r>
-      <w:r>
-        <w:t xml:space="preserve"> paper size. If you are using </w:t>
-      </w:r>
-      <w:r>
-        <w:rPr>
-          <w:lang w:val="en-US"/>
-        </w:rPr>
-        <w:t>US letter</w:t>
-      </w:r>
-      <w:r>
-        <w:t>-sized paper, please close this</w:t>
-      </w:r>
-      <w:r>
-        <w:t xml:space="preserve"> file and download the </w:t>
-      </w:r>
-      <w:r>
-        <w:rPr>
-          <w:lang w:val="en-US"/>
-        </w:rPr>
-        <w:t xml:space="preserve">Microsoft Word, Letter </w:t>
-      </w:r>
-      <w:r>
-        <w:t>file</w:t>
+        <w:t xml:space="preserve"> are pre-fall, fall, ground, and rebound. Data of Figure 1 is </w:t>
+      </w:r>
+      <w:r>
+        <w:rPr>
+          <w:rFonts w:hint="eastAsia"/>
+          <w:lang w:val="en-US" w:eastAsia="zh-CN"/>
+        </w:rPr>
+        <w:t>extracted from 10kz/F01/U01</w:t>
+      </w:r>
+      <w:r>
+        <w:rPr>
+          <w:rFonts w:hint="eastAsia"/>
+          <w:lang w:val="en-US" w:eastAsia="zh-CN"/>
+        </w:rPr>
+        <w:t xml:space="preserve">, according to </w:t>
+      </w:r>
+      <w:r>
+        <w:rPr>
+          <w:lang w:val="en-US" w:eastAsia="zh-CN"/>
+        </w:rPr>
+        <w:t>explanation</w:t>
+      </w:r>
+      <w:r>
+        <w:rPr>
+          <w:rFonts w:hint="eastAsia"/>
+          <w:lang w:val="en-US" w:eastAsia="zh-CN"/>
+        </w:rPr>
+        <w:t xml:space="preserve"> from authors, it is a young man </w:t>
+      </w:r>
+      <w:r>
+        <w:rPr>
+          <w:lang w:val="en-US" w:eastAsia="zh-CN"/>
+        </w:rPr>
+        <w:t>“</w:t>
+      </w:r>
+      <w:r>
+        <w:rPr>
+          <w:lang w:val="en-US" w:eastAsia="zh-CN"/>
+        </w:rPr>
+        <w:t>Fall forward while walking caused by a slip</w:t>
+      </w:r>
+      <w:r>
+        <w:rPr>
+          <w:lang w:val="en-US" w:eastAsia="zh-CN"/>
+        </w:rPr>
+        <w:t>”</w:t>
+      </w:r>
+      <w:r>
+        <w:rPr>
+          <w:rFonts w:hint="eastAsia"/>
+          <w:lang w:val="en-US" w:eastAsia="zh-CN"/>
+        </w:rPr>
+        <w:t xml:space="preserve">, the data resolution is 10kz, 10 times a second. </w:t>
+      </w:r>
+      <w:r>
+        <w:rPr>
+          <w:lang w:val="en-US" w:eastAsia="zh-CN"/>
+        </w:rPr>
+        <w:t>T</w:t>
+      </w:r>
+      <w:r>
+        <w:rPr>
+          <w:rFonts w:hint="eastAsia"/>
+          <w:lang w:val="en-US" w:eastAsia="zh-CN"/>
+        </w:rPr>
+        <w:t xml:space="preserve">he </w:t>
+      </w:r>
+      <w:r>
+        <w:rPr>
+          <w:rFonts w:hint="eastAsia"/>
+          <w:lang w:val="en-US" w:eastAsia="zh-CN"/>
+        </w:rPr>
+        <w:t xml:space="preserve">x-axis </w:t>
+      </w:r>
+      <w:r>
+        <w:rPr>
+          <w:rFonts w:hint="eastAsia"/>
+          <w:lang w:val="en-US" w:eastAsia="zh-CN"/>
+        </w:rPr>
+        <w:t xml:space="preserve">is time, </w:t>
+      </w:r>
+      <w:r>
+        <w:rPr>
+          <w:rFonts w:hint="eastAsia"/>
+          <w:lang w:val="en-US" w:eastAsia="zh-CN"/>
+        </w:rPr>
+        <w:t>unit of</w:t>
+      </w:r>
+      <w:r>
+        <w:rPr>
+          <w:rFonts w:hint="eastAsia"/>
+          <w:lang w:val="en-US" w:eastAsia="zh-CN"/>
+        </w:rPr>
+        <w:t xml:space="preserve"> it</w:t>
+      </w:r>
+      <w:r>
+        <w:rPr>
+          <w:rFonts w:hint="eastAsia"/>
+          <w:lang w:val="en-US" w:eastAsia="zh-CN"/>
+        </w:rPr>
+        <w:t xml:space="preserve"> is 1/10 second and y-axis is </w:t>
+      </w:r>
+      <w:r>
+        <w:rPr>
+          <w:rFonts w:hint="eastAsia"/>
+          <w:lang w:val="en-US" w:eastAsia="zh-CN"/>
+        </w:rPr>
+        <w:t>combined acceleration</w:t>
+      </w:r>
+      <w:r>
+        <w:rPr>
+          <w:rFonts w:hint="eastAsia"/>
+          <w:lang w:val="en-US" w:eastAsia="zh-CN"/>
+        </w:rPr>
+        <w:t xml:space="preserve"> (CA)</w:t>
+      </w:r>
+      <w:r>
+        <w:rPr>
+          <w:rFonts w:hint="eastAsia"/>
+          <w:lang w:val="en-US" w:eastAsia="zh-CN"/>
+        </w:rPr>
+        <w:t xml:space="preserve"> of 3-axis, unit is </w:t>
+      </w:r>
+      <w:r>
+        <w:rPr>
+          <w:rFonts w:hint="eastAsia"/>
+          <w:i/>
+          <w:iCs/>
+          <w:lang w:val="en-US" w:eastAsia="zh-CN"/>
+        </w:rPr>
+        <w:t>g</w:t>
+      </w:r>
+      <w:r>
+        <w:rPr>
+          <w:rFonts w:hint="eastAsia"/>
+          <w:lang w:val="en-US" w:eastAsia="zh-CN"/>
+        </w:rPr>
+        <w:t xml:space="preserve"> </w:t>
+      </w:r>
+      <w:r>
+        <w:rPr>
+          <w:rFonts w:hint="eastAsia"/>
+          <w:lang w:val="en-US" w:eastAsia="zh-CN"/>
+        </w:rPr>
+        <w:t xml:space="preserve">which </w:t>
+      </w:r>
+      <w:r>
+        <w:rPr>
+          <w:rFonts w:hint="eastAsia"/>
+          <w:lang w:val="en-US" w:eastAsia="zh-CN"/>
+        </w:rPr>
+        <w:t xml:space="preserve">is </w:t>
+      </w:r>
+      <w:r>
+        <w:rPr>
+          <w:lang w:val="en-US" w:eastAsia="zh-CN"/>
+        </w:rPr>
+        <w:t>Gravity acceleration</w:t>
+      </w:r>
+      <w:r>
+        <w:rPr>
+          <w:rFonts w:hint="eastAsia"/>
+          <w:lang w:val="en-US" w:eastAsia="zh-CN"/>
+        </w:rPr>
+        <w:t xml:space="preserve">. </w:t>
+      </w:r>
+      <w:r>
+        <w:rPr>
+          <w:lang w:val="en-US" w:eastAsia="zh-CN"/>
+        </w:rPr>
+        <w:t>T</w:t>
+      </w:r>
+      <w:r>
+        <w:rPr>
+          <w:rFonts w:hint="eastAsia"/>
+          <w:lang w:val="en-US" w:eastAsia="zh-CN"/>
+        </w:rPr>
+        <w:t xml:space="preserve">he red line in Figure 1 is the standard </w:t>
+      </w:r>
+      <w:r>
+        <w:rPr>
+          <w:rFonts w:hint="eastAsia"/>
+          <w:lang w:val="en-US" w:eastAsia="zh-CN"/>
+        </w:rPr>
+        <w:t>gravity acceleration, when people are walking normally or standing still the</w:t>
+      </w:r>
+      <w:r>
+        <w:rPr>
+          <w:rFonts w:hint="eastAsia"/>
+          <w:lang w:val="en-US" w:eastAsia="zh-CN"/>
+        </w:rPr>
+        <w:t xml:space="preserve"> CA is around </w:t>
+      </w:r>
+      <w:r>
+        <w:rPr>
+          <w:rFonts w:hint="eastAsia"/>
+          <w:i/>
+          <w:iCs/>
+          <w:lang w:val="en-US" w:eastAsia="zh-CN"/>
+        </w:rPr>
+        <w:t>g</w:t>
+      </w:r>
+      <w:r>
+        <w:rPr>
+          <w:rFonts w:hint="eastAsia"/>
+          <w:lang w:val="en-US" w:eastAsia="zh-CN"/>
+        </w:rPr>
+        <w:t xml:space="preserve">. </w:t>
+      </w:r>
+      <w:r>
+        <w:rPr>
+          <w:rFonts w:hint="eastAsia"/>
+          <w:lang w:val="en-US" w:eastAsia="zh-CN"/>
+        </w:rPr>
+        <w:t xml:space="preserve"> </w:t>
+      </w:r>
+      <w:r>
+        <w:rPr>
+          <w:rFonts w:hint="eastAsia"/>
+          <w:lang w:val="en-US" w:eastAsia="zh-CN"/>
+        </w:rPr>
+        <w:t>The red circle at the bottom of Figure 1 is the moment of falling, the person</w:t>
+      </w:r>
+      <w:r>
+        <w:rPr>
+          <w:lang w:val="en-US" w:eastAsia="zh-CN"/>
+        </w:rPr>
+        <w:t xml:space="preserve"> </w:t>
+      </w:r>
+      <w:r>
+        <w:rPr>
+          <w:rFonts w:hint="eastAsia"/>
+          <w:lang w:val="en-US" w:eastAsia="zh-CN"/>
+        </w:rPr>
+        <w:t xml:space="preserve">is </w:t>
+      </w:r>
+      <w:r>
+        <w:rPr>
+          <w:lang w:val="en-US" w:eastAsia="zh-CN"/>
+        </w:rPr>
+        <w:t>in a state of near weightlessness</w:t>
+      </w:r>
+      <w:r>
+        <w:rPr>
+          <w:rFonts w:hint="eastAsia"/>
+          <w:lang w:val="en-US" w:eastAsia="zh-CN"/>
+        </w:rPr>
+        <w:t>, then touching ground in the upper red circle, the</w:t>
+      </w:r>
+      <w:r>
+        <w:rPr>
+          <w:rFonts w:hint="eastAsia"/>
+          <w:lang w:val="en-US" w:eastAsia="zh-CN"/>
+        </w:rPr>
+        <w:t xml:space="preserve"> </w:t>
+      </w:r>
+      <w:r>
+        <w:rPr>
+          <w:lang w:val="en-US" w:eastAsia="zh-CN"/>
+        </w:rPr>
+        <w:t>greater the acceleration, the heavier the fall</w:t>
+      </w:r>
+      <w:r>
+        <w:rPr>
+          <w:rFonts w:hint="eastAsia"/>
+          <w:lang w:val="en-US" w:eastAsia="zh-CN"/>
+        </w:rPr>
+        <w:t>, which is followed by several rebound.</w:t>
+      </w:r>
+    </w:p>
+    <w:p>
+      <w:pPr>
+        <w:pStyle w:val="BodyText"/>
+      </w:pPr>
+      <w:r>
+        <w:rPr>
+          <w:noProof/>
+        </w:rPr>
+        <w:drawing>
+          <wp:inline distT="0" distB="0" distL="0" distR="0" wp14:anchorId="36FCBB51" wp14:editId="3644DE68">
+            <wp:extent cx="2827583" cy="1607875"/>
+            <wp:effectExtent l="0" t="0" r="5080" b="5080"/>
+            <wp:docPr id="481849505" name="Picture 1"/>
+            <wp:cNvGraphicFramePr>
+              <a:graphicFrameLocks xmlns:a="http://purl.oclc.org/ooxml/drawingml/main" noChangeAspect="1"/>
+            </wp:cNvGraphicFramePr>
+            <a:graphic xmlns:a="http://purl.oclc.org/ooxml/drawingml/main">
+              <a:graphicData uri="http://purl.oclc.org/ooxml/drawingml/picture">
+                <pic:pic xmlns:pic="http://purl.oclc.org/ooxml/drawingml/picture">
+                  <pic:nvPicPr>
+                    <pic:cNvPr id="481849505" name=""/>
+                    <pic:cNvPicPr/>
+                  </pic:nvPicPr>
+                  <pic:blipFill>
+                    <a:blip r:embed="rId9"/>
+                    <a:stretch>
+                      <a:fillRect/>
+                    </a:stretch>
+                  </pic:blipFill>
+                  <pic:spPr>
+                    <a:xfrm>
+                      <a:off x="0" y="0"/>
+                      <a:ext cx="2847910" cy="1619434"/>
+                    </a:xfrm>
+                    <a:prstGeom prst="rect">
+                      <a:avLst/>
+                    </a:prstGeom>
+                  </pic:spPr>
+                </pic:pic>
+              </a:graphicData>
+            </a:graphic>
+          </wp:inline>
+        </w:drawing>
+      </w:r>
+    </w:p>
+    <w:p>
+      <w:pPr>
+        <w:pStyle w:val="figurecaption"/>
+      </w:pPr>
+      <w:r>
+        <w:t>P</w:t>
+      </w:r>
+      <w:r>
+        <w:t>attern</w:t>
+      </w:r>
+      <w:r>
+        <w:t xml:space="preserve"> of </w:t>
+      </w:r>
+      <w:r>
+        <w:t>fall</w:t>
       </w:r>
       <w:r>
         <w:t>.</w:t>
@@ -1427,7 +1780,12 @@
     </w:p>
     <w:p>
       <w:pPr>
-        <w:pStyle w:val="2"/>
+        <w:pStyle w:val="BodyText"/>
+      </w:pPr>
+    </w:p>
+    <w:p>
+      <w:pPr>
+        <w:pStyle w:val="Heading2"/>
       </w:pPr>
       <w:r>
         <w:t>CNN</w:t>
@@ -1435,7 +1793,7 @@
     </w:p>
     <w:p>
       <w:pPr>
-        <w:pStyle w:val="a3"/>
+        <w:pStyle w:val="BodyText"/>
       </w:pPr>
       <w:r>
         <w:t>Convolutional neural networks (CNNs) are a type of deep learning architecture particularly well-suited for processing and analyzing spatial data, such as images. CNNs consist of multiple layers that perform convolution, pooling, and fully connected operations to extract relevant features from the input data. The convolutional layers apply filters to local regions of the input, allowing the network to learn spatial patterns. The pooling layers then reduce the spatial dimensions of the feature maps, while the fully connected layers perform classification or regression tasks based on the extracted features. For time-series data like sensor readings, a 1D-CNN architecture is more appropriate, as it operates on 1-dimensional sequences rather than 2D images. 1D-CNNs are able to effectively capture the temporal patterns in sensor data, making them a suitable choice for the fall detection task at hand, where the sensor readings exhibit characteristic patterns associated with fall events.</w:t>
@@ -1443,7 +1801,7 @@
     </w:p>
     <w:p>
       <w:pPr>
-        <w:pStyle w:val="a3"/>
+        <w:pStyle w:val="BodyText"/>
         <w:jc w:val="center"/>
         <w:rPr>
           <w:lang w:val="en-US"/>
@@ -1472,7 +1830,7 @@
                     </pic:cNvPicPr>
                   </pic:nvPicPr>
                   <pic:blipFill>
-                    <a:blip r:embed="rId9">
+                    <a:blip r:embed="rId10">
                       <a:extLst>
                         <a:ext uri="{28A0092B-C50C-407E-A947-70E740481C1C}">
                           <a14:useLocalDpi xmlns:a14="http://schemas.microsoft.com/office/drawing/2010/main" val="0"/>
@@ -1529,7 +1887,7 @@
     </w:p>
     <w:p>
       <w:pPr>
-        <w:pStyle w:val="a3"/>
+        <w:pStyle w:val="BodyText"/>
         <w:jc w:val="center"/>
         <w:rPr>
           <w:lang w:val="en-US"/>
@@ -1538,7 +1896,7 @@
     </w:p>
     <w:p>
       <w:pPr>
-        <w:pStyle w:val="2"/>
+        <w:pStyle w:val="Heading2"/>
         <w:tabs>
           <w:tab w:val="clear" w:pos="18pt"/>
           <w:tab w:val="num" w:pos="14.40pt"/>
@@ -1550,7 +1908,7 @@
     </w:p>
     <w:p>
       <w:pPr>
-        <w:pStyle w:val="2"/>
+        <w:pStyle w:val="Heading2"/>
         <w:tabs>
           <w:tab w:val="clear" w:pos="18pt"/>
           <w:tab w:val="num" w:pos="14.40pt"/>
@@ -1562,7 +1920,7 @@
     </w:p>
     <w:p>
       <w:pPr>
-        <w:pStyle w:val="1"/>
+        <w:pStyle w:val="Heading1"/>
       </w:pPr>
       <w:r>
         <w:t>Results</w:t>
@@ -1570,7 +1928,7 @@
     </w:p>
     <w:p>
       <w:pPr>
-        <w:pStyle w:val="a3"/>
+        <w:pStyle w:val="BodyText"/>
         <w:rPr>
           <w:lang w:val="en-US"/>
         </w:rPr>
@@ -1590,7 +1948,7 @@
     </w:p>
     <w:p>
       <w:pPr>
-        <w:pStyle w:val="a3"/>
+        <w:pStyle w:val="BodyText"/>
       </w:pPr>
       <w:r>
         <w:t>Keep your text and graphic files separate until after the text has been formatted and styled. Do not use hard tabs, and limit use of hard returns to only one return at the end of a paragraph. Do not add any kind of pagination anywhere in the paper. Do not number text heads-the template will do that for you.</w:t>
@@ -1598,7 +1956,7 @@
     </w:p>
     <w:p>
       <w:pPr>
-        <w:pStyle w:val="2"/>
+        <w:pStyle w:val="Heading2"/>
       </w:pPr>
       <w:r>
         <w:t>Abbreviations</w:t>
@@ -1609,10 +1967,14 @@
     </w:p>
     <w:p>
       <w:pPr>
-        <w:pStyle w:val="a3"/>
-      </w:pPr>
-      <w:r>
-        <w:t xml:space="preserve">Define abbreviations and acronyms the first time they are used in the text, even after they have been defined in the abstract. Abbreviations such as IEEE, SI, MKS, CGS, </w:t>
+        <w:pStyle w:val="BodyText"/>
+      </w:pPr>
+      <w:r>
+        <w:t xml:space="preserve">Define abbreviations and acronyms the first time they are used in the text, even after they have been defined in the </w:t>
+      </w:r>
+      <w:r>
+        <w:lastRenderedPageBreak/>
+        <w:t xml:space="preserve">abstract. Abbreviations such as IEEE, SI, MKS, CGS, </w:t>
       </w:r>
       <w:proofErr w:type="spellStart"/>
       <w:r>
@@ -1625,7 +1987,7 @@
     </w:p>
     <w:p>
       <w:pPr>
-        <w:pStyle w:val="2"/>
+        <w:pStyle w:val="Heading2"/>
       </w:pPr>
       <w:r>
         <w:t>Units</w:t>
@@ -1716,7 +2078,7 @@
     </w:p>
     <w:p>
       <w:pPr>
-        <w:pStyle w:val="2"/>
+        <w:pStyle w:val="Heading2"/>
       </w:pPr>
       <w:r>
         <w:t>Equations</w:t>
@@ -1724,7 +2086,7 @@
     </w:p>
     <w:p>
       <w:pPr>
-        <w:pStyle w:val="a3"/>
+        <w:pStyle w:val="BodyText"/>
       </w:pPr>
       <w:r>
         <w:t>The equations are an exception to the prescribed specifications of this template. You will need to determine whether or not your equation should be typed using either the Times New Roman or the Symbol font (please no other font). To create multileveled equations, it may be necessary to treat the equation as a graphic and insert it into the text after your paper is styled.</w:t>
@@ -1732,13 +2094,12 @@
     </w:p>
     <w:p>
       <w:pPr>
-        <w:pStyle w:val="a3"/>
+        <w:pStyle w:val="BodyText"/>
         <w:rPr>
           <w:lang w:val="en-US"/>
         </w:rPr>
       </w:pPr>
       <w:r>
-        <w:lastRenderedPageBreak/>
         <w:t>Number equations consecutively. Equation numbers, within parentheses, are to position flush right, as in (1), using a right tab stop. To make your equations more compact, you may use the solidus ( / ), the exp function, or appropriate exponents. Italicize Roman symbols for quantities and variables, but not Greek symbols. Use a long dash rather than a hyphen for a minus sign. Punctuate equations with commas or periods when they are part of a sentence, as in</w:t>
       </w:r>
       <w:r>
@@ -1751,6 +2112,9 @@
     <w:p>
       <w:pPr>
         <w:pStyle w:val="equation"/>
+        <w:rPr>
+          <w:rFonts w:hint="eastAsia"/>
+        </w:rPr>
       </w:pPr>
       <w:r>
         <w:tab/>
@@ -1808,7 +2172,7 @@
     </w:p>
     <w:p>
       <w:pPr>
-        <w:pStyle w:val="a3"/>
+        <w:pStyle w:val="BodyText"/>
       </w:pPr>
       <w:r>
         <w:t>Note that the equation is centered using a center tab stop. Be sure that the symbols in your equation have been defined before or immediately following the equation. Use “(1)”, not “Eq. (1)” or “equation (1)”, except at the beginning of a sentence: “Equation (1) is . . .”</w:t>
@@ -1816,7 +2180,7 @@
     </w:p>
     <w:p>
       <w:pPr>
-        <w:pStyle w:val="2"/>
+        <w:pStyle w:val="Heading2"/>
       </w:pPr>
       <w:r>
         <w:t>Some Common Mistakes</w:t>
@@ -1867,7 +2231,10 @@
         <w:t>English, commas, semi</w:t>
       </w:r>
       <w:r>
-        <w:t>colons, periods, question and exclamation marks are located within quotation marks only when a complete thought or name is cited, such as a title or full quotation. When quotation marks are used, instead of a bold or italic typeface, to highlight a word or phrase, punctuation should appear outside of the quotation marks. A parenthetical phrase or statement at the end of a sentence is punctuated outside of the closing parenthesis (like this). (A parenthetical sentence is punctuated within the parentheses.)</w:t>
+        <w:t xml:space="preserve">colons, periods, question and exclamation marks are located within quotation marks only when a complete thought or name is cited, such as a title or full quotation. When quotation marks are used, instead of a bold or italic typeface, to highlight a word or phrase, punctuation should appear outside of the quotation marks. A parenthetical phrase or statement at the end of a </w:t>
+      </w:r>
+      <w:r>
+        <w:t>sentence is punctuated outside of the closing parenthesis (like this). (A parenthetical sentence is punctuated within the parentheses.)</w:t>
       </w:r>
     </w:p>
     <w:p>
@@ -1936,7 +2303,7 @@
     </w:p>
     <w:p>
       <w:pPr>
-        <w:pStyle w:val="a3"/>
+        <w:pStyle w:val="BodyText"/>
       </w:pPr>
       <w:r>
         <w:t>An excellent style manual for science writers is [7].</w:t>
@@ -1944,7 +2311,7 @@
     </w:p>
     <w:p>
       <w:pPr>
-        <w:pStyle w:val="1"/>
+        <w:pStyle w:val="Heading1"/>
       </w:pPr>
       <w:r>
         <w:t>Conclusions</w:t>
@@ -1952,18 +2319,15 @@
     </w:p>
     <w:p>
       <w:pPr>
-        <w:pStyle w:val="a3"/>
-      </w:pPr>
-      <w:r>
-        <w:t xml:space="preserve">After the text edit has been completed, the paper is ready for the template. Duplicate the template file by using the Save </w:t>
-      </w:r>
-      <w:r>
-        <w:t>As command, and use the naming convention prescribed by your conference for the name of your paper. In this newly created file, highlight all of the contents and import your prepared text file. You are now ready to style your paper; use the scroll down window on the left of the MS Word Formatting toolbar.</w:t>
-      </w:r>
-    </w:p>
-    <w:p>
-      <w:pPr>
-        <w:pStyle w:val="2"/>
+        <w:pStyle w:val="BodyText"/>
+      </w:pPr>
+      <w:r>
+        <w:t>After the text edit has been completed, the paper is ready for the template. Duplicate the template file by using the Save As command, and use the naming convention prescribed by your conference for the name of your paper. In this newly created file, highlight all of the contents and import your prepared text file. You are now ready to style your paper; use the scroll down window on the left of the MS Word Formatting toolbar.</w:t>
+      </w:r>
+    </w:p>
+    <w:p>
+      <w:pPr>
+        <w:pStyle w:val="Heading2"/>
       </w:pPr>
       <w:r>
         <w:t>Authors</w:t>
@@ -1974,7 +2338,7 @@
     </w:p>
     <w:p>
       <w:pPr>
-        <w:pStyle w:val="a3"/>
+        <w:pStyle w:val="BodyText"/>
       </w:pPr>
       <w:r>
         <w:rPr>
@@ -2062,7 +2426,7 @@
     </w:p>
     <w:p>
       <w:pPr>
-        <w:pStyle w:val="3"/>
+        <w:pStyle w:val="Heading3"/>
       </w:pPr>
       <w:r>
         <w:t xml:space="preserve">For papers with more than six authors: </w:t>
@@ -2076,7 +2440,7 @@
     </w:p>
     <w:p>
       <w:pPr>
-        <w:pStyle w:val="3"/>
+        <w:pStyle w:val="Heading3"/>
       </w:pPr>
       <w:r>
         <w:t xml:space="preserve">For </w:t>
@@ -2102,7 +2466,7 @@
     </w:p>
     <w:p>
       <w:pPr>
-        <w:pStyle w:val="4"/>
+        <w:pStyle w:val="Heading4"/>
       </w:pPr>
       <w:r>
         <w:t>Selection</w:t>
@@ -2119,7 +2483,7 @@
     </w:p>
     <w:p>
       <w:pPr>
-        <w:pStyle w:val="4"/>
+        <w:pStyle w:val="Heading4"/>
       </w:pPr>
       <w:r>
         <w:t>Change number of columns:</w:t>
@@ -2148,7 +2512,7 @@
     </w:p>
     <w:p>
       <w:pPr>
-        <w:pStyle w:val="4"/>
+        <w:pStyle w:val="Heading4"/>
         <w:rPr>
           <w:i w:val="0"/>
         </w:rPr>
@@ -2181,9 +2545,10 @@
     </w:p>
     <w:p>
       <w:pPr>
-        <w:pStyle w:val="2"/>
-      </w:pPr>
-      <w:r>
+        <w:pStyle w:val="Heading2"/>
+      </w:pPr>
+      <w:r>
+        <w:lastRenderedPageBreak/>
         <w:t>Identify</w:t>
       </w:r>
       <w:r>
@@ -2192,7 +2557,7 @@
     </w:p>
     <w:p>
       <w:pPr>
-        <w:pStyle w:val="a3"/>
+        <w:pStyle w:val="BodyText"/>
       </w:pPr>
       <w:r>
         <w:t>Headings, or heads, are organizational devices that guide the reader through your paper. There are two types: component heads and text heads.</w:t>
@@ -2200,7 +2565,7 @@
     </w:p>
     <w:p>
       <w:pPr>
-        <w:pStyle w:val="a3"/>
+        <w:pStyle w:val="BodyText"/>
       </w:pPr>
       <w:r>
         <w:t>Component heads identify the different components of your paper and are not topically subordinate to each other. Examples include Acknowledgments and References and, for these, the correct style to use is “Heading 5”. Use “figure caption” for your Figure captions, and “table head” for your table title. Run-in heads, such as “Abstract”, will require you to apply a style (in this case, italic) in addition to the style provided by the drop down menu to differentiate the head from the text.</w:t>
@@ -2208,7 +2573,7 @@
     </w:p>
     <w:p>
       <w:pPr>
-        <w:pStyle w:val="a3"/>
+        <w:pStyle w:val="BodyText"/>
       </w:pPr>
       <w:r>
         <w:t>Text heads organize the topics on a relational, hierarchical basis. For example, the paper title is the primary text head because all subsequent material relates and elaborates on this one topic. If there are two or more sub-topics, the next level head (uppercase Roman numerals) should be used and, conversely, if there are not at least two sub-topics, then no subheads should be introduced. Styles named “Heading 1”, “Heading 2”, “Heading 3”, and “Heading 4” are prescribed.</w:t>
@@ -2216,7 +2581,7 @@
     </w:p>
     <w:p>
       <w:pPr>
-        <w:pStyle w:val="2"/>
+        <w:pStyle w:val="Heading2"/>
       </w:pPr>
       <w:r>
         <w:t>Figures and Tables</w:t>
@@ -2224,7 +2589,7 @@
     </w:p>
     <w:p>
       <w:pPr>
-        <w:pStyle w:val="4"/>
+        <w:pStyle w:val="Heading4"/>
       </w:pPr>
       <w:r>
         <w:t xml:space="preserve"> </w:t>
@@ -2286,7 +2651,6 @@
               <w:pStyle w:val="tablecolhead"/>
             </w:pPr>
             <w:r>
-              <w:lastRenderedPageBreak/>
               <w:t>Table Head</w:t>
             </w:r>
           </w:p>
@@ -2517,7 +2881,7 @@
     </w:p>
     <w:p>
       <w:pPr>
-        <w:pStyle w:val="a3"/>
+        <w:pStyle w:val="BodyText"/>
       </w:pPr>
       <w:r>
         <w:t>Figure Labels: Use 8 point Times New Roman for Figure labels. Use words rather than symbols or abbreviations when writing Figure axis labels to avoid confusing the reader. As an example, write the quantity “Magnetization”, or “Magnetization, M”, not just “M”. If including units in the label, present them within parentheses. Do not label axes only with units. In the example, write “Magnetization (A/m)” or “Magnetization {A[m(1)]}”, not just “A/m”. Do not label axes</w:t>
@@ -2531,7 +2895,7 @@
     </w:p>
     <w:p>
       <w:pPr>
-        <w:pStyle w:val="5"/>
+        <w:pStyle w:val="Heading5"/>
       </w:pPr>
       <w:r>
         <w:t>References</w:t>
@@ -2539,7 +2903,7 @@
     </w:p>
     <w:p>
       <w:pPr>
-        <w:pStyle w:val="a3"/>
+        <w:pStyle w:val="BodyText"/>
       </w:pPr>
       <w:r>
         <w:t>The template will number citations consecutively within brackets [1]. The sentence punctuation follows the bracket [2]. Refer simply to the reference number, as in [3]—do not use “Ref. [3]” or “reference [3]” except at the beginning of a sentence: “Reference [3] was the first</w:t>
@@ -2559,7 +2923,7 @@
     </w:p>
     <w:p>
       <w:pPr>
-        <w:pStyle w:val="a3"/>
+        <w:pStyle w:val="BodyText"/>
       </w:pPr>
       <w:r>
         <w:t>Number footnotes separately in superscripts. Place the actual footnote at the bottom of the column in which it was cited. Do not put footnotes in the</w:t>
@@ -2576,7 +2940,7 @@
     </w:p>
     <w:p>
       <w:pPr>
-        <w:pStyle w:val="a3"/>
+        <w:pStyle w:val="BodyText"/>
       </w:pPr>
       <w:r>
         <w:t>Unless there are six au</w:t>
@@ -2596,7 +2960,7 @@
     </w:p>
     <w:p>
       <w:pPr>
-        <w:pStyle w:val="a3"/>
+        <w:pStyle w:val="BodyText"/>
       </w:pPr>
       <w:r>
         <w:t xml:space="preserve">For </w:t>
@@ -2686,7 +3050,7 @@
         </w:rPr>
         <w:t xml:space="preserve">, vol. 193, p. 110945, Apr. 2022, doi: </w:t>
       </w:r>
-      <w:hyperlink r:id="rId10" w:history="1">
+      <w:hyperlink r:id="rId11" w:history="1">
         <w:r>
           <w:rPr>
             <w:color w:val="0000FF"/>
@@ -2775,10 +3139,10 @@
       <w:r>
         <w:t xml:space="preserve">, vol. 24, no. 2, pp. 524–532, Feb. 2020, doi: </w:t>
       </w:r>
-      <w:hyperlink r:id="rId11" w:history="1">
+      <w:hyperlink r:id="rId12" w:history="1">
         <w:r>
           <w:rPr>
-            <w:rStyle w:val="a9"/>
+            <w:rStyle w:val="Hyperlink"/>
           </w:rPr>
           <w:t>10.1109/JBHI.2019.2907498</w:t>
         </w:r>
@@ -2807,10 +3171,10 @@
       <w:r>
         <w:t xml:space="preserve">, vol. 110, pp. 199–210, May 2015, doi: </w:t>
       </w:r>
-      <w:hyperlink r:id="rId12" w:history="1">
+      <w:hyperlink r:id="rId13" w:history="1">
         <w:r>
           <w:rPr>
-            <w:rStyle w:val="a9"/>
+            <w:rStyle w:val="Hyperlink"/>
           </w:rPr>
           <w:t>10.1016/j.sigpro.2014.08.021</w:t>
         </w:r>
@@ -2839,10 +3203,10 @@
       <w:r>
         <w:t xml:space="preserve">, vol. 20, no. 20, Art. no. 20, Jan. 2020, doi: </w:t>
       </w:r>
-      <w:hyperlink r:id="rId13" w:history="1">
+      <w:hyperlink r:id="rId14" w:history="1">
         <w:r>
           <w:rPr>
-            <w:rStyle w:val="a9"/>
+            <w:rStyle w:val="Hyperlink"/>
           </w:rPr>
           <w:t>10.3390/s20205948</w:t>
         </w:r>
@@ -2954,6 +3318,7 @@
         <w:rPr>
           <w:noProof/>
         </w:rPr>
+        <w:lastRenderedPageBreak/>
         <w:drawing>
           <wp:anchor distT="0" distB="0" distL="114300" distR="114300" simplePos="0" relativeHeight="251657728" behindDoc="1" locked="0" layoutInCell="1" allowOverlap="1" wp14:anchorId="6F75FADA" wp14:editId="1C256606">
             <wp:simplePos x="0" y="0"/>
@@ -3008,7 +3373,7 @@
                     <wne:txbxContent>
                       <w:p>
                         <w:pPr>
-                          <w:pStyle w:val="a3"/>
+                          <w:pStyle w:val="BodyText"/>
                         </w:pPr>
                         <w:r>
                           <w:t>We suggest that you use a text box to insert a graphic (which is ideally a 300 dpi TIFF or EPS file, with all fonts embedded) because, in an MSW document, this method is somewhat more stable than directly inserting a picture.</w:t>
@@ -3016,7 +3381,7 @@
                       </w:p>
                       <w:p>
                         <w:pPr>
-                          <w:pStyle w:val="a3"/>
+                          <w:pStyle w:val="BodyText"/>
                         </w:pPr>
                         <w:r>
                           <w:t>To have non-visible rules on your frame, use the MSWord “Format” pull-down menu, select Text Box &gt; Colors and Lines to choose No Fill and No Line.</w:t>
@@ -3052,7 +3417,7 @@
 </file>
 
 <file path=word/endnotes.xml><?xml version="1.0" encoding="utf-8"?>
-<w:endnotes xmlns:cx="http://schemas.microsoft.com/office/drawing/2014/chartex" xmlns:cx1="http://schemas.microsoft.com/office/drawing/2015/9/8/chartex" xmlns:cx2="http://schemas.microsoft.com/office/drawing/2015/10/21/chartex" xmlns:cx3="http://schemas.microsoft.com/office/drawing/2016/5/9/chartex" xmlns:cx4="http://schemas.microsoft.com/office/drawing/2016/5/10/chartex" xmlns:cx5="http://schemas.microsoft.com/office/drawing/2016/5/11/chartex" xmlns:cx6="http://schemas.microsoft.com/office/drawing/2016/5/12/chartex" xmlns:cx7="http://schemas.microsoft.com/office/drawing/2016/5/13/chartex" xmlns:cx8="http://schemas.microsoft.com/office/drawing/2016/5/14/chartex" xmlns:mc="http://schemas.openxmlformats.org/markup-compatibility/2006" xmlns:aink="http://schemas.microsoft.com/office/drawing/2016/ink" xmlns:am3d="http://schemas.microsoft.com/office/drawing/2017/model3d" xmlns:o="urn:schemas-microsoft-com:office:office" xmlns:r="http://purl.oclc.org/ooxml/officeDocument/relationships" xmlns:m="http://purl.oclc.org/ooxml/officeDocument/math" xmlns:v="urn:schemas-microsoft-com:vml" xmlns:wp14="http://schemas.microsoft.com/office/word/2010/wordprocessingDrawing" xmlns:wp="http://purl.oclc.org/ooxml/drawingml/wordprocessingDrawing" xmlns:w10="urn:schemas-microsoft-com:office:word" xmlns:w="http://purl.oclc.org/ooxml/wordprocessingml/main" xmlns:w14="http://schemas.microsoft.com/office/word/2010/wordml" xmlns:w15="http://schemas.microsoft.com/office/word/2012/wordml" xmlns:w16cid="http://schemas.microsoft.com/office/word/2016/wordml/cid" xmlns:w16se="http://schemas.microsoft.com/office/word/2015/wordml/symex" xmlns:wpi="http://schemas.microsoft.com/office/word/2010/wordprocessingInk" xmlns:wne="http://schemas.microsoft.com/office/word/2006/wordml" mc:Ignorable="w14 w15 w16se w16cid wne wp14">
+<w:endnotes xmlns:cx="http://schemas.microsoft.com/office/drawing/2014/chartex" xmlns:cx1="http://schemas.microsoft.com/office/drawing/2015/9/8/chartex" xmlns:cx2="http://schemas.microsoft.com/office/drawing/2015/10/21/chartex" xmlns:cx3="http://schemas.microsoft.com/office/drawing/2016/5/9/chartex" xmlns:cx4="http://schemas.microsoft.com/office/drawing/2016/5/10/chartex" xmlns:cx5="http://schemas.microsoft.com/office/drawing/2016/5/11/chartex" xmlns:cx6="http://schemas.microsoft.com/office/drawing/2016/5/12/chartex" xmlns:cx7="http://schemas.microsoft.com/office/drawing/2016/5/13/chartex" xmlns:cx8="http://schemas.microsoft.com/office/drawing/2016/5/14/chartex" xmlns:mc="http://schemas.openxmlformats.org/markup-compatibility/2006" xmlns:aink="http://schemas.microsoft.com/office/drawing/2016/ink" xmlns:am3d="http://schemas.microsoft.com/office/drawing/2017/model3d" xmlns:o="urn:schemas-microsoft-com:office:office" xmlns:oel="http://schemas.microsoft.com/office/2019/extlst" xmlns:r="http://purl.oclc.org/ooxml/officeDocument/relationships" xmlns:m="http://purl.oclc.org/ooxml/officeDocument/math" xmlns:v="urn:schemas-microsoft-com:vml" xmlns:wp14="http://schemas.microsoft.com/office/word/2010/wordprocessingDrawing" xmlns:wp="http://purl.oclc.org/ooxml/drawingml/wordprocessingDrawing" xmlns:w10="urn:schemas-microsoft-com:office:word" xmlns:w="http://purl.oclc.org/ooxml/wordprocessingml/main" xmlns:w14="http://schemas.microsoft.com/office/word/2010/wordml" xmlns:w15="http://schemas.microsoft.com/office/word/2012/wordml" xmlns:w16cex="http://schemas.microsoft.com/office/word/2018/wordml/cex" xmlns:w16cid="http://schemas.microsoft.com/office/word/2016/wordml/cid" xmlns:w16="http://schemas.microsoft.com/office/word/2018/wordml" xmlns:w16du="http://schemas.microsoft.com/office/word/2023/wordml/word16du" xmlns:w16sdtdh="http://schemas.microsoft.com/office/word/2020/wordml/sdtdatahash" xmlns:w16se="http://schemas.microsoft.com/office/word/2015/wordml/symex" xmlns:wpi="http://schemas.microsoft.com/office/word/2010/wordprocessingInk" xmlns:wne="http://schemas.microsoft.com/office/word/2006/wordml" mc:Ignorable="w14 w15 w16se w16cid w16 w16cex w16sdtdh w16du wne wp14">
   <w:endnote w:type="separator" w:id="-1">
     <w:p>
       <w:r>
@@ -3071,10 +3436,10 @@
 </file>
 
 <file path=word/footer1.xml><?xml version="1.0" encoding="utf-8"?>
-<w:ftr xmlns:cx="http://schemas.microsoft.com/office/drawing/2014/chartex" xmlns:cx1="http://schemas.microsoft.com/office/drawing/2015/9/8/chartex" xmlns:cx2="http://schemas.microsoft.com/office/drawing/2015/10/21/chartex" xmlns:cx3="http://schemas.microsoft.com/office/drawing/2016/5/9/chartex" xmlns:cx4="http://schemas.microsoft.com/office/drawing/2016/5/10/chartex" xmlns:cx5="http://schemas.microsoft.com/office/drawing/2016/5/11/chartex" xmlns:cx6="http://schemas.microsoft.com/office/drawing/2016/5/12/chartex" xmlns:cx7="http://schemas.microsoft.com/office/drawing/2016/5/13/chartex" xmlns:cx8="http://schemas.microsoft.com/office/drawing/2016/5/14/chartex" xmlns:mc="http://schemas.openxmlformats.org/markup-compatibility/2006" xmlns:aink="http://schemas.microsoft.com/office/drawing/2016/ink" xmlns:am3d="http://schemas.microsoft.com/office/drawing/2017/model3d" xmlns:o="urn:schemas-microsoft-com:office:office" xmlns:r="http://purl.oclc.org/ooxml/officeDocument/relationships" xmlns:m="http://purl.oclc.org/ooxml/officeDocument/math" xmlns:v="urn:schemas-microsoft-com:vml" xmlns:wp14="http://schemas.microsoft.com/office/word/2010/wordprocessingDrawing" xmlns:wp="http://purl.oclc.org/ooxml/drawingml/wordprocessingDrawing" xmlns:w10="urn:schemas-microsoft-com:office:word" xmlns:w="http://purl.oclc.org/ooxml/wordprocessingml/main" xmlns:w14="http://schemas.microsoft.com/office/word/2010/wordml" xmlns:w15="http://schemas.microsoft.com/office/word/2012/wordml" xmlns:w16cid="http://schemas.microsoft.com/office/word/2016/wordml/cid" xmlns:w16se="http://schemas.microsoft.com/office/word/2015/wordml/symex" xmlns:wpi="http://schemas.microsoft.com/office/word/2010/wordprocessingInk" xmlns:wne="http://schemas.microsoft.com/office/word/2006/wordml" mc:Ignorable="w14 w15 w16se w16cid wne wp14">
+<w:ftr xmlns:cx="http://schemas.microsoft.com/office/drawing/2014/chartex" xmlns:cx1="http://schemas.microsoft.com/office/drawing/2015/9/8/chartex" xmlns:cx2="http://schemas.microsoft.com/office/drawing/2015/10/21/chartex" xmlns:cx3="http://schemas.microsoft.com/office/drawing/2016/5/9/chartex" xmlns:cx4="http://schemas.microsoft.com/office/drawing/2016/5/10/chartex" xmlns:cx5="http://schemas.microsoft.com/office/drawing/2016/5/11/chartex" xmlns:cx6="http://schemas.microsoft.com/office/drawing/2016/5/12/chartex" xmlns:cx7="http://schemas.microsoft.com/office/drawing/2016/5/13/chartex" xmlns:cx8="http://schemas.microsoft.com/office/drawing/2016/5/14/chartex" xmlns:mc="http://schemas.openxmlformats.org/markup-compatibility/2006" xmlns:aink="http://schemas.microsoft.com/office/drawing/2016/ink" xmlns:am3d="http://schemas.microsoft.com/office/drawing/2017/model3d" xmlns:o="urn:schemas-microsoft-com:office:office" xmlns:oel="http://schemas.microsoft.com/office/2019/extlst" xmlns:r="http://purl.oclc.org/ooxml/officeDocument/relationships" xmlns:m="http://purl.oclc.org/ooxml/officeDocument/math" xmlns:v="urn:schemas-microsoft-com:vml" xmlns:wp14="http://schemas.microsoft.com/office/word/2010/wordprocessingDrawing" xmlns:wp="http://purl.oclc.org/ooxml/drawingml/wordprocessingDrawing" xmlns:w10="urn:schemas-microsoft-com:office:word" xmlns:w="http://purl.oclc.org/ooxml/wordprocessingml/main" xmlns:w14="http://schemas.microsoft.com/office/word/2010/wordml" xmlns:w15="http://schemas.microsoft.com/office/word/2012/wordml" xmlns:w16cex="http://schemas.microsoft.com/office/word/2018/wordml/cex" xmlns:w16cid="http://schemas.microsoft.com/office/word/2016/wordml/cid" xmlns:w16="http://schemas.microsoft.com/office/word/2018/wordml" xmlns:w16du="http://schemas.microsoft.com/office/word/2023/wordml/word16du" xmlns:w16sdtdh="http://schemas.microsoft.com/office/word/2020/wordml/sdtdatahash" xmlns:w16se="http://schemas.microsoft.com/office/word/2015/wordml/symex" xmlns:wpi="http://schemas.microsoft.com/office/word/2010/wordprocessingInk" xmlns:wne="http://schemas.microsoft.com/office/word/2006/wordml" mc:Ignorable="w14 w15 w16se w16cid w16 w16cex w16sdtdh w16du wne wp14">
   <w:p>
     <w:pPr>
-      <w:pStyle w:val="a7"/>
+      <w:pStyle w:val="Footer"/>
       <w:jc w:val="start"/>
       <w:rPr>
         <w:sz w:val="16"/>
@@ -3093,7 +3458,7 @@
 </file>
 
 <file path=word/footnotes.xml><?xml version="1.0" encoding="utf-8"?>
-<w:footnotes xmlns:cx="http://schemas.microsoft.com/office/drawing/2014/chartex" xmlns:cx1="http://schemas.microsoft.com/office/drawing/2015/9/8/chartex" xmlns:cx2="http://schemas.microsoft.com/office/drawing/2015/10/21/chartex" xmlns:cx3="http://schemas.microsoft.com/office/drawing/2016/5/9/chartex" xmlns:cx4="http://schemas.microsoft.com/office/drawing/2016/5/10/chartex" xmlns:cx5="http://schemas.microsoft.com/office/drawing/2016/5/11/chartex" xmlns:cx6="http://schemas.microsoft.com/office/drawing/2016/5/12/chartex" xmlns:cx7="http://schemas.microsoft.com/office/drawing/2016/5/13/chartex" xmlns:cx8="http://schemas.microsoft.com/office/drawing/2016/5/14/chartex" xmlns:mc="http://schemas.openxmlformats.org/markup-compatibility/2006" xmlns:aink="http://schemas.microsoft.com/office/drawing/2016/ink" xmlns:am3d="http://schemas.microsoft.com/office/drawing/2017/model3d" xmlns:o="urn:schemas-microsoft-com:office:office" xmlns:r="http://purl.oclc.org/ooxml/officeDocument/relationships" xmlns:m="http://purl.oclc.org/ooxml/officeDocument/math" xmlns:v="urn:schemas-microsoft-com:vml" xmlns:wp14="http://schemas.microsoft.com/office/word/2010/wordprocessingDrawing" xmlns:wp="http://purl.oclc.org/ooxml/drawingml/wordprocessingDrawing" xmlns:w10="urn:schemas-microsoft-com:office:word" xmlns:w="http://purl.oclc.org/ooxml/wordprocessingml/main" xmlns:w14="http://schemas.microsoft.com/office/word/2010/wordml" xmlns:w15="http://schemas.microsoft.com/office/word/2012/wordml" xmlns:w16cid="http://schemas.microsoft.com/office/word/2016/wordml/cid" xmlns:w16se="http://schemas.microsoft.com/office/word/2015/wordml/symex" xmlns:wpi="http://schemas.microsoft.com/office/word/2010/wordprocessingInk" xmlns:wne="http://schemas.microsoft.com/office/word/2006/wordml" mc:Ignorable="w14 w15 w16se w16cid wne wp14">
+<w:footnotes xmlns:cx="http://schemas.microsoft.com/office/drawing/2014/chartex" xmlns:cx1="http://schemas.microsoft.com/office/drawing/2015/9/8/chartex" xmlns:cx2="http://schemas.microsoft.com/office/drawing/2015/10/21/chartex" xmlns:cx3="http://schemas.microsoft.com/office/drawing/2016/5/9/chartex" xmlns:cx4="http://schemas.microsoft.com/office/drawing/2016/5/10/chartex" xmlns:cx5="http://schemas.microsoft.com/office/drawing/2016/5/11/chartex" xmlns:cx6="http://schemas.microsoft.com/office/drawing/2016/5/12/chartex" xmlns:cx7="http://schemas.microsoft.com/office/drawing/2016/5/13/chartex" xmlns:cx8="http://schemas.microsoft.com/office/drawing/2016/5/14/chartex" xmlns:mc="http://schemas.openxmlformats.org/markup-compatibility/2006" xmlns:aink="http://schemas.microsoft.com/office/drawing/2016/ink" xmlns:am3d="http://schemas.microsoft.com/office/drawing/2017/model3d" xmlns:o="urn:schemas-microsoft-com:office:office" xmlns:oel="http://schemas.microsoft.com/office/2019/extlst" xmlns:r="http://purl.oclc.org/ooxml/officeDocument/relationships" xmlns:m="http://purl.oclc.org/ooxml/officeDocument/math" xmlns:v="urn:schemas-microsoft-com:vml" xmlns:wp14="http://schemas.microsoft.com/office/word/2010/wordprocessingDrawing" xmlns:wp="http://purl.oclc.org/ooxml/drawingml/wordprocessingDrawing" xmlns:w10="urn:schemas-microsoft-com:office:word" xmlns:w="http://purl.oclc.org/ooxml/wordprocessingml/main" xmlns:w14="http://schemas.microsoft.com/office/word/2010/wordml" xmlns:w15="http://schemas.microsoft.com/office/word/2012/wordml" xmlns:w16cex="http://schemas.microsoft.com/office/word/2018/wordml/cex" xmlns:w16cid="http://schemas.microsoft.com/office/word/2016/wordml/cid" xmlns:w16="http://schemas.microsoft.com/office/word/2018/wordml" xmlns:w16du="http://schemas.microsoft.com/office/word/2023/wordml/word16du" xmlns:w16sdtdh="http://schemas.microsoft.com/office/word/2020/wordml/sdtdatahash" xmlns:w16se="http://schemas.microsoft.com/office/word/2015/wordml/symex" xmlns:wpi="http://schemas.microsoft.com/office/word/2010/wordprocessingInk" xmlns:wne="http://schemas.microsoft.com/office/word/2006/wordml" mc:Ignorable="w14 w15 w16se w16cid w16 w16cex w16sdtdh w16du wne wp14">
   <w:footnote w:type="separator" w:id="-1">
     <w:p>
       <w:r>
@@ -3112,7 +3477,7 @@
 </file>
 
 <file path=word/numbering.xml><?xml version="1.0" encoding="utf-8"?>
-<w:numbering xmlns:cx="http://schemas.microsoft.com/office/drawing/2014/chartex" xmlns:cx1="http://schemas.microsoft.com/office/drawing/2015/9/8/chartex" xmlns:cx2="http://schemas.microsoft.com/office/drawing/2015/10/21/chartex" xmlns:cx3="http://schemas.microsoft.com/office/drawing/2016/5/9/chartex" xmlns:cx4="http://schemas.microsoft.com/office/drawing/2016/5/10/chartex" xmlns:cx5="http://schemas.microsoft.com/office/drawing/2016/5/11/chartex" xmlns:cx6="http://schemas.microsoft.com/office/drawing/2016/5/12/chartex" xmlns:cx7="http://schemas.microsoft.com/office/drawing/2016/5/13/chartex" xmlns:cx8="http://schemas.microsoft.com/office/drawing/2016/5/14/chartex" xmlns:mc="http://schemas.openxmlformats.org/markup-compatibility/2006" xmlns:aink="http://schemas.microsoft.com/office/drawing/2016/ink" xmlns:am3d="http://schemas.microsoft.com/office/drawing/2017/model3d" xmlns:o="urn:schemas-microsoft-com:office:office" xmlns:r="http://purl.oclc.org/ooxml/officeDocument/relationships" xmlns:m="http://purl.oclc.org/ooxml/officeDocument/math" xmlns:v="urn:schemas-microsoft-com:vml" xmlns:wp14="http://schemas.microsoft.com/office/word/2010/wordprocessingDrawing" xmlns:wp="http://purl.oclc.org/ooxml/drawingml/wordprocessingDrawing" xmlns:w10="urn:schemas-microsoft-com:office:word" xmlns:w="http://purl.oclc.org/ooxml/wordprocessingml/main" xmlns:w14="http://schemas.microsoft.com/office/word/2010/wordml" xmlns:w15="http://schemas.microsoft.com/office/word/2012/wordml" xmlns:w16cid="http://schemas.microsoft.com/office/word/2016/wordml/cid" xmlns:w16se="http://schemas.microsoft.com/office/word/2015/wordml/symex" xmlns:wpi="http://schemas.microsoft.com/office/word/2010/wordprocessingInk" xmlns:wne="http://schemas.microsoft.com/office/word/2006/wordml" mc:Ignorable="w14 w15 w16se w16cid wne wp14">
+<w:numbering xmlns:cx="http://schemas.microsoft.com/office/drawing/2014/chartex" xmlns:cx1="http://schemas.microsoft.com/office/drawing/2015/9/8/chartex" xmlns:cx2="http://schemas.microsoft.com/office/drawing/2015/10/21/chartex" xmlns:cx3="http://schemas.microsoft.com/office/drawing/2016/5/9/chartex" xmlns:cx4="http://schemas.microsoft.com/office/drawing/2016/5/10/chartex" xmlns:cx5="http://schemas.microsoft.com/office/drawing/2016/5/11/chartex" xmlns:cx6="http://schemas.microsoft.com/office/drawing/2016/5/12/chartex" xmlns:cx7="http://schemas.microsoft.com/office/drawing/2016/5/13/chartex" xmlns:cx8="http://schemas.microsoft.com/office/drawing/2016/5/14/chartex" xmlns:mc="http://schemas.openxmlformats.org/markup-compatibility/2006" xmlns:aink="http://schemas.microsoft.com/office/drawing/2016/ink" xmlns:am3d="http://schemas.microsoft.com/office/drawing/2017/model3d" xmlns:o="urn:schemas-microsoft-com:office:office" xmlns:oel="http://schemas.microsoft.com/office/2019/extlst" xmlns:r="http://purl.oclc.org/ooxml/officeDocument/relationships" xmlns:m="http://purl.oclc.org/ooxml/officeDocument/math" xmlns:v="urn:schemas-microsoft-com:vml" xmlns:wp14="http://schemas.microsoft.com/office/word/2010/wordprocessingDrawing" xmlns:wp="http://purl.oclc.org/ooxml/drawingml/wordprocessingDrawing" xmlns:w10="urn:schemas-microsoft-com:office:word" xmlns:w="http://purl.oclc.org/ooxml/wordprocessingml/main" xmlns:w14="http://schemas.microsoft.com/office/word/2010/wordml" xmlns:w15="http://schemas.microsoft.com/office/word/2012/wordml" xmlns:w16cex="http://schemas.microsoft.com/office/word/2018/wordml/cex" xmlns:w16cid="http://schemas.microsoft.com/office/word/2016/wordml/cid" xmlns:w16="http://schemas.microsoft.com/office/word/2018/wordml" xmlns:w16du="http://schemas.microsoft.com/office/word/2023/wordml/word16du" xmlns:w16sdtdh="http://schemas.microsoft.com/office/word/2020/wordml/sdtdatahash" xmlns:w16se="http://schemas.microsoft.com/office/word/2015/wordml/symex" xmlns:wpi="http://schemas.microsoft.com/office/word/2010/wordprocessingInk" xmlns:wne="http://schemas.microsoft.com/office/word/2006/wordml" mc:Ignorable="w14 w15 w16se w16cid w16 w16cex w16sdtdh w16du wne wp14">
   <w:abstractNum w:abstractNumId="0" w15:restartNumberingAfterBreak="0">
     <w:nsid w:val="FFFFFF1D"/>
     <w:multiLevelType w:val="multilevel"/>
@@ -4334,7 +4699,7 @@
     <w:lvl w:ilvl="0">
       <w:start w:val="1"/>
       <w:numFmt w:val="upperRoman"/>
-      <w:pStyle w:val="1"/>
+      <w:pStyle w:val="Heading1"/>
       <w:lvlText w:val="%1."/>
       <w:lvlJc w:val="center"/>
       <w:pPr>
@@ -4367,7 +4732,7 @@
     <w:lvl w:ilvl="1">
       <w:start w:val="1"/>
       <w:numFmt w:val="upperLetter"/>
-      <w:pStyle w:val="2"/>
+      <w:pStyle w:val="Heading2"/>
       <w:lvlText w:val="%2."/>
       <w:lvlJc w:val="start"/>
       <w:pPr>
@@ -4403,7 +4768,7 @@
     <w:lvl w:ilvl="2">
       <w:start w:val="1"/>
       <w:numFmt w:val="decimal"/>
-      <w:pStyle w:val="3"/>
+      <w:pStyle w:val="Heading3"/>
       <w:lvlText w:val="%3)"/>
       <w:lvlJc w:val="start"/>
       <w:pPr>
@@ -4439,7 +4804,7 @@
     <w:lvl w:ilvl="3">
       <w:start w:val="1"/>
       <w:numFmt w:val="lowerLetter"/>
-      <w:pStyle w:val="4"/>
+      <w:pStyle w:val="Heading4"/>
       <w:lvlText w:val="%4)"/>
       <w:lvlJc w:val="start"/>
       <w:pPr>
@@ -4844,113 +5209,113 @@
       </w:rPr>
     </w:lvl>
   </w:abstractNum>
-  <w:num w:numId="1">
+  <w:num w:numId="1" w16cid:durableId="1694380124">
     <w:abstractNumId w:val="17"/>
   </w:num>
-  <w:num w:numId="2">
+  <w:num w:numId="2" w16cid:durableId="1275483731">
     <w:abstractNumId w:val="22"/>
   </w:num>
-  <w:num w:numId="3">
+  <w:num w:numId="3" w16cid:durableId="1995991291">
     <w:abstractNumId w:val="14"/>
   </w:num>
-  <w:num w:numId="4">
+  <w:num w:numId="4" w16cid:durableId="660080273">
     <w:abstractNumId w:val="19"/>
   </w:num>
-  <w:num w:numId="5">
+  <w:num w:numId="5" w16cid:durableId="1621496986">
     <w:abstractNumId w:val="19"/>
   </w:num>
-  <w:num w:numId="6">
+  <w:num w:numId="6" w16cid:durableId="1729526248">
     <w:abstractNumId w:val="19"/>
   </w:num>
-  <w:num w:numId="7">
+  <w:num w:numId="7" w16cid:durableId="1674604673">
     <w:abstractNumId w:val="19"/>
   </w:num>
-  <w:num w:numId="8">
+  <w:num w:numId="8" w16cid:durableId="1321080794">
     <w:abstractNumId w:val="21"/>
   </w:num>
-  <w:num w:numId="9">
+  <w:num w:numId="9" w16cid:durableId="1462110823">
     <w:abstractNumId w:val="23"/>
   </w:num>
-  <w:num w:numId="10">
+  <w:num w:numId="10" w16cid:durableId="2052995782">
     <w:abstractNumId w:val="18"/>
   </w:num>
-  <w:num w:numId="11">
+  <w:num w:numId="11" w16cid:durableId="922564631">
     <w:abstractNumId w:val="13"/>
   </w:num>
-  <w:num w:numId="12">
+  <w:num w:numId="12" w16cid:durableId="759836497">
     <w:abstractNumId w:val="12"/>
   </w:num>
-  <w:num w:numId="13">
+  <w:num w:numId="13" w16cid:durableId="1743064307">
     <w:abstractNumId w:val="0"/>
   </w:num>
-  <w:num w:numId="14">
+  <w:num w:numId="14" w16cid:durableId="295457077">
     <w:abstractNumId w:val="10"/>
   </w:num>
-  <w:num w:numId="15">
+  <w:num w:numId="15" w16cid:durableId="244920153">
     <w:abstractNumId w:val="8"/>
   </w:num>
-  <w:num w:numId="16">
+  <w:num w:numId="16" w16cid:durableId="495341487">
     <w:abstractNumId w:val="7"/>
   </w:num>
-  <w:num w:numId="17">
+  <w:num w:numId="17" w16cid:durableId="1261067256">
     <w:abstractNumId w:val="6"/>
   </w:num>
-  <w:num w:numId="18">
+  <w:num w:numId="18" w16cid:durableId="306471717">
     <w:abstractNumId w:val="5"/>
   </w:num>
-  <w:num w:numId="19">
+  <w:num w:numId="19" w16cid:durableId="187573585">
     <w:abstractNumId w:val="9"/>
   </w:num>
-  <w:num w:numId="20">
+  <w:num w:numId="20" w16cid:durableId="315912773">
     <w:abstractNumId w:val="4"/>
   </w:num>
-  <w:num w:numId="21">
+  <w:num w:numId="21" w16cid:durableId="1226797777">
     <w:abstractNumId w:val="3"/>
   </w:num>
-  <w:num w:numId="22">
+  <w:num w:numId="22" w16cid:durableId="618147282">
     <w:abstractNumId w:val="2"/>
   </w:num>
-  <w:num w:numId="23">
+  <w:num w:numId="23" w16cid:durableId="546571730">
     <w:abstractNumId w:val="1"/>
   </w:num>
-  <w:num w:numId="24">
+  <w:num w:numId="24" w16cid:durableId="196357982">
     <w:abstractNumId w:val="20"/>
   </w:num>
-  <w:num w:numId="25">
+  <w:num w:numId="25" w16cid:durableId="1863935379">
     <w:abstractNumId w:val="19"/>
   </w:num>
-  <w:num w:numId="26">
+  <w:num w:numId="26" w16cid:durableId="1908027066">
     <w:abstractNumId w:val="19"/>
   </w:num>
-  <w:num w:numId="27">
+  <w:num w:numId="27" w16cid:durableId="1900356117">
     <w:abstractNumId w:val="19"/>
   </w:num>
-  <w:num w:numId="28">
+  <w:num w:numId="28" w16cid:durableId="1532063053">
     <w:abstractNumId w:val="19"/>
   </w:num>
-  <w:num w:numId="29">
+  <w:num w:numId="29" w16cid:durableId="926773018">
     <w:abstractNumId w:val="11"/>
   </w:num>
-  <w:num w:numId="30">
+  <w:num w:numId="30" w16cid:durableId="1580094110">
     <w:abstractNumId w:val="15"/>
   </w:num>
-  <w:num w:numId="31">
+  <w:num w:numId="31" w16cid:durableId="577859499">
     <w:abstractNumId w:val="16"/>
   </w:num>
-  <w:num w:numId="32">
+  <w:num w:numId="32" w16cid:durableId="608317390">
     <w:abstractNumId w:val="17"/>
   </w:num>
-  <w:num w:numId="33">
+  <w:num w:numId="33" w16cid:durableId="511721236">
     <w:abstractNumId w:val="17"/>
   </w:num>
-  <w:num w:numId="34">
+  <w:num w:numId="34" w16cid:durableId="1041905568">
     <w:abstractNumId w:val="17"/>
   </w:num>
 </w:numbering>
 </file>
 
 <file path=word/styles.xml><?xml version="1.0" encoding="utf-8"?>
-<w:styles xmlns:mc="http://schemas.openxmlformats.org/markup-compatibility/2006" xmlns:r="http://purl.oclc.org/ooxml/officeDocument/relationships" xmlns:w="http://purl.oclc.org/ooxml/wordprocessingml/main" xmlns:w14="http://schemas.microsoft.com/office/word/2010/wordml" xmlns:w15="http://schemas.microsoft.com/office/word/2012/wordml" xmlns:w16cid="http://schemas.microsoft.com/office/word/2016/wordml/cid" xmlns:w16se="http://schemas.microsoft.com/office/word/2015/wordml/symex" mc:Ignorable="w14 w15 w16se w16cid">
+<w:styles xmlns:mc="http://schemas.openxmlformats.org/markup-compatibility/2006" xmlns:r="http://purl.oclc.org/ooxml/officeDocument/relationships" xmlns:w="http://purl.oclc.org/ooxml/wordprocessingml/main" xmlns:w14="http://schemas.microsoft.com/office/word/2010/wordml" xmlns:w15="http://schemas.microsoft.com/office/word/2012/wordml" xmlns:w16cex="http://schemas.microsoft.com/office/word/2018/wordml/cex" xmlns:w16cid="http://schemas.microsoft.com/office/word/2016/wordml/cid" xmlns:w16="http://schemas.microsoft.com/office/word/2018/wordml" xmlns:w16du="http://schemas.microsoft.com/office/word/2023/wordml/word16du" xmlns:w16sdtdh="http://schemas.microsoft.com/office/word/2020/wordml/sdtdatahash" xmlns:w16se="http://schemas.microsoft.com/office/word/2015/wordml/symex" mc:Ignorable="w14 w15 w16se w16cid w16 w16cex w16sdtdh w16du">
   <w:docDefaults>
     <w:rPrDefault>
       <w:rPr>
@@ -4960,7 +5325,7 @@
     </w:rPrDefault>
     <w:pPrDefault/>
   </w:docDefaults>
-  <w:latentStyles w:defLockedState="0" w:defUIPriority="0" w:defSemiHidden="0" w:defUnhideWhenUsed="0" w:defQFormat="0" w:count="375">
+  <w:latentStyles w:defLockedState="0" w:defUIPriority="0" w:defSemiHidden="0" w:defUnhideWhenUsed="0" w:defQFormat="0" w:count="376">
     <w:lsdException w:name="Normal" w:qFormat="1"/>
     <w:lsdException w:name="heading 1" w:qFormat="1"/>
     <w:lsdException w:name="heading 2" w:qFormat="1"/>
@@ -5240,18 +5605,19 @@
     <w:lsdException w:name="Smart Hyperlink" w:semiHidden="1" w:uiPriority="99" w:unhideWhenUsed="1"/>
     <w:lsdException w:name="Hashtag" w:semiHidden="1" w:uiPriority="99" w:unhideWhenUsed="1"/>
     <w:lsdException w:name="Unresolved Mention" w:semiHidden="1" w:uiPriority="99" w:unhideWhenUsed="1"/>
+    <w:lsdException w:name="Smart Link" w:semiHidden="1" w:uiPriority="99" w:unhideWhenUsed="1"/>
   </w:latentStyles>
-  <w:style w:type="paragraph" w:default="1" w:styleId="a">
+  <w:style w:type="paragraph" w:default="1" w:styleId="Normal">
     <w:name w:val="Normal"/>
     <w:qFormat/>
     <w:pPr>
       <w:jc w:val="center"/>
     </w:pPr>
   </w:style>
-  <w:style w:type="paragraph" w:styleId="1">
+  <w:style w:type="paragraph" w:styleId="Heading1">
     <w:name w:val="heading 1"/>
-    <w:basedOn w:val="a"/>
-    <w:next w:val="a"/>
+    <w:basedOn w:val="Normal"/>
+    <w:next w:val="Normal"/>
     <w:qFormat/>
     <w:rsid w:val="006B6B66"/>
     <w:pPr>
@@ -5272,10 +5638,10 @@
       <w:noProof/>
     </w:rPr>
   </w:style>
-  <w:style w:type="paragraph" w:styleId="2">
+  <w:style w:type="paragraph" w:styleId="Heading2">
     <w:name w:val="heading 2"/>
-    <w:basedOn w:val="a"/>
-    <w:next w:val="a"/>
+    <w:basedOn w:val="Normal"/>
+    <w:next w:val="Normal"/>
     <w:qFormat/>
     <w:rsid w:val="00ED0149"/>
     <w:pPr>
@@ -5295,10 +5661,10 @@
       <w:noProof/>
     </w:rPr>
   </w:style>
-  <w:style w:type="paragraph" w:styleId="3">
+  <w:style w:type="paragraph" w:styleId="Heading3">
     <w:name w:val="heading 3"/>
-    <w:basedOn w:val="a"/>
-    <w:next w:val="a"/>
+    <w:basedOn w:val="Normal"/>
+    <w:next w:val="Normal"/>
     <w:qFormat/>
     <w:rsid w:val="00794804"/>
     <w:pPr>
@@ -5317,10 +5683,10 @@
       <w:noProof/>
     </w:rPr>
   </w:style>
-  <w:style w:type="paragraph" w:styleId="4">
+  <w:style w:type="paragraph" w:styleId="Heading4">
     <w:name w:val="heading 4"/>
-    <w:basedOn w:val="a"/>
-    <w:next w:val="a"/>
+    <w:basedOn w:val="Normal"/>
+    <w:next w:val="Normal"/>
     <w:qFormat/>
     <w:rsid w:val="00794804"/>
     <w:pPr>
@@ -5343,10 +5709,10 @@
       <w:noProof/>
     </w:rPr>
   </w:style>
-  <w:style w:type="paragraph" w:styleId="5">
+  <w:style w:type="paragraph" w:styleId="Heading5">
     <w:name w:val="heading 5"/>
-    <w:basedOn w:val="a"/>
-    <w:next w:val="a"/>
+    <w:basedOn w:val="Normal"/>
+    <w:next w:val="Normal"/>
     <w:qFormat/>
     <w:pPr>
       <w:tabs>
@@ -5360,13 +5726,12 @@
       <w:noProof/>
     </w:rPr>
   </w:style>
-  <w:style w:type="character" w:default="1" w:styleId="a0">
+  <w:style w:type="character" w:default="1" w:styleId="DefaultParagraphFont">
     <w:name w:val="Default Paragraph Font"/>
     <w:uiPriority w:val="1"/>
-    <w:semiHidden/>
     <w:unhideWhenUsed/>
   </w:style>
-  <w:style w:type="table" w:default="1" w:styleId="a1">
+  <w:style w:type="table" w:default="1" w:styleId="TableNormal">
     <w:name w:val="Normal Table"/>
     <w:uiPriority w:val="99"/>
     <w:semiHidden/>
@@ -5381,7 +5746,7 @@
       </w:tblCellMar>
     </w:tblPr>
   </w:style>
-  <w:style w:type="numbering" w:default="1" w:styleId="a2">
+  <w:style w:type="numbering" w:default="1" w:styleId="NoList">
     <w:name w:val="No List"/>
     <w:uiPriority w:val="99"/>
     <w:semiHidden/>
@@ -5420,10 +5785,10 @@
       <w:szCs w:val="22"/>
     </w:rPr>
   </w:style>
-  <w:style w:type="paragraph" w:styleId="a3">
+  <w:style w:type="paragraph" w:styleId="BodyText">
     <w:name w:val="Body Text"/>
-    <w:basedOn w:val="a"/>
-    <w:link w:val="a4"/>
+    <w:basedOn w:val="Normal"/>
+    <w:link w:val="BodyTextChar"/>
     <w:rsid w:val="00E7596C"/>
     <w:pPr>
       <w:tabs>
@@ -5438,9 +5803,9 @@
       <w:lang w:val="x-none" w:eastAsia="x-none"/>
     </w:rPr>
   </w:style>
-  <w:style w:type="character" w:customStyle="1" w:styleId="a4">
-    <w:name w:val="本文 字元"/>
-    <w:link w:val="a3"/>
+  <w:style w:type="character" w:customStyle="1" w:styleId="BodyTextChar">
+    <w:name w:val="Body Text Char"/>
+    <w:link w:val="BodyText"/>
     <w:rsid w:val="00E7596C"/>
     <w:rPr>
       <w:spacing w:val="-1"/>
@@ -5449,7 +5814,7 @@
   </w:style>
   <w:style w:type="paragraph" w:customStyle="1" w:styleId="bulletlist">
     <w:name w:val="bullet list"/>
-    <w:basedOn w:val="a3"/>
+    <w:basedOn w:val="BodyText"/>
     <w:rsid w:val="001B67DC"/>
     <w:pPr>
       <w:numPr>
@@ -5459,7 +5824,7 @@
   </w:style>
   <w:style w:type="paragraph" w:customStyle="1" w:styleId="equation">
     <w:name w:val="equation"/>
-    <w:basedOn w:val="a"/>
+    <w:basedOn w:val="Normal"/>
     <w:rsid w:val="008A2C7D"/>
     <w:pPr>
       <w:tabs>
@@ -5564,7 +5929,7 @@
   </w:style>
   <w:style w:type="paragraph" w:customStyle="1" w:styleId="tablecolhead">
     <w:name w:val="table col head"/>
-    <w:basedOn w:val="a"/>
+    <w:basedOn w:val="Normal"/>
     <w:rPr>
       <w:b/>
       <w:bCs/>
@@ -5638,10 +6003,10 @@
       <w:i/>
     </w:rPr>
   </w:style>
-  <w:style w:type="paragraph" w:styleId="a5">
+  <w:style w:type="paragraph" w:styleId="Header">
     <w:name w:val="header"/>
-    <w:basedOn w:val="a"/>
-    <w:link w:val="a6"/>
+    <w:basedOn w:val="Normal"/>
+    <w:link w:val="HeaderChar"/>
     <w:rsid w:val="001A3B3D"/>
     <w:pPr>
       <w:tabs>
@@ -5650,16 +6015,16 @@
       </w:tabs>
     </w:pPr>
   </w:style>
-  <w:style w:type="character" w:customStyle="1" w:styleId="a6">
-    <w:name w:val="頁首 字元"/>
-    <w:basedOn w:val="a0"/>
-    <w:link w:val="a5"/>
+  <w:style w:type="character" w:customStyle="1" w:styleId="HeaderChar">
+    <w:name w:val="Header Char"/>
+    <w:basedOn w:val="DefaultParagraphFont"/>
+    <w:link w:val="Header"/>
     <w:rsid w:val="001A3B3D"/>
   </w:style>
-  <w:style w:type="paragraph" w:styleId="a7">
+  <w:style w:type="paragraph" w:styleId="Footer">
     <w:name w:val="footer"/>
-    <w:basedOn w:val="a"/>
-    <w:link w:val="a8"/>
+    <w:basedOn w:val="Normal"/>
+    <w:link w:val="FooterChar"/>
     <w:rsid w:val="001A3B3D"/>
     <w:pPr>
       <w:tabs>
@@ -5668,15 +6033,15 @@
       </w:tabs>
     </w:pPr>
   </w:style>
-  <w:style w:type="character" w:customStyle="1" w:styleId="a8">
-    <w:name w:val="頁尾 字元"/>
-    <w:basedOn w:val="a0"/>
-    <w:link w:val="a7"/>
+  <w:style w:type="character" w:customStyle="1" w:styleId="FooterChar">
+    <w:name w:val="Footer Char"/>
+    <w:basedOn w:val="DefaultParagraphFont"/>
+    <w:link w:val="Footer"/>
     <w:rsid w:val="001A3B3D"/>
   </w:style>
-  <w:style w:type="character" w:styleId="a9">
+  <w:style w:type="character" w:styleId="Hyperlink">
     <w:name w:val="Hyperlink"/>
-    <w:basedOn w:val="a0"/>
+    <w:basedOn w:val="DefaultParagraphFont"/>
     <w:uiPriority w:val="99"/>
     <w:unhideWhenUsed/>
     <w:rsid w:val="00C61D30"/>

</xml_diff>

<commit_message>
add filter and kernel to paper
</commit_message>
<xml_diff>
--- a/1dcnn_ieee.docx
+++ b/1dcnn_ieee.docx
@@ -451,13 +451,7 @@
         <w:rPr>
           <w:lang w:val="en-AU"/>
         </w:rPr>
-        <w:t xml:space="preserve">There are 3 popular </w:t>
-      </w:r>
-      <w:r>
-        <w:rPr>
-          <w:lang w:val="en-AU"/>
-        </w:rPr>
-        <w:t>methods</w:t>
+        <w:t>There are 3 popular methods</w:t>
       </w:r>
       <w:r>
         <w:rPr>
@@ -935,14 +929,7 @@
         <w:rPr>
           <w:lang w:val="en-AU"/>
         </w:rPr>
-        <w:t xml:space="preserve">It's important to note that the choice of algorithm depends on factors such as desired accuracy, computational resources, user preferences, and the specific environment where the </w:t>
-      </w:r>
-      <w:r>
-        <w:rPr>
-          <w:lang w:val="en-AU"/>
-        </w:rPr>
-        <w:lastRenderedPageBreak/>
-        <w:t>system will be deployed. Additionally, many systems combine multiple algorithm types to improve overall performance and robustness.</w:t>
+        <w:t>It's important to note that the choice of algorithm depends on factors such as desired accuracy, computational resources, user preferences, and the specific environment where the system will be deployed. Additionally, many systems combine multiple algorithm types to improve overall performance and robustness.</w:t>
       </w:r>
     </w:p>
     <w:p>
@@ -1189,7 +1176,7 @@
         <w:rPr>
           <w:lang w:val="en-AU"/>
         </w:rPr>
-        <w:t>he data is limited in representativeness as it was collected solely from young individuals.</w:t>
+        <w:t>he data is limited in representativeness.</w:t>
       </w:r>
       <w:r>
         <w:rPr>
@@ -1610,14 +1597,7 @@
           <w:rFonts w:hint="eastAsia"/>
           <w:lang w:val="en-US" w:eastAsia="zh-CN"/>
         </w:rPr>
-        <w:t xml:space="preserve">he red line in Figure 1 is the standard </w:t>
-      </w:r>
-      <w:r>
-        <w:rPr>
-          <w:rFonts w:hint="eastAsia"/>
-          <w:lang w:val="en-US" w:eastAsia="zh-CN"/>
-        </w:rPr>
-        <w:t xml:space="preserve">gravity acceleration, when people are walking normally or standing still the CA is around </w:t>
+        <w:t xml:space="preserve">he red line in Figure 1 is the standard gravity acceleration, when people are walking normally or standing still the CA is around </w:t>
       </w:r>
       <w:r>
         <w:rPr>
@@ -1695,7 +1675,13 @@
         <w:pStyle w:val="a3"/>
       </w:pPr>
       <w:r>
-        <w:t xml:space="preserve">Convolutional neural networks (CNNs) are a type of deep learning architecture particularly well-suited for processing and analyzing spatial data, such as images. CNNs consist of multiple layers that perform convolution, pooling, and fully connected operations to extract relevant features from the input data. The convolutional layers apply filters to local regions of the input, allowing the network to learn spatial patterns. The pooling layers then reduce the spatial dimensions of the feature maps, while the fully connected layers perform classification or regression tasks based on the extracted features. </w:t>
+        <w:t xml:space="preserve">Convolutional neural networks (CNNs) are a type of deep learning architecture particularly well-suited for processing and analyzing spatial data, such as images. CNNs consist of multiple layers that perform convolution, pooling, and fully connected operations to extract relevant features from the input data. </w:t>
+      </w:r>
+      <w:r>
+        <w:t xml:space="preserve">The full picture is shown in Figure 2. </w:t>
+      </w:r>
+      <w:r>
+        <w:t xml:space="preserve">The convolutional layers apply filters to local regions of the input, allowing the network to learn spatial patterns. The pooling layers then reduce the spatial dimensions of the feature maps, while the fully connected layers perform classification or regression tasks based on the extracted features. </w:t>
       </w:r>
     </w:p>
     <w:p>
@@ -1763,13 +1749,144 @@
     </w:p>
     <w:p>
       <w:pPr>
+        <w:pStyle w:val="a3"/>
+      </w:pPr>
+      <w:r>
+        <w:rPr>
+          <w:lang w:eastAsia="zh-CN"/>
+        </w:rPr>
+        <w:t xml:space="preserve">For the </w:t>
+      </w:r>
+      <w:r>
+        <w:t>convolution</w:t>
+      </w:r>
+      <w:r>
+        <w:t xml:space="preserve"> operation, two key hyperparameters are number of filters and kernel size. </w:t>
+      </w:r>
+      <w:r>
+        <w:t>The number of filters</w:t>
+      </w:r>
+      <w:r>
+        <w:t xml:space="preserve"> (</w:t>
+      </w:r>
+      <w:r>
+        <w:rPr>
+          <w:i/>
+        </w:rPr>
+        <w:t>f</w:t>
+      </w:r>
+      <w:r>
+        <w:t>)</w:t>
+      </w:r>
+      <w:r>
+        <w:t xml:space="preserve"> determines the depth of the output feature map</w:t>
+      </w:r>
+      <w:r>
+        <w:t xml:space="preserve"> and the kernel size</w:t>
+      </w:r>
+      <w:r>
+        <w:t xml:space="preserve"> (</w:t>
+      </w:r>
+      <w:r>
+        <w:rPr>
+          <w:i/>
+        </w:rPr>
+        <w:t>k, k</w:t>
+      </w:r>
+      <w:r>
+        <w:t>)</w:t>
+      </w:r>
+      <w:r>
+        <w:t xml:space="preserve"> defines how much of the input image is being looked at during each convolution operation.</w:t>
+      </w:r>
+    </w:p>
+    <w:p>
+      <w:pPr>
+        <w:pStyle w:val="a3"/>
+        <w:rPr>
+          <w:lang w:eastAsia="zh-CN"/>
+        </w:rPr>
+      </w:pPr>
+      <w:r>
+        <w:rPr>
+          <w:noProof/>
+          <w:lang w:eastAsia="zh-CN"/>
+        </w:rPr>
+        <w:drawing>
+          <wp:inline distT="0" distB="0" distL="0" distR="0" wp14:anchorId="7A603446" wp14:editId="2226BD39">
+            <wp:extent cx="2610536" cy="911369"/>
+            <wp:effectExtent l="0" t="0" r="0" b="0"/>
+            <wp:docPr id="31" name="圖片 31"/>
+            <wp:cNvGraphicFramePr>
+              <a:graphicFrameLocks xmlns:a="http://purl.oclc.org/ooxml/drawingml/main" noChangeAspect="1"/>
+            </wp:cNvGraphicFramePr>
+            <a:graphic xmlns:a="http://purl.oclc.org/ooxml/drawingml/main">
+              <a:graphicData uri="http://purl.oclc.org/ooxml/drawingml/picture">
+                <pic:pic xmlns:pic="http://purl.oclc.org/ooxml/drawingml/picture">
+                  <pic:nvPicPr>
+                    <pic:cNvPr id="0" name="Picture 2"/>
+                    <pic:cNvPicPr>
+                      <a:picLocks noChangeAspect="1" noChangeArrowheads="1"/>
+                    </pic:cNvPicPr>
+                  </pic:nvPicPr>
+                  <pic:blipFill>
+                    <a:blip r:embed="rId11" cstate="print">
+                      <a:extLst>
+                        <a:ext uri="{28A0092B-C50C-407E-A947-70E740481C1C}">
+                          <a14:useLocalDpi xmlns:a14="http://schemas.microsoft.com/office/drawing/2010/main" val="0"/>
+                        </a:ext>
+                      </a:extLst>
+                    </a:blip>
+                    <a:srcRect/>
+                    <a:stretch>
+                      <a:fillRect/>
+                    </a:stretch>
+                  </pic:blipFill>
+                  <pic:spPr bwMode="auto">
+                    <a:xfrm>
+                      <a:off x="0" y="0"/>
+                      <a:ext cx="2653512" cy="926372"/>
+                    </a:xfrm>
+                    <a:prstGeom prst="rect">
+                      <a:avLst/>
+                    </a:prstGeom>
+                    <a:noFill/>
+                  </pic:spPr>
+                </pic:pic>
+              </a:graphicData>
+            </a:graphic>
+          </wp:inline>
+        </w:drawing>
+      </w:r>
+    </w:p>
+    <w:p>
+      <w:pPr>
+        <w:pStyle w:val="figurecaption"/>
+        <w:rPr>
+          <w:rFonts w:hint="eastAsia"/>
+        </w:rPr>
+      </w:pPr>
+      <w:r>
+        <w:t>Convolution operation</w:t>
+      </w:r>
+      <w:r>
+        <w:t>.</w:t>
+      </w:r>
+    </w:p>
+    <w:p>
+      <w:pPr>
+        <w:pStyle w:val="a3"/>
+      </w:pPr>
+      <w:r>
+        <w:t xml:space="preserve">It is not suitable for our 1D-data, but the way it extracts features is effective, so 1D-CNN is introduced. </w:t>
+      </w:r>
+    </w:p>
+    <w:p>
+      <w:pPr>
         <w:pStyle w:val="2"/>
       </w:pPr>
       <w:r>
-        <w:t>1D-</w:t>
-      </w:r>
-      <w:r>
-        <w:t>CNN</w:t>
+        <w:t>1D-CNN</w:t>
       </w:r>
     </w:p>
     <w:p>
@@ -1778,6 +1895,9 @@
       </w:pPr>
       <w:r>
         <w:t>For time-series data like sensor readings, a 1D-CNN architecture is more appropriate, as it operates on 1-dimensional sequences rather than 2D images. 1D-CNNs are able to effectively capture the temporal patterns in sensor data, making them a suitable choice for the fall detection task at hand, where the sensor readings exhibit characteristic patterns associated with fall events.</w:t>
+      </w:r>
+      <w:r>
+        <w:t xml:space="preserve"> The principle is shown in Figure 3.</w:t>
       </w:r>
     </w:p>
     <w:p>
@@ -1811,7 +1931,7 @@
                     </pic:cNvPicPr>
                   </pic:nvPicPr>
                   <pic:blipFill>
-                    <a:blip r:embed="rId11" cstate="print">
+                    <a:blip r:embed="rId12" cstate="print">
                       <a:extLst>
                         <a:ext uri="{28A0092B-C50C-407E-A947-70E740481C1C}">
                           <a14:useLocalDpi xmlns:a14="http://schemas.microsoft.com/office/drawing/2010/main" val="0"/>
@@ -1857,11 +1977,36 @@
     <w:p>
       <w:pPr>
         <w:pStyle w:val="a3"/>
-        <w:jc w:val="center"/>
-        <w:rPr>
-          <w:lang w:val="en-US"/>
-        </w:rPr>
-      </w:pPr>
+        <w:rPr>
+          <w:rFonts w:hint="eastAsia"/>
+          <w:lang w:val="en-US" w:eastAsia="zh-CN"/>
+        </w:rPr>
+      </w:pPr>
+      <w:r>
+        <w:rPr>
+          <w:rFonts w:hint="eastAsia"/>
+          <w:lang w:val="en-US" w:eastAsia="zh-CN"/>
+        </w:rPr>
+        <w:t>1</w:t>
+      </w:r>
+      <w:r>
+        <w:rPr>
+          <w:lang w:val="en-US" w:eastAsia="zh-CN"/>
+        </w:rPr>
+        <w:t xml:space="preserve">D-CNN will be employed to train and test fall data from </w:t>
+      </w:r>
+      <w:r>
+        <w:rPr>
+          <w:lang w:val="en-AU"/>
+        </w:rPr>
+        <w:t>WEDA-FALL</w:t>
+      </w:r>
+      <w:r>
+        <w:rPr>
+          <w:lang w:val="en-AU"/>
+        </w:rPr>
+        <w:t>.</w:t>
+      </w:r>
     </w:p>
     <w:p>
       <w:pPr>
@@ -1939,11 +2084,7 @@
         <w:pStyle w:val="a3"/>
       </w:pPr>
       <w:r>
-        <w:t xml:space="preserve">Define abbreviations and acronyms the first time they are used in the text, even after they have been defined in the </w:t>
-      </w:r>
-      <w:r>
-        <w:lastRenderedPageBreak/>
-        <w:t xml:space="preserve">abstract. Abbreviations such as IEEE, SI, MKS, CGS, </w:t>
+        <w:t xml:space="preserve">Define abbreviations and acronyms the first time they are used in the text, even after they have been defined in the abstract. Abbreviations such as IEEE, SI, MKS, CGS, </w:t>
       </w:r>
       <w:proofErr w:type="spellStart"/>
       <w:r>
@@ -2197,10 +2338,7 @@
         <w:t>English, commas, semi</w:t>
       </w:r>
       <w:r>
-        <w:t xml:space="preserve">colons, periods, question and exclamation marks are located within quotation marks only when a complete thought or name is cited, such as a title or full quotation. When quotation marks are used, instead of a bold or italic typeface, to highlight a word or phrase, punctuation should appear outside of the quotation marks. A parenthetical phrase or statement at the end of a </w:t>
-      </w:r>
-      <w:r>
-        <w:t>sentence is punctuated outside of the closing parenthesis (like this). (A parenthetical sentence is punctuated within the parentheses.)</w:t>
+        <w:t>colons, periods, question and exclamation marks are located within quotation marks only when a complete thought or name is cited, such as a title or full quotation. When quotation marks are used, instead of a bold or italic typeface, to highlight a word or phrase, punctuation should appear outside of the quotation marks. A parenthetical phrase or statement at the end of a sentence is punctuated outside of the closing parenthesis (like this). (A parenthetical sentence is punctuated within the parentheses.)</w:t>
       </w:r>
     </w:p>
     <w:p>
@@ -2514,7 +2652,6 @@
         <w:pStyle w:val="2"/>
       </w:pPr>
       <w:r>
-        <w:lastRenderedPageBreak/>
         <w:t>Identify</w:t>
       </w:r>
       <w:r>
@@ -3016,7 +3153,7 @@
         </w:rPr>
         <w:t xml:space="preserve">, vol. 193, p. 110945, Apr. 2022, doi: </w:t>
       </w:r>
-      <w:hyperlink r:id="rId12" w:history="1">
+      <w:hyperlink r:id="rId13" w:history="1">
         <w:r>
           <w:rPr>
             <w:color w:val="0000FF"/>
@@ -3105,7 +3242,7 @@
       <w:r>
         <w:t xml:space="preserve">, vol. 24, no. 2, pp. 524–532, Feb. 2020, doi: </w:t>
       </w:r>
-      <w:hyperlink r:id="rId13" w:history="1">
+      <w:hyperlink r:id="rId14" w:history="1">
         <w:r>
           <w:rPr>
             <w:rStyle w:val="a9"/>
@@ -3137,7 +3274,7 @@
       <w:r>
         <w:t xml:space="preserve">, vol. 110, pp. 199–210, May 2015, doi: </w:t>
       </w:r>
-      <w:hyperlink r:id="rId14" w:history="1">
+      <w:hyperlink r:id="rId15" w:history="1">
         <w:r>
           <w:rPr>
             <w:rStyle w:val="a9"/>
@@ -3169,7 +3306,7 @@
       <w:r>
         <w:t xml:space="preserve">, vol. 20, no. 20, Art. no. 20, Jan. 2020, doi: </w:t>
       </w:r>
-      <w:hyperlink r:id="rId15" w:history="1">
+      <w:hyperlink r:id="rId16" w:history="1">
         <w:r>
           <w:rPr>
             <w:rStyle w:val="a9"/>
@@ -3284,7 +3421,6 @@
         <w:rPr>
           <w:noProof/>
         </w:rPr>
-        <w:lastRenderedPageBreak/>
         <w:drawing>
           <wp:anchor distT="0" distB="0" distL="114300" distR="114300" simplePos="0" relativeHeight="251657728" behindDoc="1" locked="0" layoutInCell="1" allowOverlap="1" wp14:anchorId="6F75FADA" wp14:editId="1C256606">
             <wp:simplePos x="0" y="0"/>
@@ -6285,7 +6421,7 @@
 </file>
 
 <file path=customXml/itemProps1.xml><?xml version="1.0" encoding="utf-8"?>
-<ds:datastoreItem xmlns:ds="http://purl.oclc.org/ooxml/officeDocument/customXml" ds:itemID="{D436EA71-7E0C-4B0F-9922-961E30370C9E}">
+<ds:datastoreItem xmlns:ds="http://purl.oclc.org/ooxml/officeDocument/customXml" ds:itemID="{E52BC1ED-1D1A-4AD8-8063-CDDFAB6EFCDB}">
   <ds:schemaRefs>
     <ds:schemaRef ds:uri="http://schemas.openxmlformats.org/officeDocument/2006/bibliography"/>
   </ds:schemaRefs>

</xml_diff>

<commit_message>
start working on result
</commit_message>
<xml_diff>
--- a/1dcnn_ieee.docx
+++ b/1dcnn_ieee.docx
@@ -451,7 +451,13 @@
         <w:rPr>
           <w:lang w:val="en-AU"/>
         </w:rPr>
-        <w:t>There are 3 popular methods</w:t>
+        <w:t xml:space="preserve">There are 3 popular </w:t>
+      </w:r>
+      <w:r>
+        <w:rPr>
+          <w:lang w:val="en-AU"/>
+        </w:rPr>
+        <w:t>methods</w:t>
       </w:r>
       <w:r>
         <w:rPr>
@@ -929,7 +935,14 @@
         <w:rPr>
           <w:lang w:val="en-AU"/>
         </w:rPr>
-        <w:t>It's important to note that the choice of algorithm depends on factors such as desired accuracy, computational resources, user preferences, and the specific environment where the system will be deployed. Additionally, many systems combine multiple algorithm types to improve overall performance and robustness.</w:t>
+        <w:t xml:space="preserve">It's important to note that the choice of algorithm depends on factors such as desired accuracy, computational resources, user preferences, and the specific environment where the </w:t>
+      </w:r>
+      <w:r>
+        <w:rPr>
+          <w:lang w:val="en-AU"/>
+        </w:rPr>
+        <w:lastRenderedPageBreak/>
+        <w:t>system will be deployed. Additionally, many systems combine multiple algorithm types to improve overall performance and robustness.</w:t>
       </w:r>
     </w:p>
     <w:p>
@@ -1597,7 +1610,14 @@
           <w:rFonts w:hint="eastAsia"/>
           <w:lang w:val="en-US" w:eastAsia="zh-CN"/>
         </w:rPr>
-        <w:t xml:space="preserve">he red line in Figure 1 is the standard gravity acceleration, when people are walking normally or standing still the CA is around </w:t>
+        <w:t xml:space="preserve">he red line in Figure 1 is the standard </w:t>
+      </w:r>
+      <w:r>
+        <w:rPr>
+          <w:rFonts w:hint="eastAsia"/>
+          <w:lang w:val="en-US" w:eastAsia="zh-CN"/>
+        </w:rPr>
+        <w:t xml:space="preserve">gravity acceleration, when people are walking normally or standing still the CA is around </w:t>
       </w:r>
       <w:r>
         <w:rPr>
@@ -1813,10 +1833,10 @@
           <w:lang w:eastAsia="zh-CN"/>
         </w:rPr>
         <w:drawing>
-          <wp:inline distT="0" distB="0" distL="0" distR="0" wp14:anchorId="7A603446" wp14:editId="2226BD39">
-            <wp:extent cx="2610536" cy="911369"/>
+          <wp:inline distT="0" distB="0" distL="0" distR="0" wp14:anchorId="125B5CE7" wp14:editId="3062F3CE">
+            <wp:extent cx="2712995" cy="947139"/>
             <wp:effectExtent l="0" t="0" r="0" b="0"/>
-            <wp:docPr id="31" name="圖片 31"/>
+            <wp:docPr id="2" name="圖片 2"/>
             <wp:cNvGraphicFramePr>
               <a:graphicFrameLocks xmlns:a="http://purl.oclc.org/ooxml/drawingml/main" noChangeAspect="1"/>
             </wp:cNvGraphicFramePr>
@@ -1845,7 +1865,7 @@
                   <pic:spPr bwMode="auto">
                     <a:xfrm>
                       <a:off x="0" y="0"/>
-                      <a:ext cx="2653512" cy="926372"/>
+                      <a:ext cx="2763536" cy="964784"/>
                     </a:xfrm>
                     <a:prstGeom prst="rect">
                       <a:avLst/>
@@ -1862,15 +1882,9 @@
     <w:p>
       <w:pPr>
         <w:pStyle w:val="figurecaption"/>
-        <w:rPr>
-          <w:rFonts w:hint="eastAsia"/>
-        </w:rPr>
-      </w:pPr>
-      <w:r>
-        <w:t>Convolution operation</w:t>
-      </w:r>
-      <w:r>
-        <w:t>.</w:t>
+      </w:pPr>
+      <w:r>
+        <w:t>Convolution operation.</w:t>
       </w:r>
     </w:p>
     <w:p>
@@ -1978,34 +1992,27 @@
       <w:pPr>
         <w:pStyle w:val="a3"/>
         <w:rPr>
+          <w:lang w:val="en-US" w:eastAsia="zh-CN"/>
+        </w:rPr>
+      </w:pPr>
+      <w:r>
+        <w:rPr>
           <w:rFonts w:hint="eastAsia"/>
           <w:lang w:val="en-US" w:eastAsia="zh-CN"/>
         </w:rPr>
-      </w:pPr>
-      <w:r>
-        <w:rPr>
-          <w:rFonts w:hint="eastAsia"/>
+        <w:t>1</w:t>
+      </w:r>
+      <w:r>
+        <w:rPr>
           <w:lang w:val="en-US" w:eastAsia="zh-CN"/>
         </w:rPr>
-        <w:t>1</w:t>
-      </w:r>
-      <w:r>
-        <w:rPr>
-          <w:lang w:val="en-US" w:eastAsia="zh-CN"/>
-        </w:rPr>
         <w:t xml:space="preserve">D-CNN will be employed to train and test fall data from </w:t>
       </w:r>
       <w:r>
         <w:rPr>
           <w:lang w:val="en-AU"/>
         </w:rPr>
-        <w:t>WEDA-FALL</w:t>
-      </w:r>
-      <w:r>
-        <w:rPr>
-          <w:lang w:val="en-AU"/>
-        </w:rPr>
-        <w:t>.</w:t>
+        <w:t>WEDA-FALL.</w:t>
       </w:r>
     </w:p>
     <w:p>
@@ -2017,7 +2024,142 @@
         </w:tabs>
       </w:pPr>
       <w:r>
+        <w:lastRenderedPageBreak/>
         <w:t>Dataset selection</w:t>
+      </w:r>
+    </w:p>
+    <w:p>
+      <w:pPr>
+        <w:pStyle w:val="a3"/>
+      </w:pPr>
+      <w:r>
+        <w:rPr>
+          <w:lang w:val="en-AU"/>
+        </w:rPr>
+        <w:t>WEDA-FALL</w:t>
+      </w:r>
+      <w:r>
+        <w:t xml:space="preserve"> </w:t>
+      </w:r>
+      <w:r>
+        <w:rPr>
+          <w:lang w:eastAsia="zh-CN"/>
+        </w:rPr>
+        <w:t xml:space="preserve">is composed of two groups, Falls and ADLs, mentioned before, D05 in ADLs, which is </w:t>
+      </w:r>
+      <w:r>
+        <w:rPr>
+          <w:lang w:eastAsia="zh-CN"/>
+        </w:rPr>
+        <w:t>“</w:t>
+      </w:r>
+      <w:r>
+        <w:t>Sitting</w:t>
+      </w:r>
+      <w:r>
+        <w:rPr>
+          <w:lang w:eastAsia="zh-CN"/>
+        </w:rPr>
+        <w:t xml:space="preserve"> a moment, attempt to get up and collapse into a chair</w:t>
+      </w:r>
+      <w:r>
+        <w:rPr>
+          <w:lang w:eastAsia="zh-CN"/>
+        </w:rPr>
+        <w:t>”</w:t>
+      </w:r>
+      <w:r>
+        <w:t xml:space="preserve">, sounds similar to fall, the flowing Figure 5 is five samples from D05, from which, we can see that the 1st, 3rd and 4th are very similar to real fall. </w:t>
+      </w:r>
+    </w:p>
+    <w:p>
+      <w:pPr>
+        <w:pStyle w:val="a3"/>
+        <w:rPr>
+          <w:lang w:val="en-US"/>
+        </w:rPr>
+      </w:pPr>
+      <w:r>
+        <w:rPr>
+          <w:noProof/>
+          <w:lang w:val="en-US"/>
+        </w:rPr>
+        <w:drawing>
+          <wp:inline distT="0" distB="0" distL="0" distR="0" wp14:anchorId="1A9D38EE" wp14:editId="7CD00A81">
+            <wp:extent cx="2778760" cy="798328"/>
+            <wp:effectExtent l="0" t="0" r="2540" b="1905"/>
+            <wp:docPr id="5" name="圖片 5"/>
+            <wp:cNvGraphicFramePr>
+              <a:graphicFrameLocks xmlns:a="http://purl.oclc.org/ooxml/drawingml/main" noChangeAspect="1"/>
+            </wp:cNvGraphicFramePr>
+            <a:graphic xmlns:a="http://purl.oclc.org/ooxml/drawingml/main">
+              <a:graphicData uri="http://purl.oclc.org/ooxml/drawingml/picture">
+                <pic:pic xmlns:pic="http://purl.oclc.org/ooxml/drawingml/picture">
+                  <pic:nvPicPr>
+                    <pic:cNvPr id="0" name="Picture 4"/>
+                    <pic:cNvPicPr>
+                      <a:picLocks noChangeAspect="1" noChangeArrowheads="1"/>
+                    </pic:cNvPicPr>
+                  </pic:nvPicPr>
+                  <pic:blipFill>
+                    <a:blip r:embed="rId13" cstate="print">
+                      <a:extLst>
+                        <a:ext uri="{28A0092B-C50C-407E-A947-70E740481C1C}">
+                          <a14:useLocalDpi xmlns:a14="http://schemas.microsoft.com/office/drawing/2010/main" val="0"/>
+                        </a:ext>
+                      </a:extLst>
+                    </a:blip>
+                    <a:srcRect/>
+                    <a:stretch>
+                      <a:fillRect/>
+                    </a:stretch>
+                  </pic:blipFill>
+                  <pic:spPr bwMode="auto">
+                    <a:xfrm>
+                      <a:off x="0" y="0"/>
+                      <a:ext cx="2795616" cy="803171"/>
+                    </a:xfrm>
+                    <a:prstGeom prst="rect">
+                      <a:avLst/>
+                    </a:prstGeom>
+                    <a:noFill/>
+                  </pic:spPr>
+                </pic:pic>
+              </a:graphicData>
+            </a:graphic>
+          </wp:inline>
+        </w:drawing>
+      </w:r>
+    </w:p>
+    <w:p>
+      <w:pPr>
+        <w:pStyle w:val="figurecaption"/>
+      </w:pPr>
+      <w:r>
+        <w:t>Samples of D05</w:t>
+      </w:r>
+      <w:r>
+        <w:t>.</w:t>
+      </w:r>
+    </w:p>
+    <w:p>
+      <w:pPr>
+        <w:pStyle w:val="a3"/>
+        <w:rPr>
+          <w:lang w:val="en-US" w:eastAsia="zh-CN"/>
+        </w:rPr>
+      </w:pPr>
+      <w:r>
+        <w:rPr>
+          <w:lang w:val="en-US" w:eastAsia="zh-CN"/>
+        </w:rPr>
+        <w:t xml:space="preserve">When we choose data for 1D-CNN, data should be labeled for the algorithm, according to the authors of </w:t>
+      </w:r>
+      <w:r>
+        <w:rPr>
+          <w:lang w:val="en-AU"/>
+        </w:rPr>
+        <w:t>WEDA-FALL, D05 belongs to ADLs, should be labelled as 0 (false, not fall), as some looks like falls, the whole D05 is exclusive, they are not used in this project.</w:t>
       </w:r>
     </w:p>
     <w:p>
@@ -2034,6 +2176,123 @@
     </w:p>
     <w:p>
       <w:pPr>
+        <w:pStyle w:val="a3"/>
+      </w:pPr>
+      <w:r>
+        <w:rPr>
+          <w:lang w:val="en-AU"/>
+        </w:rPr>
+        <w:t>WEDA-FALL</w:t>
+      </w:r>
+      <w:r>
+        <w:t xml:space="preserve"> </w:t>
+      </w:r>
+      <w:r>
+        <w:t>is originally captured at 50</w:t>
+      </w:r>
+      <w:r>
+        <w:t>H</w:t>
+      </w:r>
+      <w:r>
+        <w:t xml:space="preserve">z from </w:t>
+      </w:r>
+      <w:r>
+        <w:t>a smartwatch on the wrist</w:t>
+      </w:r>
+      <w:r>
+        <w:t xml:space="preserve">, </w:t>
+      </w:r>
+      <w:r>
+        <w:t>the data last about 5-20 seconds each in general, then they are resampled evenly to 5Hz-50Hz. From Figure 1 we can see that typical fall lasts about 2 seconds, so data of 10Hz are used in this project, and only 4 seconds</w:t>
+      </w:r>
+      <w:r>
+        <w:t xml:space="preserve"> data</w:t>
+      </w:r>
+      <w:r>
+        <w:t xml:space="preserve"> centered on maximum acceleration</w:t>
+      </w:r>
+      <w:r>
+        <w:t xml:space="preserve"> are used</w:t>
+      </w:r>
+      <w:r>
+        <w:t>, by this way, the whole process of fall is included</w:t>
+      </w:r>
+      <w:r>
+        <w:t>, and computing power is saved because the algorithm only handles small parts of the data. Figure 6 are 5 samples from fall group, F01</w:t>
+      </w:r>
+      <w:r>
+        <w:t>, the touch group acceleration is in the middle of the data and the whole process of fall are reserved and clear in the figure.</w:t>
+      </w:r>
+    </w:p>
+    <w:p>
+      <w:pPr>
+        <w:pStyle w:val="a3"/>
+        <w:rPr>
+          <w:lang w:val="en-US"/>
+        </w:rPr>
+      </w:pPr>
+      <w:r>
+        <w:rPr>
+          <w:noProof/>
+          <w:lang w:val="en-US"/>
+        </w:rPr>
+        <w:drawing>
+          <wp:inline distT="0" distB="0" distL="0" distR="0" wp14:anchorId="5EF5C5E5" wp14:editId="513A6686">
+            <wp:extent cx="2751472" cy="611490"/>
+            <wp:effectExtent l="0" t="0" r="0" b="0"/>
+            <wp:docPr id="7" name="圖片 7"/>
+            <wp:cNvGraphicFramePr>
+              <a:graphicFrameLocks xmlns:a="http://purl.oclc.org/ooxml/drawingml/main" noChangeAspect="1"/>
+            </wp:cNvGraphicFramePr>
+            <a:graphic xmlns:a="http://purl.oclc.org/ooxml/drawingml/main">
+              <a:graphicData uri="http://purl.oclc.org/ooxml/drawingml/picture">
+                <pic:pic xmlns:pic="http://purl.oclc.org/ooxml/drawingml/picture">
+                  <pic:nvPicPr>
+                    <pic:cNvPr id="0" name="Picture 5"/>
+                    <pic:cNvPicPr>
+                      <a:picLocks noChangeAspect="1" noChangeArrowheads="1"/>
+                    </pic:cNvPicPr>
+                  </pic:nvPicPr>
+                  <pic:blipFill>
+                    <a:blip r:embed="rId14" cstate="print">
+                      <a:extLst>
+                        <a:ext uri="{28A0092B-C50C-407E-A947-70E740481C1C}">
+                          <a14:useLocalDpi xmlns:a14="http://schemas.microsoft.com/office/drawing/2010/main" val="0"/>
+                        </a:ext>
+                      </a:extLst>
+                    </a:blip>
+                    <a:srcRect/>
+                    <a:stretch>
+                      <a:fillRect/>
+                    </a:stretch>
+                  </pic:blipFill>
+                  <pic:spPr bwMode="auto">
+                    <a:xfrm>
+                      <a:off x="0" y="0"/>
+                      <a:ext cx="2751472" cy="611490"/>
+                    </a:xfrm>
+                    <a:prstGeom prst="rect">
+                      <a:avLst/>
+                    </a:prstGeom>
+                    <a:noFill/>
+                  </pic:spPr>
+                </pic:pic>
+              </a:graphicData>
+            </a:graphic>
+          </wp:inline>
+        </w:drawing>
+      </w:r>
+    </w:p>
+    <w:p>
+      <w:pPr>
+        <w:pStyle w:val="figurecaption"/>
+      </w:pPr>
+      <w:r>
+        <w:t>Samples of D05.</w:t>
+      </w:r>
+    </w:p>
+    <w:p>
+      <w:pPr>
         <w:pStyle w:val="1"/>
       </w:pPr>
       <w:r>
@@ -2073,10 +2332,10 @@
         <w:pStyle w:val="2"/>
       </w:pPr>
       <w:r>
-        <w:t>Abbreviations</w:t>
-      </w:r>
-      <w:r>
-        <w:t xml:space="preserve"> and Acronyms</w:t>
+        <w:t>S</w:t>
+      </w:r>
+      <w:r>
+        <w:t>tandardize</w:t>
       </w:r>
     </w:p>
     <w:p>
@@ -2097,10 +2356,65 @@
     </w:p>
     <w:p>
       <w:pPr>
+        <w:pStyle w:val="a3"/>
+      </w:pPr>
+      <w:r>
+        <w:rPr>
+          <w:noProof/>
+        </w:rPr>
+        <w:drawing>
+          <wp:inline distT="0" distB="0" distL="0" distR="0" wp14:anchorId="52D20244" wp14:editId="77278997">
+            <wp:extent cx="2905125" cy="2209607"/>
+            <wp:effectExtent l="0" t="0" r="0" b="635"/>
+            <wp:docPr id="9" name="圖片 9"/>
+            <wp:cNvGraphicFramePr>
+              <a:graphicFrameLocks xmlns:a="http://purl.oclc.org/ooxml/drawingml/main" noChangeAspect="1"/>
+            </wp:cNvGraphicFramePr>
+            <a:graphic xmlns:a="http://purl.oclc.org/ooxml/drawingml/main">
+              <a:graphicData uri="http://purl.oclc.org/ooxml/drawingml/picture">
+                <pic:pic xmlns:pic="http://purl.oclc.org/ooxml/drawingml/picture">
+                  <pic:nvPicPr>
+                    <pic:cNvPr id="0" name="Picture 6"/>
+                    <pic:cNvPicPr>
+                      <a:picLocks noChangeAspect="1" noChangeArrowheads="1"/>
+                    </pic:cNvPicPr>
+                  </pic:nvPicPr>
+                  <pic:blipFill>
+                    <a:blip r:embed="rId15">
+                      <a:extLst>
+                        <a:ext uri="{28A0092B-C50C-407E-A947-70E740481C1C}">
+                          <a14:useLocalDpi xmlns:a14="http://schemas.microsoft.com/office/drawing/2010/main" val="0"/>
+                        </a:ext>
+                      </a:extLst>
+                    </a:blip>
+                    <a:srcRect/>
+                    <a:stretch>
+                      <a:fillRect/>
+                    </a:stretch>
+                  </pic:blipFill>
+                  <pic:spPr bwMode="auto">
+                    <a:xfrm>
+                      <a:off x="0" y="0"/>
+                      <a:ext cx="2924614" cy="2224430"/>
+                    </a:xfrm>
+                    <a:prstGeom prst="rect">
+                      <a:avLst/>
+                    </a:prstGeom>
+                    <a:noFill/>
+                  </pic:spPr>
+                </pic:pic>
+              </a:graphicData>
+            </a:graphic>
+          </wp:inline>
+        </w:drawing>
+      </w:r>
+    </w:p>
+    <w:p>
+      <w:pPr>
         <w:pStyle w:val="2"/>
       </w:pPr>
       <w:r>
-        <w:t>Units</w:t>
+        <w:t>Number of filters</w:t>
       </w:r>
     </w:p>
     <w:p>
@@ -2188,10 +2502,70 @@
     </w:p>
     <w:p>
       <w:pPr>
+        <w:pStyle w:val="bulletlist"/>
+        <w:numPr>
+          <w:ilvl w:val="0"/>
+          <w:numId w:val="0"/>
+        </w:numPr>
+        <w:ind w:start="14.40pt"/>
+      </w:pPr>
+      <w:r>
+        <w:rPr>
+          <w:noProof/>
+        </w:rPr>
+        <w:drawing>
+          <wp:inline distT="0" distB="0" distL="0" distR="0" wp14:anchorId="3634AA0B" wp14:editId="798C8D51">
+            <wp:extent cx="2867025" cy="2180629"/>
+            <wp:effectExtent l="0" t="0" r="0" b="0"/>
+            <wp:docPr id="10" name="圖片 10"/>
+            <wp:cNvGraphicFramePr>
+              <a:graphicFrameLocks xmlns:a="http://purl.oclc.org/ooxml/drawingml/main" noChangeAspect="1"/>
+            </wp:cNvGraphicFramePr>
+            <a:graphic xmlns:a="http://purl.oclc.org/ooxml/drawingml/main">
+              <a:graphicData uri="http://purl.oclc.org/ooxml/drawingml/picture">
+                <pic:pic xmlns:pic="http://purl.oclc.org/ooxml/drawingml/picture">
+                  <pic:nvPicPr>
+                    <pic:cNvPr id="0" name="Picture 7"/>
+                    <pic:cNvPicPr>
+                      <a:picLocks noChangeAspect="1" noChangeArrowheads="1"/>
+                    </pic:cNvPicPr>
+                  </pic:nvPicPr>
+                  <pic:blipFill>
+                    <a:blip r:embed="rId16">
+                      <a:extLst>
+                        <a:ext uri="{28A0092B-C50C-407E-A947-70E740481C1C}">
+                          <a14:useLocalDpi xmlns:a14="http://schemas.microsoft.com/office/drawing/2010/main" val="0"/>
+                        </a:ext>
+                      </a:extLst>
+                    </a:blip>
+                    <a:srcRect/>
+                    <a:stretch>
+                      <a:fillRect/>
+                    </a:stretch>
+                  </pic:blipFill>
+                  <pic:spPr bwMode="auto">
+                    <a:xfrm>
+                      <a:off x="0" y="0"/>
+                      <a:ext cx="2877128" cy="2188313"/>
+                    </a:xfrm>
+                    <a:prstGeom prst="rect">
+                      <a:avLst/>
+                    </a:prstGeom>
+                    <a:noFill/>
+                  </pic:spPr>
+                </pic:pic>
+              </a:graphicData>
+            </a:graphic>
+          </wp:inline>
+        </w:drawing>
+      </w:r>
+    </w:p>
+    <w:p>
+      <w:pPr>
         <w:pStyle w:val="2"/>
       </w:pPr>
       <w:r>
-        <w:t>Equations</w:t>
+        <w:t>Kernel size</w:t>
       </w:r>
     </w:p>
     <w:p>
@@ -2210,7 +2584,11 @@
         </w:rPr>
       </w:pPr>
       <w:r>
-        <w:t>Number equations consecutively. Equation numbers, within parentheses, are to position flush right, as in (1), using a right tab stop. To make your equations more compact, you may use the solidus ( / ), the exp function, or appropriate exponents. Italicize Roman symbols for quantities and variables, but not Greek symbols. Use a long dash rather than a hyphen for a minus sign. Punctuate equations with commas or periods when they are part of a sentence, as in</w:t>
+        <w:t xml:space="preserve">Number equations consecutively. Equation numbers, within parentheses, are to position flush right, as in (1), using a right tab stop. To make your equations more compact, you </w:t>
+      </w:r>
+      <w:r>
+        <w:lastRenderedPageBreak/>
+        <w:t>may use the solidus ( / ), the exp function, or appropriate exponents. Italicize Roman symbols for quantities and variables, but not Greek symbols. Use a long dash rather than a hyphen for a minus sign. Punctuate equations with commas or periods when they are part of a sentence, as in</w:t>
       </w:r>
       <w:r>
         <w:rPr>
@@ -2287,10 +2665,65 @@
     </w:p>
     <w:p>
       <w:pPr>
+        <w:pStyle w:val="a3"/>
+      </w:pPr>
+      <w:r>
+        <w:rPr>
+          <w:noProof/>
+        </w:rPr>
+        <w:drawing>
+          <wp:inline distT="0" distB="0" distL="0" distR="0" wp14:anchorId="6E1D8127" wp14:editId="092EAF2C">
+            <wp:extent cx="2797175" cy="2127501"/>
+            <wp:effectExtent l="0" t="0" r="3175" b="6350"/>
+            <wp:docPr id="12" name="圖片 12"/>
+            <wp:cNvGraphicFramePr>
+              <a:graphicFrameLocks xmlns:a="http://purl.oclc.org/ooxml/drawingml/main" noChangeAspect="1"/>
+            </wp:cNvGraphicFramePr>
+            <a:graphic xmlns:a="http://purl.oclc.org/ooxml/drawingml/main">
+              <a:graphicData uri="http://purl.oclc.org/ooxml/drawingml/picture">
+                <pic:pic xmlns:pic="http://purl.oclc.org/ooxml/drawingml/picture">
+                  <pic:nvPicPr>
+                    <pic:cNvPr id="0" name="Picture 8"/>
+                    <pic:cNvPicPr>
+                      <a:picLocks noChangeAspect="1" noChangeArrowheads="1"/>
+                    </pic:cNvPicPr>
+                  </pic:nvPicPr>
+                  <pic:blipFill>
+                    <a:blip r:embed="rId17">
+                      <a:extLst>
+                        <a:ext uri="{28A0092B-C50C-407E-A947-70E740481C1C}">
+                          <a14:useLocalDpi xmlns:a14="http://schemas.microsoft.com/office/drawing/2010/main" val="0"/>
+                        </a:ext>
+                      </a:extLst>
+                    </a:blip>
+                    <a:srcRect/>
+                    <a:stretch>
+                      <a:fillRect/>
+                    </a:stretch>
+                  </pic:blipFill>
+                  <pic:spPr bwMode="auto">
+                    <a:xfrm>
+                      <a:off x="0" y="0"/>
+                      <a:ext cx="2819291" cy="2144322"/>
+                    </a:xfrm>
+                    <a:prstGeom prst="rect">
+                      <a:avLst/>
+                    </a:prstGeom>
+                    <a:noFill/>
+                  </pic:spPr>
+                </pic:pic>
+              </a:graphicData>
+            </a:graphic>
+          </wp:inline>
+        </w:drawing>
+      </w:r>
+    </w:p>
+    <w:p>
+      <w:pPr>
         <w:pStyle w:val="2"/>
       </w:pPr>
       <w:r>
-        <w:t>Some Common Mistakes</w:t>
+        <w:t>Comparison with other algorthms</w:t>
       </w:r>
     </w:p>
     <w:p>
@@ -2679,7 +3112,11 @@
         <w:pStyle w:val="a3"/>
       </w:pPr>
       <w:r>
-        <w:t>Text heads organize the topics on a relational, hierarchical basis. For example, the paper title is the primary text head because all subsequent material relates and elaborates on this one topic. If there are two or more sub-topics, the next level head (uppercase Roman numerals) should be used and, conversely, if there are not at least two sub-topics, then no subheads should be introduced. Styles named “Heading 1”, “Heading 2”, “Heading 3”, and “Heading 4” are prescribed.</w:t>
+        <w:t xml:space="preserve">Text heads organize the topics on a relational, hierarchical basis. For example, the paper title is the primary text head because all subsequent material relates and elaborates on this one topic. If there are two or more sub-topics, the next level head (uppercase Roman numerals) should be used and, conversely, if there are not at least two sub-topics, then no </w:t>
+      </w:r>
+      <w:r>
+        <w:lastRenderedPageBreak/>
+        <w:t>subheads should be introduced. Styles named “Heading 1”, “Heading 2”, “Heading 3”, and “Heading 4” are prescribed.</w:t>
       </w:r>
     </w:p>
     <w:p>
@@ -3058,7 +3495,10 @@
         <w:t xml:space="preserve">’ </w:t>
       </w:r>
       <w:r>
-        <w:t>names; do not use “et al.”. Papers that have not been published, even if they have been submitted for publication, should be cited as “unpublished” [4]. Papers that have been accepted for publication should be cited as “in press” [5]. Capitalize only the first word in a paper title, except for proper nouns and element symbols.</w:t>
+        <w:t xml:space="preserve">names; do not use “et al.”. Papers that have not been published, even if they have been submitted for publication, should be cited as “unpublished” [4]. Papers that have been accepted for publication should be cited as “in press” [5]. Capitalize only </w:t>
+      </w:r>
+      <w:r>
+        <w:t>the first word in a paper title, except for proper nouns and element symbols.</w:t>
       </w:r>
     </w:p>
     <w:p>
@@ -3153,7 +3593,7 @@
         </w:rPr>
         <w:t xml:space="preserve">, vol. 193, p. 110945, Apr. 2022, doi: </w:t>
       </w:r>
-      <w:hyperlink r:id="rId13" w:history="1">
+      <w:hyperlink r:id="rId18" w:history="1">
         <w:r>
           <w:rPr>
             <w:color w:val="0000FF"/>
@@ -3242,7 +3682,7 @@
       <w:r>
         <w:t xml:space="preserve">, vol. 24, no. 2, pp. 524–532, Feb. 2020, doi: </w:t>
       </w:r>
-      <w:hyperlink r:id="rId14" w:history="1">
+      <w:hyperlink r:id="rId19" w:history="1">
         <w:r>
           <w:rPr>
             <w:rStyle w:val="a9"/>
@@ -3274,7 +3714,7 @@
       <w:r>
         <w:t xml:space="preserve">, vol. 110, pp. 199–210, May 2015, doi: </w:t>
       </w:r>
-      <w:hyperlink r:id="rId15" w:history="1">
+      <w:hyperlink r:id="rId20" w:history="1">
         <w:r>
           <w:rPr>
             <w:rStyle w:val="a9"/>
@@ -3306,7 +3746,7 @@
       <w:r>
         <w:t xml:space="preserve">, vol. 20, no. 20, Art. no. 20, Jan. 2020, doi: </w:t>
       </w:r>
-      <w:hyperlink r:id="rId16" w:history="1">
+      <w:hyperlink r:id="rId21" w:history="1">
         <w:r>
           <w:rPr>
             <w:rStyle w:val="a9"/>
@@ -6421,7 +6861,7 @@
 </file>
 
 <file path=customXml/itemProps1.xml><?xml version="1.0" encoding="utf-8"?>
-<ds:datastoreItem xmlns:ds="http://purl.oclc.org/ooxml/officeDocument/customXml" ds:itemID="{E52BC1ED-1D1A-4AD8-8063-CDDFAB6EFCDB}">
+<ds:datastoreItem xmlns:ds="http://purl.oclc.org/ooxml/officeDocument/customXml" ds:itemID="{945DD494-4C6F-4F55-9BC0-B36A84848D0D}">
   <ds:schemaRefs>
     <ds:schemaRef ds:uri="http://schemas.openxmlformats.org/officeDocument/2006/bibliography"/>
   </ds:schemaRefs>

</xml_diff>